<commit_message>
feat: Menambah parameter Custom AI (Model Pembelajaran, Tipe Soal, Ekstrakurikuler P5, Konteks Bebas) agar output tidak kaku
</commit_message>
<xml_diff>
--- a/Pembagian_Tugas_Tim1_Akreditasi_PKBM.docx
+++ b/Pembagian_Tugas_Tim1_Akreditasi_PKBM.docx
@@ -307,7 +307,7 @@
           <w:szCs w:val="21"/>
           <w:rFonts w:ascii="Calibri" w:cs="Calibri" w:eastAsia="Calibri" w:hAnsi="Calibri"/>
         </w:rPr>
-        <w:t xml:space="preserve">Buka website: https://akreditas.vercel.app</w:t>
+        <w:t xml:space="preserve">Buka website: https://akreditas.vercel.app lalu pilih paket Anda di navigasi.</w:t>
       </w:r>
     </w:p>
     <w:p>
@@ -333,7 +333,7 @@
           <w:szCs w:val="21"/>
           <w:rFonts w:ascii="Calibri" w:cs="Calibri" w:eastAsia="Calibri" w:hAnsi="Calibri"/>
         </w:rPr>
-        <w:t xml:space="preserve">Pilih paket yang menjadi tanggung jawab Anda di header (Paket A / B / C)</w:t>
+        <w:t xml:space="preserve">PENTING: Masuk ke Tab Profil, masukkan API Key Gemini Anda di Pengaturan AI, lalu simpan.</w:t>
       </w:r>
     </w:p>
     <w:p>
@@ -359,7 +359,7 @@
           <w:szCs w:val="21"/>
           <w:rFonts w:ascii="Calibri" w:cs="Calibri" w:eastAsia="Calibri" w:hAnsi="Calibri"/>
         </w:rPr>
-        <w:t xml:space="preserve">Klik tab "Komponen 1" di navigasi atas</w:t>
+        <w:t xml:space="preserve">Tuju Tab 'Generate Dokumen' dan centang berkas Butir yang menjadi tugas Anda.</w:t>
       </w:r>
     </w:p>
     <w:p>
@@ -385,7 +385,7 @@
           <w:szCs w:val="21"/>
           <w:rFonts w:ascii="Calibri" w:cs="Calibri" w:eastAsia="Calibri" w:hAnsi="Calibri"/>
         </w:rPr>
-        <w:t xml:space="preserve">Klik sub-tab Butir yang menjadi tugas Anda (Butir 1, 2, 3, atau 4)</w:t>
+        <w:t xml:space="preserve">Aktifkan fitur '✨ Gunakan Gemini AI untuk Melengkapi RPP &amp; Soal'.</w:t>
       </w:r>
     </w:p>
     <w:p>
@@ -411,7 +411,7 @@
           <w:szCs w:val="21"/>
           <w:rFonts w:ascii="Calibri" w:cs="Calibri" w:eastAsia="Calibri" w:hAnsi="Calibri"/>
         </w:rPr>
-        <w:t xml:space="preserve">Centang dokumen yang ingin di-generate, atau klik "Generate Semua Butir X"</w:t>
+        <w:t xml:space="preserve">Klik tombol 'Generate &amp; Download ZIP' → Sistem Auto-Pilot mulai bekerja (berjeda jika antre).</w:t>
       </w:r>
     </w:p>
     <w:p>
@@ -437,7 +437,7 @@
           <w:szCs w:val="21"/>
           <w:rFonts w:ascii="Calibri" w:cs="Calibri" w:eastAsia="Calibri" w:hAnsi="Calibri"/>
         </w:rPr>
-        <w:t xml:space="preserve">Klik tombol "Generate" → File .docx otomatis ter-download</w:t>
+        <w:t xml:space="preserve">Ekstrak ZIP dan buka file .docx di Microsoft Word / WPS Office.</w:t>
       </w:r>
     </w:p>
     <w:p>
@@ -463,7 +463,7 @@
           <w:szCs w:val="21"/>
           <w:rFonts w:ascii="Calibri" w:cs="Calibri" w:eastAsia="Calibri" w:hAnsi="Calibri"/>
         </w:rPr>
-        <w:t xml:space="preserve">Buka file .docx di Microsoft Word / WPS Office</w:t>
+        <w:t xml:space="preserve">TUGAS REVISI: Anda tidak perlu menulis RPP/Soal secara manual dari nol. Cukup Review dan Evaluasi kepantasan hasil rumusan AI.</w:t>
       </w:r>
     </w:p>
     <w:p>
@@ -489,7 +489,7 @@
           <w:szCs w:val="21"/>
           <w:rFonts w:ascii="Calibri" w:cs="Calibri" w:eastAsia="Calibri" w:hAnsi="Calibri"/>
         </w:rPr>
-        <w:t xml:space="preserve">ISI SEMUA KOLOM KOSONG / GARIS BAWAH dengan data riil PKBM</w:t>
+        <w:t xml:space="preserve">Lengkapi data identitas kosong (nama, tanggal) yang tidak bisa dijangkau sistem.</w:t>
       </w:r>
     </w:p>
     <w:p>
@@ -515,7 +515,7 @@
           <w:szCs w:val="21"/>
           <w:rFonts w:ascii="Calibri" w:cs="Calibri" w:eastAsia="Calibri" w:hAnsi="Calibri"/>
         </w:rPr>
-        <w:t xml:space="preserve">PENTING: Sistem kini OTOMATIS menggandakan dokumen (RPP, Soal, LKPD) untuk *semua mapel wajib*. Buka folder hasil ZIP dan isi file masing-masing!</w:t>
+        <w:t xml:space="preserve">PENTING: RPP/Soal telah OTOMATIS digandakan *per mapel wajib*. Cek folder hasil ZIP!</w:t>
       </w:r>
     </w:p>
     <w:p>
@@ -541,7 +541,7 @@
           <w:szCs w:val="21"/>
           <w:rFonts w:ascii="Calibri" w:cs="Calibri" w:eastAsia="Calibri" w:hAnsi="Calibri"/>
         </w:rPr>
-        <w:t xml:space="preserve">Serahkan file yang sudah lengkap ke Ketua Tim untuk di-review</w:t>
+        <w:t xml:space="preserve">Print dan serahkan susunan map lengkap ke Ketua Tim untuk ditandatangani.</w:t>
       </w:r>
     </w:p>
     <w:p>
@@ -2500,7 +2500,7 @@
                 <w:szCs w:val="19"/>
                 <w:rFonts w:ascii="Calibri" w:cs="Calibri" w:eastAsia="Calibri" w:hAnsi="Calibri"/>
               </w:rPr>
-              <w:t xml:space="preserve">Nafis</w:t>
+              <w:t xml:space="preserve">Abdul Hadi</w:t>
             </w:r>
           </w:p>
         </w:tc>
@@ -2563,7 +2563,7 @@
                 <w:szCs w:val="19"/>
                 <w:rFonts w:ascii="Calibri" w:cs="Calibri" w:eastAsia="Calibri" w:hAnsi="Calibri"/>
               </w:rPr>
-              <w:t xml:space="preserve">Angket, jurnal, RPP growth mindset, remedial</w:t>
+              <w:t xml:space="preserve">Angket peserta didik, jurnal karakter, daftar remedial</w:t>
             </w:r>
           </w:p>
         </w:tc>
@@ -2645,7 +2645,7 @@
                 <w:szCs w:val="19"/>
                 <w:rFonts w:ascii="Calibri" w:cs="Calibri" w:eastAsia="Calibri" w:hAnsi="Calibri"/>
               </w:rPr>
-              <w:t xml:space="preserve">RPP, Prota, Prosem, soal, rapor — PER MAPEL</w:t>
+              <w:t xml:space="preserve">Review RPP buatan AI, Soal Evaluasi, Rubrik — PER MAPEL</w:t>
             </w:r>
           </w:p>
         </w:tc>
@@ -2668,7 +2668,7 @@
                 <w:szCs w:val="19"/>
                 <w:rFonts w:ascii="Calibri" w:cs="Calibri" w:eastAsia="Calibri" w:hAnsi="Calibri"/>
               </w:rPr>
-              <w:t xml:space="preserve">Abdul Hadi</w:t>
+              <w:t xml:space="preserve">Nafis</w:t>
             </w:r>
           </w:p>
         </w:tc>
@@ -2731,7 +2731,7 @@
                 <w:szCs w:val="19"/>
                 <w:rFonts w:ascii="Calibri" w:cs="Calibri" w:eastAsia="Calibri" w:hAnsi="Calibri"/>
               </w:rPr>
-              <w:t xml:space="preserve">Tata tertib, kesepakatan kelas, Projek Karakter, keagamaan</w:t>
+              <w:t xml:space="preserve">Tata tertib, SOP keamanan, kebijakan agama, logistik Projek</w:t>
             </w:r>
           </w:p>
         </w:tc>
@@ -2899,7 +2899,7 @@
                 <w:szCs w:val="19"/>
                 <w:rFonts w:ascii="Calibri" w:cs="Calibri" w:eastAsia="Calibri" w:hAnsi="Calibri"/>
               </w:rPr>
-              <w:t xml:space="preserve">Handry</w:t>
+              <w:t xml:space="preserve">Salim</w:t>
             </w:r>
           </w:p>
         </w:tc>
@@ -2962,7 +2962,7 @@
                 <w:szCs w:val="19"/>
                 <w:rFonts w:ascii="Calibri" w:cs="Calibri" w:eastAsia="Calibri" w:hAnsi="Calibri"/>
               </w:rPr>
-              <w:t xml:space="preserve">Dokumentasi diskusi, angket, RPP growth mindset</w:t>
+              <w:t xml:space="preserve">Kuesioner evaluasi tutor &amp; rekap laporan hasil belajar ortu</w:t>
             </w:r>
           </w:p>
         </w:tc>
@@ -2984,7 +2984,7 @@
                 <w:szCs w:val="19"/>
                 <w:rFonts w:ascii="Calibri" w:cs="Calibri" w:eastAsia="Calibri" w:hAnsi="Calibri"/>
               </w:rPr>
-              <w:t xml:space="preserve">Apriyanto</w:t>
+              <w:t xml:space="preserve">Romadi</w:t>
             </w:r>
           </w:p>
         </w:tc>
@@ -3044,7 +3044,7 @@
                 <w:szCs w:val="19"/>
                 <w:rFonts w:ascii="Calibri" w:cs="Calibri" w:eastAsia="Calibri" w:hAnsi="Calibri"/>
               </w:rPr>
-              <w:t xml:space="preserve">Remedial, buku penghubung, RPP kolaboratif</w:t>
+              <w:t xml:space="preserve">Penyusunan logistik surat &amp; buku penghubung siswa-ortu</w:t>
             </w:r>
           </w:p>
         </w:tc>
@@ -3067,7 +3067,7 @@
                 <w:szCs w:val="19"/>
                 <w:rFonts w:ascii="Calibri" w:cs="Calibri" w:eastAsia="Calibri" w:hAnsi="Calibri"/>
               </w:rPr>
-              <w:t xml:space="preserve">Salim</w:t>
+              <w:t xml:space="preserve">Gati</w:t>
             </w:r>
           </w:p>
         </w:tc>
@@ -3130,7 +3130,7 @@
                 <w:szCs w:val="19"/>
                 <w:rFonts w:ascii="Calibri" w:cs="Calibri" w:eastAsia="Calibri" w:hAnsi="Calibri"/>
               </w:rPr>
-              <w:t xml:space="preserve">Kesepakatan kelas, tata tertib, angket rasa aman</w:t>
+              <w:t xml:space="preserve">SOP Tata Tertib SMP, penanganan insiden, regulasi anti-bullying</w:t>
             </w:r>
           </w:p>
         </w:tc>
@@ -3152,7 +3152,7 @@
                 <w:szCs w:val="19"/>
                 <w:rFonts w:ascii="Calibri" w:cs="Calibri" w:eastAsia="Calibri" w:hAnsi="Calibri"/>
               </w:rPr>
-              <w:t xml:space="preserve">Romadi</w:t>
+              <w:t xml:space="preserve">Handry</w:t>
             </w:r>
           </w:p>
         </w:tc>
@@ -3212,7 +3212,7 @@
                 <w:szCs w:val="19"/>
                 <w:rFonts w:ascii="Calibri" w:cs="Calibri" w:eastAsia="Calibri" w:hAnsi="Calibri"/>
               </w:rPr>
-              <w:t xml:space="preserve">RPP, Prota, Prosem, LKPD HOTS, PBL</w:t>
+              <w:t xml:space="preserve">Asesmen desain Modul Ajar (RPP), Prota, Prosem buatan AI</w:t>
             </w:r>
           </w:p>
         </w:tc>
@@ -3235,7 +3235,7 @@
                 <w:szCs w:val="19"/>
                 <w:rFonts w:ascii="Calibri" w:cs="Calibri" w:eastAsia="Calibri" w:hAnsi="Calibri"/>
               </w:rPr>
-              <w:t xml:space="preserve">Gati</w:t>
+              <w:t xml:space="preserve">Husen</w:t>
             </w:r>
           </w:p>
         </w:tc>
@@ -3298,7 +3298,7 @@
                 <w:szCs w:val="19"/>
                 <w:rFonts w:ascii="Calibri" w:cs="Calibri" w:eastAsia="Calibri" w:hAnsi="Calibri"/>
               </w:rPr>
-              <w:t xml:space="preserve">Soal formatif/sumatif, kisi-kisi, rubrik, rapor</w:t>
+              <w:t xml:space="preserve">Quality Control naskah Soal HOTS AI, Rubrik Penilaian, Kisi-kisi</w:t>
             </w:r>
           </w:p>
         </w:tc>
@@ -3320,7 +3320,7 @@
                 <w:szCs w:val="19"/>
                 <w:rFonts w:ascii="Calibri" w:cs="Calibri" w:eastAsia="Calibri" w:hAnsi="Calibri"/>
               </w:rPr>
-              <w:t xml:space="preserve">Leo</w:t>
+              <w:t xml:space="preserve">Adi</w:t>
             </w:r>
           </w:p>
         </w:tc>
@@ -3380,7 +3380,7 @@
                 <w:szCs w:val="19"/>
                 <w:rFonts w:ascii="Calibri" w:cs="Calibri" w:eastAsia="Calibri" w:hAnsi="Calibri"/>
               </w:rPr>
-              <w:t xml:space="preserve">Jadwal keagamaan, RPP budaya, hari besar</w:t>
+              <w:t xml:space="preserve">Dokumen Visi-Misi instansi, kebijakan keagamaan/budaya</w:t>
             </w:r>
           </w:p>
         </w:tc>
@@ -3403,7 +3403,7 @@
                 <w:szCs w:val="19"/>
                 <w:rFonts w:ascii="Calibri" w:cs="Calibri" w:eastAsia="Calibri" w:hAnsi="Calibri"/>
               </w:rPr>
-              <w:t xml:space="preserve">Adi</w:t>
+              <w:t xml:space="preserve">Apriyanto</w:t>
             </w:r>
           </w:p>
         </w:tc>
@@ -3466,7 +3466,7 @@
                 <w:szCs w:val="19"/>
                 <w:rFonts w:ascii="Calibri" w:cs="Calibri" w:eastAsia="Calibri" w:hAnsi="Calibri"/>
               </w:rPr>
-              <w:t xml:space="preserve">LKPD HOTS, Projek Karakter, ekskul, visi-misi, portofolio</w:t>
+              <w:t xml:space="preserve">Standar operasional esktrakurikuler, logistik kegiatan Projek P5</w:t>
             </w:r>
           </w:p>
         </w:tc>
@@ -3680,7 +3680,7 @@
                 <w:szCs w:val="19"/>
                 <w:rFonts w:ascii="Calibri" w:cs="Calibri" w:eastAsia="Calibri" w:hAnsi="Calibri"/>
               </w:rPr>
-              <w:t xml:space="preserve">Husen</w:t>
+              <w:t xml:space="preserve">Riki</w:t>
             </w:r>
           </w:p>
         </w:tc>
@@ -3743,7 +3743,7 @@
                 <w:szCs w:val="19"/>
                 <w:rFonts w:ascii="Calibri" w:cs="Calibri" w:eastAsia="Calibri" w:hAnsi="Calibri"/>
               </w:rPr>
-              <w:t xml:space="preserve">RPP, jurnal, asesmen diagnostik</w:t>
+              <w:t xml:space="preserve">Logika Asesmen Diagnostik Emosional (Paling Pro), Pemetaan Karakter</w:t>
             </w:r>
           </w:p>
         </w:tc>
@@ -3785,7 +3785,7 @@
                 <w:szCs w:val="19"/>
                 <w:rFonts w:ascii="Calibri" w:cs="Calibri" w:eastAsia="Calibri" w:hAnsi="Calibri"/>
               </w:rPr>
-              <w:t xml:space="preserve">Imam</w:t>
+              <w:t xml:space="preserve">Ronald</w:t>
             </w:r>
           </w:p>
         </w:tc>
@@ -3845,7 +3845,7 @@
                 <w:szCs w:val="19"/>
                 <w:rFonts w:ascii="Calibri" w:cs="Calibri" w:eastAsia="Calibri" w:hAnsi="Calibri"/>
               </w:rPr>
-              <w:t xml:space="preserve">Kontrak belajar, tata tertib dewasa</w:t>
+              <w:t xml:space="preserve">Kontrak belajar tingkat dewasa, pakta integritas disiplin siswa</w:t>
             </w:r>
           </w:p>
         </w:tc>
@@ -3952,7 +3952,7 @@
                 <w:szCs w:val="19"/>
                 <w:rFonts w:ascii="Calibri" w:cs="Calibri" w:eastAsia="Calibri" w:hAnsi="Calibri"/>
               </w:rPr>
-              <w:t xml:space="preserve">RPP vokasional, Prota, Prosem, PBL</w:t>
+              <w:t xml:space="preserve">Kurasi hasil AI untuk Modul RPP berbasis Kewirausahaan Vokasi</w:t>
             </w:r>
           </w:p>
         </w:tc>
@@ -3994,7 +3994,7 @@
                 <w:szCs w:val="19"/>
                 <w:rFonts w:ascii="Calibri" w:cs="Calibri" w:eastAsia="Calibri" w:hAnsi="Calibri"/>
               </w:rPr>
-              <w:t xml:space="preserve">Riki</w:t>
+              <w:t xml:space="preserve">Jufri</w:t>
             </w:r>
           </w:p>
         </w:tc>
@@ -4054,7 +4054,7 @@
                 <w:szCs w:val="19"/>
                 <w:rFonts w:ascii="Calibri" w:cs="Calibri" w:eastAsia="Calibri" w:hAnsi="Calibri"/>
               </w:rPr>
-              <w:t xml:space="preserve">Bank soal, kisi-kisi, rubrik, rapor</w:t>
+              <w:t xml:space="preserve">Kurasi Butir Soal level Penalaran Tinggi (C6) hasil tembakan AI</w:t>
             </w:r>
           </w:p>
         </w:tc>
@@ -4098,7 +4098,7 @@
                 <w:szCs w:val="19"/>
                 <w:rFonts w:ascii="Calibri" w:cs="Calibri" w:eastAsia="Calibri" w:hAnsi="Calibri"/>
               </w:rPr>
-              <w:t xml:space="preserve">Ronald</w:t>
+              <w:t xml:space="preserve">Leo</w:t>
             </w:r>
           </w:p>
         </w:tc>
@@ -4161,7 +4161,7 @@
                 <w:szCs w:val="19"/>
                 <w:rFonts w:ascii="Calibri" w:cs="Calibri" w:eastAsia="Calibri" w:hAnsi="Calibri"/>
               </w:rPr>
-              <w:t xml:space="preserve">Keagamaan, budaya, hari besar</w:t>
+              <w:t xml:space="preserve">Administrasi perayaan budaya &amp; hari besar keagamaan</w:t>
             </w:r>
           </w:p>
         </w:tc>
@@ -4203,7 +4203,7 @@
                 <w:szCs w:val="19"/>
                 <w:rFonts w:ascii="Calibri" w:cs="Calibri" w:eastAsia="Calibri" w:hAnsi="Calibri"/>
               </w:rPr>
-              <w:t xml:space="preserve">Jufri</w:t>
+              <w:t xml:space="preserve">Imam</w:t>
             </w:r>
           </w:p>
         </w:tc>
@@ -4263,7 +4263,7 @@
                 <w:szCs w:val="19"/>
                 <w:rFonts w:ascii="Calibri" w:cs="Calibri" w:eastAsia="Calibri" w:hAnsi="Calibri"/>
               </w:rPr>
-              <w:t xml:space="preserve">LKPD HOTS C6, Projek Karakter, visi-misi, portofolio</w:t>
+              <w:t xml:space="preserve">Pengarsipan/foto logistik portfolio Keterampilan Pra-Kerja</w:t>
             </w:r>
           </w:p>
         </w:tc>

</xml_diff>

<commit_message>
feat(ui): Tampilkan PIC dan default template data di panel generate & konfigurasi Profil PKBM
</commit_message>
<xml_diff>
--- a/Pembagian_Tugas_Tim1_Akreditasi_PKBM.docx
+++ b/Pembagian_Tugas_Tim1_Akreditasi_PKBM.docx
@@ -2563,7 +2563,7 @@
                 <w:szCs w:val="19"/>
                 <w:rFonts w:ascii="Calibri" w:cs="Calibri" w:eastAsia="Calibri" w:hAnsi="Calibri"/>
               </w:rPr>
-              <w:t xml:space="preserve">RPP/Modul Ajar &amp; Turunannya</w:t>
+              <w:t xml:space="preserve">RPP/Modul Matematika &amp; IPAS</w:t>
             </w:r>
           </w:p>
         </w:tc>
@@ -2645,7 +2645,8 @@
                 <w:szCs w:val="19"/>
                 <w:rFonts w:ascii="Calibri" w:cs="Calibri" w:eastAsia="Calibri" w:hAnsi="Calibri"/>
               </w:rPr>
-              <w:t xml:space="preserve">Soal Evaluasi AI &amp; Penilaian</w:t>
+              <w:t xml:space="preserve">RPP B.Indo &amp; Pancasila 
+ Evaluasi</w:t>
             </w:r>
           </w:p>
         </w:tc>
@@ -2731,7 +2732,8 @@
                 <w:szCs w:val="19"/>
                 <w:rFonts w:ascii="Calibri" w:cs="Calibri" w:eastAsia="Calibri" w:hAnsi="Calibri"/>
               </w:rPr>
-              <w:t xml:space="preserve">Diskusi Kelas &amp; Laporan Ortu</w:t>
+              <w:t xml:space="preserve">RPP PAI &amp; Budi Pekerti
+ Diskusi</w:t>
             </w:r>
           </w:p>
         </w:tc>
@@ -2813,7 +2815,7 @@
                 <w:szCs w:val="19"/>
                 <w:rFonts w:ascii="Calibri" w:cs="Calibri" w:eastAsia="Calibri" w:hAnsi="Calibri"/>
               </w:rPr>
-              <w:t xml:space="preserve">Asesmen Diagnostik &amp; Pendampingan</w:t>
+              <w:t xml:space="preserve">Kesiswaan &amp; Emosional (B1)</w:t>
             </w:r>
           </w:p>
         </w:tc>
@@ -2899,7 +2901,7 @@
                 <w:szCs w:val="19"/>
                 <w:rFonts w:ascii="Calibri" w:cs="Calibri" w:eastAsia="Calibri" w:hAnsi="Calibri"/>
               </w:rPr>
-              <w:t xml:space="preserve">Tata Tertib &amp; Rasa Aman Siswa</w:t>
+              <w:t xml:space="preserve">Kedisiplinan &amp; Budaya Aman (B2)</w:t>
             </w:r>
           </w:p>
         </w:tc>
@@ -2981,7 +2983,7 @@
                 <w:szCs w:val="19"/>
                 <w:rFonts w:ascii="Calibri" w:cs="Calibri" w:eastAsia="Calibri" w:hAnsi="Calibri"/>
               </w:rPr>
-              <w:t xml:space="preserve">Visi-Misi &amp; Kegiatan Keagamaan</w:t>
+              <w:t xml:space="preserve">Pengembangan Visi &amp; Ekskul P5</w:t>
             </w:r>
           </w:p>
         </w:tc>
@@ -3212,7 +3214,7 @@
                 <w:szCs w:val="19"/>
                 <w:rFonts w:ascii="Calibri" w:cs="Calibri" w:eastAsia="Calibri" w:hAnsi="Calibri"/>
               </w:rPr>
-              <w:t xml:space="preserve">RPP Tingkat SMP &amp; Turunannya</w:t>
+              <w:t xml:space="preserve">RPP Tingkat SMP &amp; Turunannya (Matematika)</w:t>
             </w:r>
           </w:p>
         </w:tc>
@@ -3294,7 +3296,7 @@
                 <w:szCs w:val="19"/>
                 <w:rFonts w:ascii="Calibri" w:cs="Calibri" w:eastAsia="Calibri" w:hAnsi="Calibri"/>
               </w:rPr>
-              <w:t xml:space="preserve">Kisi-kisi &amp; Soal HOTS (C5)</w:t>
+              <w:t xml:space="preserve">Kisi-kisi &amp; Soal HOTS (Bahasa Indonesia)</w:t>
             </w:r>
           </w:p>
         </w:tc>
@@ -3380,7 +3382,7 @@
                 <w:szCs w:val="19"/>
                 <w:rFonts w:ascii="Calibri" w:cs="Calibri" w:eastAsia="Calibri" w:hAnsi="Calibri"/>
               </w:rPr>
-              <w:t xml:space="preserve">Rubrik Penilaian &amp; Remedial</w:t>
+              <w:t xml:space="preserve">Rubrik Penilaian (PAI)</w:t>
             </w:r>
           </w:p>
         </w:tc>
@@ -3402,7 +3404,7 @@
                 <w:szCs w:val="19"/>
                 <w:rFonts w:ascii="Calibri" w:cs="Calibri" w:eastAsia="Calibri" w:hAnsi="Calibri"/>
               </w:rPr>
-              <w:t xml:space="preserve">Salim</w:t>
+              <w:t xml:space="preserve">Romadi</w:t>
             </w:r>
           </w:p>
         </w:tc>
@@ -3422,7 +3424,7 @@
                 <w:szCs w:val="19"/>
                 <w:rFonts w:ascii="Calibri" w:cs="Calibri" w:eastAsia="Calibri" w:hAnsi="Calibri"/>
               </w:rPr>
-              <w:t xml:space="preserve">Butir 1 (1.1)</w:t>
+              <w:t xml:space="preserve">Butir 1 (1.2)</w:t>
             </w:r>
           </w:p>
         </w:tc>
@@ -3462,7 +3464,7 @@
                 <w:szCs w:val="19"/>
                 <w:rFonts w:ascii="Calibri" w:cs="Calibri" w:eastAsia="Calibri" w:hAnsi="Calibri"/>
               </w:rPr>
-              <w:t xml:space="preserve">Angket Kepuasan Siswa</w:t>
+              <w:t xml:space="preserve">RPP IPA Terpadu</w:t>
             </w:r>
           </w:p>
         </w:tc>
@@ -3485,7 +3487,7 @@
                 <w:szCs w:val="19"/>
                 <w:rFonts w:ascii="Calibri" w:cs="Calibri" w:eastAsia="Calibri" w:hAnsi="Calibri"/>
               </w:rPr>
-              <w:t xml:space="preserve">Romadi</w:t>
+              <w:t xml:space="preserve">Salim</w:t>
             </w:r>
           </w:p>
         </w:tc>
@@ -3506,7 +3508,7 @@
                 <w:szCs w:val="19"/>
                 <w:rFonts w:ascii="Calibri" w:cs="Calibri" w:eastAsia="Calibri" w:hAnsi="Calibri"/>
               </w:rPr>
-              <w:t xml:space="preserve">Butir 1 (1.2)</w:t>
+              <w:t xml:space="preserve">Butir 1 (1.1)</w:t>
             </w:r>
           </w:p>
         </w:tc>
@@ -3548,7 +3550,7 @@
                 <w:szCs w:val="19"/>
                 <w:rFonts w:ascii="Calibri" w:cs="Calibri" w:eastAsia="Calibri" w:hAnsi="Calibri"/>
               </w:rPr>
-              <w:t xml:space="preserve">Lembar Refleksi</w:t>
+              <w:t xml:space="preserve">RPP Pendidikan Pancasila</w:t>
             </w:r>
           </w:p>
         </w:tc>
@@ -3570,7 +3572,7 @@
                 <w:szCs w:val="19"/>
                 <w:rFonts w:ascii="Calibri" w:cs="Calibri" w:eastAsia="Calibri" w:hAnsi="Calibri"/>
               </w:rPr>
-              <w:t xml:space="preserve">Eva</w:t>
+              <w:t xml:space="preserve">Lilik</w:t>
             </w:r>
           </w:p>
         </w:tc>
@@ -3630,7 +3632,7 @@
                 <w:szCs w:val="19"/>
                 <w:rFonts w:ascii="Calibri" w:cs="Calibri" w:eastAsia="Calibri" w:hAnsi="Calibri"/>
               </w:rPr>
-              <w:t xml:space="preserve">Buku Penghubung Ortu</w:t>
+              <w:t xml:space="preserve">Hubungan Orangtua &amp; Psikologi</w:t>
             </w:r>
           </w:p>
         </w:tc>
@@ -3716,7 +3718,7 @@
                 <w:szCs w:val="19"/>
                 <w:rFonts w:ascii="Calibri" w:cs="Calibri" w:eastAsia="Calibri" w:hAnsi="Calibri"/>
               </w:rPr>
-              <w:t xml:space="preserve">Kesepakatan Kelas</w:t>
+              <w:t xml:space="preserve">Program Remedial &amp; BK</w:t>
             </w:r>
           </w:p>
         </w:tc>
@@ -3798,7 +3800,7 @@
                 <w:szCs w:val="19"/>
                 <w:rFonts w:ascii="Calibri" w:cs="Calibri" w:eastAsia="Calibri" w:hAnsi="Calibri"/>
               </w:rPr>
-              <w:t xml:space="preserve">Supervisi Kelas &amp; LKPD</w:t>
+              <w:t xml:space="preserve">Kontrak Belajar &amp; SOP (Tata Tertib)</w:t>
             </w:r>
           </w:p>
         </w:tc>
@@ -3884,7 +3886,7 @@
                 <w:szCs w:val="19"/>
                 <w:rFonts w:ascii="Calibri" w:cs="Calibri" w:eastAsia="Calibri" w:hAnsi="Calibri"/>
               </w:rPr>
-              <w:t xml:space="preserve">Jadwal Agama &amp; Jurnal Keimanan</w:t>
+              <w:t xml:space="preserve">Supervisi Iklim Keamanan</w:t>
             </w:r>
           </w:p>
         </w:tc>
@@ -3966,7 +3968,7 @@
                 <w:szCs w:val="19"/>
                 <w:rFonts w:ascii="Calibri" w:cs="Calibri" w:eastAsia="Calibri" w:hAnsi="Calibri"/>
               </w:rPr>
-              <w:t xml:space="preserve">Program Hari Besar Nasional</w:t>
+              <w:t xml:space="preserve">Regulasi Visi Misi &amp; Agenda Keagamaan</w:t>
             </w:r>
           </w:p>
         </w:tc>
@@ -3989,7 +3991,7 @@
                 <w:szCs w:val="19"/>
                 <w:rFonts w:ascii="Calibri" w:cs="Calibri" w:eastAsia="Calibri" w:hAnsi="Calibri"/>
               </w:rPr>
-              <w:t xml:space="preserve">Nadia</w:t>
+              <w:t xml:space="preserve">Eva</w:t>
             </w:r>
           </w:p>
         </w:tc>
@@ -4052,7 +4054,7 @@
                 <w:szCs w:val="19"/>
                 <w:rFonts w:ascii="Calibri" w:cs="Calibri" w:eastAsia="Calibri" w:hAnsi="Calibri"/>
               </w:rPr>
-              <w:t xml:space="preserve">Portofolio Siswa &amp; Kegiatan P5</w:t>
+              <w:t xml:space="preserve">Logistik Produk P5 &amp; Ekstrakurikuler</w:t>
             </w:r>
           </w:p>
         </w:tc>
@@ -4283,7 +4285,7 @@
                 <w:szCs w:val="19"/>
                 <w:rFonts w:ascii="Calibri" w:cs="Calibri" w:eastAsia="Calibri" w:hAnsi="Calibri"/>
               </w:rPr>
-              <w:t xml:space="preserve">RPP Tingkat SMA/Vokasi</w:t>
+              <w:t xml:space="preserve">RPP Geografi Tingkat SMA/Vokasi</w:t>
             </w:r>
           </w:p>
         </w:tc>
@@ -4305,7 +4307,7 @@
                 <w:szCs w:val="19"/>
                 <w:rFonts w:ascii="Calibri" w:cs="Calibri" w:eastAsia="Calibri" w:hAnsi="Calibri"/>
               </w:rPr>
-              <w:t xml:space="preserve">Jufri</w:t>
+              <w:t xml:space="preserve">Ulfa</w:t>
             </w:r>
           </w:p>
         </w:tc>
@@ -4365,7 +4367,7 @@
                 <w:szCs w:val="19"/>
                 <w:rFonts w:ascii="Calibri" w:cs="Calibri" w:eastAsia="Calibri" w:hAnsi="Calibri"/>
               </w:rPr>
-              <w:t xml:space="preserve">Kisi-kisi &amp; Soal Analitis (C6)</w:t>
+              <w:t xml:space="preserve">Kisi-kisi Matematika</w:t>
             </w:r>
           </w:p>
         </w:tc>
@@ -4388,7 +4390,7 @@
                 <w:szCs w:val="19"/>
                 <w:rFonts w:ascii="Calibri" w:cs="Calibri" w:eastAsia="Calibri" w:hAnsi="Calibri"/>
               </w:rPr>
-              <w:t xml:space="preserve">Lilik</w:t>
+              <w:t xml:space="preserve">Riki</w:t>
             </w:r>
           </w:p>
         </w:tc>
@@ -4451,7 +4453,7 @@
                 <w:szCs w:val="19"/>
                 <w:rFonts w:ascii="Calibri" w:cs="Calibri" w:eastAsia="Calibri" w:hAnsi="Calibri"/>
               </w:rPr>
-              <w:t xml:space="preserve">Evaluasi &amp; Daftar Nilai</w:t>
+              <w:t xml:space="preserve">Evaluasi B.Indo</w:t>
             </w:r>
           </w:p>
         </w:tc>
@@ -4473,7 +4475,7 @@
                 <w:szCs w:val="19"/>
                 <w:rFonts w:ascii="Calibri" w:cs="Calibri" w:eastAsia="Calibri" w:hAnsi="Calibri"/>
               </w:rPr>
-              <w:t xml:space="preserve">Riki</w:t>
+              <w:t xml:space="preserve">Nadia</w:t>
             </w:r>
           </w:p>
         </w:tc>
@@ -4533,7 +4535,7 @@
                 <w:szCs w:val="19"/>
                 <w:rFonts w:ascii="Calibri" w:cs="Calibri" w:eastAsia="Calibri" w:hAnsi="Calibri"/>
               </w:rPr>
-              <w:t xml:space="preserve">Asesmen Kognitif Awal</w:t>
+              <w:t xml:space="preserve">Asesmen Bahasa Inggris</w:t>
             </w:r>
           </w:p>
         </w:tc>
@@ -4619,7 +4621,7 @@
                 <w:szCs w:val="19"/>
                 <w:rFonts w:ascii="Calibri" w:cs="Calibri" w:eastAsia="Calibri" w:hAnsi="Calibri"/>
               </w:rPr>
-              <w:t xml:space="preserve">Pengawasan Laporan &amp; Jurnal</w:t>
+              <w:t xml:space="preserve">RPP Pendidikan Pancasila</w:t>
             </w:r>
           </w:p>
         </w:tc>
@@ -4701,7 +4703,7 @@
                 <w:szCs w:val="19"/>
                 <w:rFonts w:ascii="Calibri" w:cs="Calibri" w:eastAsia="Calibri" w:hAnsi="Calibri"/>
               </w:rPr>
-              <w:t xml:space="preserve">Kontrak Belajar Dewasa &amp; Tata Tertib</w:t>
+              <w:t xml:space="preserve">Pengawasan Laporan/Jurnal PAI</w:t>
             </w:r>
           </w:p>
         </w:tc>
@@ -4724,7 +4726,7 @@
                 <w:szCs w:val="19"/>
                 <w:rFonts w:ascii="Calibri" w:cs="Calibri" w:eastAsia="Calibri" w:hAnsi="Calibri"/>
               </w:rPr>
-              <w:t xml:space="preserve">Ulfa</w:t>
+              <w:t xml:space="preserve">Jufri</w:t>
             </w:r>
           </w:p>
         </w:tc>
@@ -4787,7 +4789,7 @@
                 <w:szCs w:val="19"/>
                 <w:rFonts w:ascii="Calibri" w:cs="Calibri" w:eastAsia="Calibri" w:hAnsi="Calibri"/>
               </w:rPr>
-              <w:t xml:space="preserve">Dokumentasi Belajar &amp; LKPD</w:t>
+              <w:t xml:space="preserve">Manajemen Dinamika Orang Dewasa</w:t>
             </w:r>
           </w:p>
         </w:tc>
@@ -4869,7 +4871,7 @@
                 <w:szCs w:val="19"/>
                 <w:rFonts w:ascii="Calibri" w:cs="Calibri" w:eastAsia="Calibri" w:hAnsi="Calibri"/>
               </w:rPr>
-              <w:t xml:space="preserve">RPP Integrasi Keimanan</w:t>
+              <w:t xml:space="preserve">Tata Tertib &amp; Anti-Perundungan Tingkat Atas</w:t>
             </w:r>
           </w:p>
         </w:tc>
@@ -4955,7 +4957,7 @@
                 <w:szCs w:val="19"/>
                 <w:rFonts w:ascii="Calibri" w:cs="Calibri" w:eastAsia="Calibri" w:hAnsi="Calibri"/>
               </w:rPr>
-              <w:t xml:space="preserve">Karya Budaya &amp; LKPD HOTS</w:t>
+              <w:t xml:space="preserve">Visi Misi &amp; Hari Besar Nasional</w:t>
             </w:r>
           </w:p>
         </w:tc>
@@ -5037,7 +5039,7 @@
                 <w:szCs w:val="19"/>
                 <w:rFonts w:ascii="Calibri" w:cs="Calibri" w:eastAsia="Calibri" w:hAnsi="Calibri"/>
               </w:rPr>
-              <w:t xml:space="preserve">Karya Vokasional &amp; Portofolio</w:t>
+              <w:t xml:space="preserve">Kewirausahaan, Prakarya, P5</w:t>
             </w:r>
           </w:p>
         </w:tc>
@@ -5910,7 +5912,7 @@
           <w:szCs w:val="22"/>
           <w:rFonts w:ascii="Calibri" w:cs="Calibri" w:eastAsia="Calibri" w:hAnsi="Calibri"/>
         </w:rPr>
-        <w:t xml:space="preserve">Daftar Dokumen (2 Indikator/Fokus)</w:t>
+        <w:t xml:space="preserve">Daftar Tugas</w:t>
       </w:r>
     </w:p>
     <w:tbl>
@@ -5981,7 +5983,7 @@
                 <w:szCs w:val="19"/>
                 <w:rFonts w:ascii="Calibri" w:cs="Calibri" w:eastAsia="Calibri" w:hAnsi="Calibri"/>
               </w:rPr>
-              <w:t xml:space="preserve">Target Generasi</w:t>
+              <w:t xml:space="preserve">Tanggung Jawab</w:t>
             </w:r>
           </w:p>
         </w:tc>
@@ -6005,7 +6007,7 @@
                 <w:szCs w:val="19"/>
                 <w:rFonts w:ascii="Calibri" w:cs="Calibri" w:eastAsia="Calibri" w:hAnsi="Calibri"/>
               </w:rPr>
-              <w:t xml:space="preserve">Berisi Dokumen</w:t>
+              <w:t xml:space="preserve">Konteks Laporan</w:t>
             </w:r>
           </w:p>
         </w:tc>
@@ -6097,7 +6099,7 @@
                 <w:szCs w:val="19"/>
                 <w:rFonts w:ascii="Calibri" w:cs="Calibri" w:eastAsia="Calibri" w:hAnsi="Calibri"/>
               </w:rPr>
-              <w:t xml:space="preserve">B3-3.1-01 s.d 06</w:t>
+              <w:t xml:space="preserve">Semua RPP</w:t>
             </w:r>
           </w:p>
         </w:tc>
@@ -6118,7 +6120,7 @@
                 <w:szCs w:val="19"/>
                 <w:rFonts w:ascii="Calibri" w:cs="Calibri" w:eastAsia="Calibri" w:hAnsi="Calibri"/>
               </w:rPr>
-              <w:t xml:space="preserve">RPP, Prota, Prosem, ATP, Kalender, LKPD</w:t>
+              <w:t xml:space="preserve">Matematika &amp; IPAS</w:t>
             </w:r>
           </w:p>
         </w:tc>
@@ -6160,7 +6162,7 @@
                 <w:szCs w:val="19"/>
                 <w:rFonts w:ascii="Calibri" w:cs="Calibri" w:eastAsia="Calibri" w:hAnsi="Calibri"/>
               </w:rPr>
-              <w:t xml:space="preserve">Generate per mapel. Isi TP/CP</w:t>
+              <w:t xml:space="preserve">Cetak dokumen RPP untuk 2 Mapel ini lewat Opsi Generate Mapel</w:t>
             </w:r>
           </w:p>
         </w:tc>
@@ -6202,7 +6204,7 @@
                 <w:szCs w:val="19"/>
                 <w:rFonts w:ascii="Calibri" w:cs="Calibri" w:eastAsia="Calibri" w:hAnsi="Calibri"/>
               </w:rPr>
-              <w:t xml:space="preserve">B3-3.5-01 s.d 03</w:t>
+              <w:t xml:space="preserve">Soal AI</w:t>
             </w:r>
           </w:p>
         </w:tc>
@@ -6222,7 +6224,7 @@
                 <w:szCs w:val="19"/>
                 <w:rFonts w:ascii="Calibri" w:cs="Calibri" w:eastAsia="Calibri" w:hAnsi="Calibri"/>
               </w:rPr>
-              <w:t xml:space="preserve">RPP HOTS, LKPD Kritis, Template Proyek</w:t>
+              <w:t xml:space="preserve">LKPD &amp; Formatif Modul</w:t>
             </w:r>
           </w:p>
         </w:tc>
@@ -6327,7 +6329,7 @@
           <w:szCs w:val="22"/>
           <w:rFonts w:ascii="Calibri" w:cs="Calibri" w:eastAsia="Calibri" w:hAnsi="Calibri"/>
         </w:rPr>
-        <w:t xml:space="preserve">Daftar Dokumen (3 Indikator/Fokus)</w:t>
+        <w:t xml:space="preserve">Daftar Tugas</w:t>
       </w:r>
     </w:p>
     <w:tbl>
@@ -6398,7 +6400,7 @@
                 <w:szCs w:val="19"/>
                 <w:rFonts w:ascii="Calibri" w:cs="Calibri" w:eastAsia="Calibri" w:hAnsi="Calibri"/>
               </w:rPr>
-              <w:t xml:space="preserve">Target Generasi</w:t>
+              <w:t xml:space="preserve">Tanggung Jawab</w:t>
             </w:r>
           </w:p>
         </w:tc>
@@ -6422,7 +6424,7 @@
                 <w:szCs w:val="19"/>
                 <w:rFonts w:ascii="Calibri" w:cs="Calibri" w:eastAsia="Calibri" w:hAnsi="Calibri"/>
               </w:rPr>
-              <w:t xml:space="preserve">Berisi Dokumen</w:t>
+              <w:t xml:space="preserve">Konteks Laporan</w:t>
             </w:r>
           </w:p>
         </w:tc>
@@ -6514,7 +6516,7 @@
                 <w:szCs w:val="19"/>
                 <w:rFonts w:ascii="Calibri" w:cs="Calibri" w:eastAsia="Calibri" w:hAnsi="Calibri"/>
               </w:rPr>
-              <w:t xml:space="preserve">B3-3.2-01 s.d 04</w:t>
+              <w:t xml:space="preserve">Semua RPP</w:t>
             </w:r>
           </w:p>
         </w:tc>
@@ -6535,7 +6537,7 @@
                 <w:szCs w:val="19"/>
                 <w:rFonts w:ascii="Calibri" w:cs="Calibri" w:eastAsia="Calibri" w:hAnsi="Calibri"/>
               </w:rPr>
-              <w:t xml:space="preserve">Soal Formatif, Jurnal, Umpan Balik</w:t>
+              <w:t xml:space="preserve">B.Indo &amp; Pancasila</w:t>
             </w:r>
           </w:p>
         </w:tc>
@@ -6577,7 +6579,7 @@
                 <w:szCs w:val="19"/>
                 <w:rFonts w:ascii="Calibri" w:cs="Calibri" w:eastAsia="Calibri" w:hAnsi="Calibri"/>
               </w:rPr>
-              <w:t xml:space="preserve">Generate &amp; review 5-10 soal PG/Essay dari AI</w:t>
+              <w:t xml:space="preserve">Cetak dokumen RPP khusus B.Indo + Pancasila</w:t>
             </w:r>
           </w:p>
         </w:tc>
@@ -6619,7 +6621,7 @@
                 <w:szCs w:val="19"/>
                 <w:rFonts w:ascii="Calibri" w:cs="Calibri" w:eastAsia="Calibri" w:hAnsi="Calibri"/>
               </w:rPr>
-              <w:t xml:space="preserve">B3-3.3-01 s.d 04</w:t>
+              <w:t xml:space="preserve">Evaluasi AI</w:t>
             </w:r>
           </w:p>
         </w:tc>
@@ -6639,7 +6641,7 @@
                 <w:szCs w:val="19"/>
                 <w:rFonts w:ascii="Calibri" w:cs="Calibri" w:eastAsia="Calibri" w:hAnsi="Calibri"/>
               </w:rPr>
-              <w:t xml:space="preserve">Soal Sumatif, Kisi-kisi, Rubrik</w:t>
+              <w:t xml:space="preserve">Soal Sumatif, Kisi-kisi</w:t>
             </w:r>
           </w:p>
         </w:tc>
@@ -6680,113 +6682,6 @@
                 <w:rFonts w:ascii="Calibri" w:cs="Calibri" w:eastAsia="Calibri" w:hAnsi="Calibri"/>
               </w:rPr>
               <w:t xml:space="preserve">Review 20 PG + 5 Uraian Sumatif dari AI</w:t>
-            </w:r>
-          </w:p>
-        </w:tc>
-      </w:tr>
-      <w:tr>
-        <w:tc>
-          <w:tcPr>
-            <w:tcW w:type="pct" w:w="5%"/>
-            <w:shd w:fill="EBF5FB" w:val="clear"/>
-            <w:vAlign w:val="center"/>
-          </w:tcPr>
-          <w:p>
-            <w:pPr>
-              <w:spacing w:before="30" w:after="30"/>
-            </w:pPr>
-            <w:r>
-              <w:rPr>
-                <w:color w:val="2C3E50"/>
-                <w:sz w:val="19"/>
-                <w:szCs w:val="19"/>
-                <w:rFonts w:ascii="Calibri" w:cs="Calibri" w:eastAsia="Calibri" w:hAnsi="Calibri"/>
-              </w:rPr>
-              <w:t xml:space="preserve">3</w:t>
-            </w:r>
-          </w:p>
-        </w:tc>
-        <w:tc>
-          <w:tcPr>
-            <w:tcW w:type="pct" w:w="20%"/>
-            <w:shd w:fill="EBF5FB" w:val="clear"/>
-            <w:vAlign w:val="center"/>
-          </w:tcPr>
-          <w:p>
-            <w:pPr>
-              <w:spacing w:before="30" w:after="30"/>
-            </w:pPr>
-            <w:r>
-              <w:rPr>
-                <w:color w:val="2C3E50"/>
-                <w:sz w:val="19"/>
-                <w:szCs w:val="19"/>
-                <w:rFonts w:ascii="Calibri" w:cs="Calibri" w:eastAsia="Calibri" w:hAnsi="Calibri"/>
-              </w:rPr>
-              <w:t xml:space="preserve">B3-3.4-02</w:t>
-            </w:r>
-          </w:p>
-        </w:tc>
-        <w:tc>
-          <w:tcPr>
-            <w:tcW w:type="pct" w:w="25%"/>
-            <w:shd w:fill="EBF5FB" w:val="clear"/>
-            <w:vAlign w:val="center"/>
-          </w:tcPr>
-          <w:p>
-            <w:pPr>
-              <w:spacing w:before="30" w:after="30"/>
-            </w:pPr>
-            <w:r>
-              <w:rPr>
-                <w:color w:val="2C3E50"/>
-                <w:sz w:val="19"/>
-                <w:szCs w:val="19"/>
-                <w:rFonts w:ascii="Calibri" w:cs="Calibri" w:eastAsia="Calibri" w:hAnsi="Calibri"/>
-              </w:rPr>
-              <w:t xml:space="preserve">Rekapitulasi</w:t>
-            </w:r>
-          </w:p>
-        </w:tc>
-        <w:tc>
-          <w:tcPr>
-            <w:tcW w:type="pct" w:w="10%"/>
-            <w:shd w:fill="EBF5FB" w:val="clear"/>
-            <w:vAlign w:val="center"/>
-          </w:tcPr>
-          <w:p>
-            <w:pPr>
-              <w:spacing w:before="30" w:after="30"/>
-            </w:pPr>
-            <w:r>
-              <w:rPr>
-                <w:color w:val="2C3E50"/>
-                <w:sz w:val="19"/>
-                <w:szCs w:val="19"/>
-                <w:rFonts w:ascii="Calibri" w:cs="Calibri" w:eastAsia="Calibri" w:hAnsi="Calibri"/>
-              </w:rPr>
-              <w:t xml:space="preserve">SEDANG</w:t>
-            </w:r>
-          </w:p>
-        </w:tc>
-        <w:tc>
-          <w:tcPr>
-            <w:tcW w:type="pct" w:w="40%"/>
-            <w:shd w:fill="EBF5FB" w:val="clear"/>
-            <w:vAlign w:val="center"/>
-          </w:tcPr>
-          <w:p>
-            <w:pPr>
-              <w:spacing w:before="30" w:after="30"/>
-            </w:pPr>
-            <w:r>
-              <w:rPr>
-                <w:color w:val="2C3E50"/>
-                <w:sz w:val="19"/>
-                <w:szCs w:val="19"/>
-                <w:rFonts w:ascii="Calibri" w:cs="Calibri" w:eastAsia="Calibri" w:hAnsi="Calibri"/>
-              </w:rPr>
-              <w:t xml:space="preserve">Evaluasi</w:t>
             </w:r>
           </w:p>
         </w:tc>
@@ -6851,7 +6746,7 @@
           <w:szCs w:val="22"/>
           <w:rFonts w:ascii="Calibri" w:cs="Calibri" w:eastAsia="Calibri" w:hAnsi="Calibri"/>
         </w:rPr>
-        <w:t xml:space="preserve">Daftar Dokumen (2 Indikator/Fokus)</w:t>
+        <w:t xml:space="preserve">Daftar Tugas</w:t>
       </w:r>
     </w:p>
     <w:tbl>
@@ -6922,7 +6817,7 @@
                 <w:szCs w:val="19"/>
                 <w:rFonts w:ascii="Calibri" w:cs="Calibri" w:eastAsia="Calibri" w:hAnsi="Calibri"/>
               </w:rPr>
-              <w:t xml:space="preserve">Target Generasi</w:t>
+              <w:t xml:space="preserve">Tanggung Jawab</w:t>
             </w:r>
           </w:p>
         </w:tc>
@@ -6946,7 +6841,7 @@
                 <w:szCs w:val="19"/>
                 <w:rFonts w:ascii="Calibri" w:cs="Calibri" w:eastAsia="Calibri" w:hAnsi="Calibri"/>
               </w:rPr>
-              <w:t xml:space="preserve">Berisi Dokumen</w:t>
+              <w:t xml:space="preserve">Konteks Laporan</w:t>
             </w:r>
           </w:p>
         </w:tc>
@@ -7038,7 +6933,7 @@
                 <w:szCs w:val="19"/>
                 <w:rFonts w:ascii="Calibri" w:cs="Calibri" w:eastAsia="Calibri" w:hAnsi="Calibri"/>
               </w:rPr>
-              <w:t xml:space="preserve">B1-1.1-01 s.d 03</w:t>
+              <w:t xml:space="preserve">Semua RPP</w:t>
             </w:r>
           </w:p>
         </w:tc>
@@ -7059,7 +6954,7 @@
                 <w:szCs w:val="19"/>
                 <w:rFonts w:ascii="Calibri" w:cs="Calibri" w:eastAsia="Calibri" w:hAnsi="Calibri"/>
               </w:rPr>
-              <w:t xml:space="preserve">Dok diskusi, Angket Kepuasan, Catatan Supervisi</w:t>
+              <w:t xml:space="preserve">PAI &amp; Budi Pekerti</w:t>
             </w:r>
           </w:p>
         </w:tc>
@@ -7101,7 +6996,7 @@
                 <w:szCs w:val="19"/>
                 <w:rFonts w:ascii="Calibri" w:cs="Calibri" w:eastAsia="Calibri" w:hAnsi="Calibri"/>
               </w:rPr>
-              <w:t xml:space="preserve">Minta kepsek isi catatan observasi</w:t>
+              <w:t xml:space="preserve">Cukup kerjakan mapel PAI</w:t>
             </w:r>
           </w:p>
         </w:tc>
@@ -7143,7 +7038,7 @@
                 <w:szCs w:val="19"/>
                 <w:rFonts w:ascii="Calibri" w:cs="Calibri" w:eastAsia="Calibri" w:hAnsi="Calibri"/>
               </w:rPr>
-              <w:t xml:space="preserve">B1-1.2-01 s.d 03</w:t>
+              <w:t xml:space="preserve">Review Religi</w:t>
             </w:r>
           </w:p>
         </w:tc>
@@ -7163,7 +7058,7 @@
                 <w:szCs w:val="19"/>
                 <w:rFonts w:ascii="Calibri" w:cs="Calibri" w:eastAsia="Calibri" w:hAnsi="Calibri"/>
               </w:rPr>
-              <w:t xml:space="preserve">RPP Growth Mindset, Portofolio, Umpan Balik Tutor</w:t>
+              <w:t xml:space="preserve">RPP Integrasi Keagamaan</w:t>
             </w:r>
           </w:p>
         </w:tc>
@@ -7203,7 +7098,7 @@
                 <w:szCs w:val="19"/>
                 <w:rFonts w:ascii="Calibri" w:cs="Calibri" w:eastAsia="Calibri" w:hAnsi="Calibri"/>
               </w:rPr>
-              <w:t xml:space="preserve">Generate per mapel &amp; kumpulkan jurnal siswa</w:t>
+              <w:t xml:space="preserve">Fokus kualitas pendidikan akhlak</w:t>
             </w:r>
           </w:p>
         </w:tc>
@@ -7268,7 +7163,7 @@
           <w:szCs w:val="22"/>
           <w:rFonts w:ascii="Calibri" w:cs="Calibri" w:eastAsia="Calibri" w:hAnsi="Calibri"/>
         </w:rPr>
-        <w:t xml:space="preserve">Daftar Dokumen (2 Indikator/Fokus)</w:t>
+        <w:t xml:space="preserve">Daftar Tugas</w:t>
       </w:r>
     </w:p>
     <w:tbl>
@@ -7339,7 +7234,7 @@
                 <w:szCs w:val="19"/>
                 <w:rFonts w:ascii="Calibri" w:cs="Calibri" w:eastAsia="Calibri" w:hAnsi="Calibri"/>
               </w:rPr>
-              <w:t xml:space="preserve">Target Generasi</w:t>
+              <w:t xml:space="preserve">Tanggung Jawab</w:t>
             </w:r>
           </w:p>
         </w:tc>
@@ -7363,7 +7258,7 @@
                 <w:szCs w:val="19"/>
                 <w:rFonts w:ascii="Calibri" w:cs="Calibri" w:eastAsia="Calibri" w:hAnsi="Calibri"/>
               </w:rPr>
-              <w:t xml:space="preserve">Berisi Dokumen</w:t>
+              <w:t xml:space="preserve">Konteks Laporan</w:t>
             </w:r>
           </w:p>
         </w:tc>
@@ -7455,7 +7350,7 @@
                 <w:szCs w:val="19"/>
                 <w:rFonts w:ascii="Calibri" w:cs="Calibri" w:eastAsia="Calibri" w:hAnsi="Calibri"/>
               </w:rPr>
-              <w:t xml:space="preserve">B1-1.3-01 s.d 04</w:t>
+              <w:t xml:space="preserve">B1 Keseluruhan (Non-Mapel)</w:t>
             </w:r>
           </w:p>
         </w:tc>
@@ -7476,7 +7371,7 @@
                 <w:szCs w:val="19"/>
                 <w:rFonts w:ascii="Calibri" w:cs="Calibri" w:eastAsia="Calibri" w:hAnsi="Calibri"/>
               </w:rPr>
-              <w:t xml:space="preserve">Proker Remedial, Jurnal Pendampingan, Asesmen Diagnostik, Buku Ortu</w:t>
+              <w:t xml:space="preserve">Kesiswaan &amp; Emosional</w:t>
             </w:r>
           </w:p>
         </w:tc>
@@ -7519,108 +7414,6 @@
                 <w:rFonts w:ascii="Calibri" w:cs="Calibri" w:eastAsia="Calibri" w:hAnsi="Calibri"/>
               </w:rPr>
               <w:t xml:space="preserve">Gali data siswa remedial dan gaya belajar</w:t>
-            </w:r>
-          </w:p>
-        </w:tc>
-      </w:tr>
-      <w:tr>
-        <w:tc>
-          <w:tcPr>
-            <w:tcW w:type="pct" w:w="5%"/>
-            <w:vAlign w:val="center"/>
-          </w:tcPr>
-          <w:p>
-            <w:pPr>
-              <w:spacing w:before="30" w:after="30"/>
-            </w:pPr>
-            <w:r>
-              <w:rPr>
-                <w:color w:val="2C3E50"/>
-                <w:sz w:val="19"/>
-                <w:szCs w:val="19"/>
-                <w:rFonts w:ascii="Calibri" w:cs="Calibri" w:eastAsia="Calibri" w:hAnsi="Calibri"/>
-              </w:rPr>
-              <w:t xml:space="preserve">2</w:t>
-            </w:r>
-          </w:p>
-        </w:tc>
-        <w:tc>
-          <w:tcPr>
-            <w:tcW w:type="pct" w:w="20%"/>
-            <w:vAlign w:val="center"/>
-          </w:tcPr>
-          <w:p>
-            <w:pPr>
-              <w:spacing w:before="30" w:after="30"/>
-            </w:pPr>
-            <w:r>
-              <w:rPr>
-                <w:color w:val="2C3E50"/>
-                <w:sz w:val="19"/>
-                <w:szCs w:val="19"/>
-                <w:rFonts w:ascii="Calibri" w:cs="Calibri" w:eastAsia="Calibri" w:hAnsi="Calibri"/>
-              </w:rPr>
-              <w:t xml:space="preserve">B1-1.4-01 s.d 03</w:t>
-            </w:r>
-          </w:p>
-        </w:tc>
-        <w:tc>
-          <w:tcPr>
-            <w:tcW w:type="pct" w:w="25%"/>
-            <w:vAlign w:val="center"/>
-          </w:tcPr>
-          <w:p>
-            <w:pPr>
-              <w:spacing w:before="30" w:after="30"/>
-            </w:pPr>
-            <w:r>
-              <w:rPr>
-                <w:color w:val="2C3E50"/>
-                <w:sz w:val="19"/>
-                <w:szCs w:val="19"/>
-                <w:rFonts w:ascii="Calibri" w:cs="Calibri" w:eastAsia="Calibri" w:hAnsi="Calibri"/>
-              </w:rPr>
-              <w:t xml:space="preserve">RPP PBL, LKPD Empati, Angket</w:t>
-            </w:r>
-          </w:p>
-        </w:tc>
-        <w:tc>
-          <w:tcPr>
-            <w:tcW w:type="pct" w:w="10%"/>
-            <w:vAlign w:val="center"/>
-          </w:tcPr>
-          <w:p>
-            <w:pPr>
-              <w:spacing w:before="30" w:after="30"/>
-            </w:pPr>
-            <w:r>
-              <w:rPr>
-                <w:color w:val="2C3E50"/>
-                <w:sz w:val="19"/>
-                <w:szCs w:val="19"/>
-                <w:rFonts w:ascii="Calibri" w:cs="Calibri" w:eastAsia="Calibri" w:hAnsi="Calibri"/>
-              </w:rPr>
-              <w:t xml:space="preserve">TINGGI</w:t>
-            </w:r>
-          </w:p>
-        </w:tc>
-        <w:tc>
-          <w:tcPr>
-            <w:tcW w:type="pct" w:w="40%"/>
-            <w:vAlign w:val="center"/>
-          </w:tcPr>
-          <w:p>
-            <w:pPr>
-              <w:spacing w:before="30" w:after="30"/>
-            </w:pPr>
-            <w:r>
-              <w:rPr>
-                <w:color w:val="2C3E50"/>
-                <w:sz w:val="19"/>
-                <w:szCs w:val="19"/>
-                <w:rFonts w:ascii="Calibri" w:cs="Calibri" w:eastAsia="Calibri" w:hAnsi="Calibri"/>
-              </w:rPr>
-              <w:t xml:space="preserve">Buat RPP yg berfokus pada kolaborasi antar kelompok</w:t>
             </w:r>
           </w:p>
         </w:tc>
@@ -7685,7 +7478,7 @@
           <w:szCs w:val="22"/>
           <w:rFonts w:ascii="Calibri" w:cs="Calibri" w:eastAsia="Calibri" w:hAnsi="Calibri"/>
         </w:rPr>
-        <w:t xml:space="preserve">Daftar Dokumen (3 Indikator/Fokus)</w:t>
+        <w:t xml:space="preserve">Daftar Tugas</w:t>
       </w:r>
     </w:p>
     <w:tbl>
@@ -7756,7 +7549,7 @@
                 <w:szCs w:val="19"/>
                 <w:rFonts w:ascii="Calibri" w:cs="Calibri" w:eastAsia="Calibri" w:hAnsi="Calibri"/>
               </w:rPr>
-              <w:t xml:space="preserve">Target Generasi</w:t>
+              <w:t xml:space="preserve">Tanggung Jawab</w:t>
             </w:r>
           </w:p>
         </w:tc>
@@ -7780,7 +7573,7 @@
                 <w:szCs w:val="19"/>
                 <w:rFonts w:ascii="Calibri" w:cs="Calibri" w:eastAsia="Calibri" w:hAnsi="Calibri"/>
               </w:rPr>
-              <w:t xml:space="preserve">Berisi Dokumen</w:t>
+              <w:t xml:space="preserve">Konteks Laporan</w:t>
             </w:r>
           </w:p>
         </w:tc>
@@ -7872,7 +7665,7 @@
                 <w:szCs w:val="19"/>
                 <w:rFonts w:ascii="Calibri" w:cs="Calibri" w:eastAsia="Calibri" w:hAnsi="Calibri"/>
               </w:rPr>
-              <w:t xml:space="preserve">B2-2.1-01 s.d 03</w:t>
+              <w:t xml:space="preserve">B2 Keseluruhan (Non-Mapel)</w:t>
             </w:r>
           </w:p>
         </w:tc>
@@ -7893,7 +7686,7 @@
                 <w:szCs w:val="19"/>
                 <w:rFonts w:ascii="Calibri" w:cs="Calibri" w:eastAsia="Calibri" w:hAnsi="Calibri"/>
               </w:rPr>
-              <w:t xml:space="preserve">Kesepakatan, Poster Aturan, Jurnal Kelas</w:t>
+              <w:t xml:space="preserve">Kedisiplinan &amp; Budaya Aman</w:t>
             </w:r>
           </w:p>
         </w:tc>
@@ -7977,7 +7770,7 @@
                 <w:szCs w:val="19"/>
                 <w:rFonts w:ascii="Calibri" w:cs="Calibri" w:eastAsia="Calibri" w:hAnsi="Calibri"/>
               </w:rPr>
-              <w:t xml:space="preserve">B2-2.2-01 s.d 03</w:t>
+              <w:t xml:space="preserve">Tata Tertib</w:t>
             </w:r>
           </w:p>
         </w:tc>
@@ -7997,7 +7790,7 @@
                 <w:szCs w:val="19"/>
                 <w:rFonts w:ascii="Calibri" w:cs="Calibri" w:eastAsia="Calibri" w:hAnsi="Calibri"/>
               </w:rPr>
-              <w:t xml:space="preserve">Tata Tertib, Supervisi Kelas, Angket Aman</w:t>
+              <w:t xml:space="preserve">Buku Panduan</w:t>
             </w:r>
           </w:p>
         </w:tc>
@@ -8037,114 +7830,7 @@
                 <w:szCs w:val="19"/>
                 <w:rFonts w:ascii="Calibri" w:cs="Calibri" w:eastAsia="Calibri" w:hAnsi="Calibri"/>
               </w:rPr>
-              <w:t xml:space="preserve">Cetak tata tertib bahasa positif tanpa hukuman fisik</w:t>
-            </w:r>
-          </w:p>
-        </w:tc>
-      </w:tr>
-      <w:tr>
-        <w:tc>
-          <w:tcPr>
-            <w:tcW w:type="pct" w:w="5%"/>
-            <w:shd w:fill="EBF5FB" w:val="clear"/>
-            <w:vAlign w:val="center"/>
-          </w:tcPr>
-          <w:p>
-            <w:pPr>
-              <w:spacing w:before="30" w:after="30"/>
-            </w:pPr>
-            <w:r>
-              <w:rPr>
-                <w:color w:val="2C3E50"/>
-                <w:sz w:val="19"/>
-                <w:szCs w:val="19"/>
-                <w:rFonts w:ascii="Calibri" w:cs="Calibri" w:eastAsia="Calibri" w:hAnsi="Calibri"/>
-              </w:rPr>
-              <w:t xml:space="preserve">3</w:t>
-            </w:r>
-          </w:p>
-        </w:tc>
-        <w:tc>
-          <w:tcPr>
-            <w:tcW w:type="pct" w:w="20%"/>
-            <w:shd w:fill="EBF5FB" w:val="clear"/>
-            <w:vAlign w:val="center"/>
-          </w:tcPr>
-          <w:p>
-            <w:pPr>
-              <w:spacing w:before="30" w:after="30"/>
-            </w:pPr>
-            <w:r>
-              <w:rPr>
-                <w:color w:val="2C3E50"/>
-                <w:sz w:val="19"/>
-                <w:szCs w:val="19"/>
-                <w:rFonts w:ascii="Calibri" w:cs="Calibri" w:eastAsia="Calibri" w:hAnsi="Calibri"/>
-              </w:rPr>
-              <w:t xml:space="preserve">B2-2.3-01 s.d 03</w:t>
-            </w:r>
-          </w:p>
-        </w:tc>
-        <w:tc>
-          <w:tcPr>
-            <w:tcW w:type="pct" w:w="25%"/>
-            <w:shd w:fill="EBF5FB" w:val="clear"/>
-            <w:vAlign w:val="center"/>
-          </w:tcPr>
-          <w:p>
-            <w:pPr>
-              <w:spacing w:before="30" w:after="30"/>
-            </w:pPr>
-            <w:r>
-              <w:rPr>
-                <w:color w:val="2C3E50"/>
-                <w:sz w:val="19"/>
-                <w:szCs w:val="19"/>
-                <w:rFonts w:ascii="Calibri" w:cs="Calibri" w:eastAsia="Calibri" w:hAnsi="Calibri"/>
-              </w:rPr>
-              <w:t xml:space="preserve">RPP Belajar Aktif, LKPD, Dok Belajar</w:t>
-            </w:r>
-          </w:p>
-        </w:tc>
-        <w:tc>
-          <w:tcPr>
-            <w:tcW w:type="pct" w:w="10%"/>
-            <w:shd w:fill="EBF5FB" w:val="clear"/>
-            <w:vAlign w:val="center"/>
-          </w:tcPr>
-          <w:p>
-            <w:pPr>
-              <w:spacing w:before="30" w:after="30"/>
-            </w:pPr>
-            <w:r>
-              <w:rPr>
-                <w:color w:val="2C3E50"/>
-                <w:sz w:val="19"/>
-                <w:szCs w:val="19"/>
-                <w:rFonts w:ascii="Calibri" w:cs="Calibri" w:eastAsia="Calibri" w:hAnsi="Calibri"/>
-              </w:rPr>
-              <w:t xml:space="preserve">TINGGI</w:t>
-            </w:r>
-          </w:p>
-        </w:tc>
-        <w:tc>
-          <w:tcPr>
-            <w:tcW w:type="pct" w:w="40%"/>
-            <w:shd w:fill="EBF5FB" w:val="clear"/>
-            <w:vAlign w:val="center"/>
-          </w:tcPr>
-          <w:p>
-            <w:pPr>
-              <w:spacing w:before="30" w:after="30"/>
-            </w:pPr>
-            <w:r>
-              <w:rPr>
-                <w:color w:val="2C3E50"/>
-                <w:sz w:val="19"/>
-                <w:szCs w:val="19"/>
-                <w:rFonts w:ascii="Calibri" w:cs="Calibri" w:eastAsia="Calibri" w:hAnsi="Calibri"/>
-              </w:rPr>
-              <w:t xml:space="preserve">Lampirkan banyak foto siswa SD belajar</w:t>
+              <w:t xml:space="preserve">Cetak tata tertib bahasa positif tanpa hukuman</w:t>
             </w:r>
           </w:p>
         </w:tc>
@@ -8209,7 +7895,7 @@
           <w:szCs w:val="22"/>
           <w:rFonts w:ascii="Calibri" w:cs="Calibri" w:eastAsia="Calibri" w:hAnsi="Calibri"/>
         </w:rPr>
-        <w:t xml:space="preserve">Daftar Dokumen (4 Indikator/Fokus)</w:t>
+        <w:t xml:space="preserve">Daftar Tugas</w:t>
       </w:r>
     </w:p>
     <w:tbl>
@@ -8280,7 +7966,7 @@
                 <w:szCs w:val="19"/>
                 <w:rFonts w:ascii="Calibri" w:cs="Calibri" w:eastAsia="Calibri" w:hAnsi="Calibri"/>
               </w:rPr>
-              <w:t xml:space="preserve">Target Generasi</w:t>
+              <w:t xml:space="preserve">Tanggung Jawab</w:t>
             </w:r>
           </w:p>
         </w:tc>
@@ -8304,7 +7990,7 @@
                 <w:szCs w:val="19"/>
                 <w:rFonts w:ascii="Calibri" w:cs="Calibri" w:eastAsia="Calibri" w:hAnsi="Calibri"/>
               </w:rPr>
-              <w:t xml:space="preserve">Berisi Dokumen</w:t>
+              <w:t xml:space="preserve">Konteks Laporan</w:t>
             </w:r>
           </w:p>
         </w:tc>
@@ -8396,7 +8082,7 @@
                 <w:szCs w:val="19"/>
                 <w:rFonts w:ascii="Calibri" w:cs="Calibri" w:eastAsia="Calibri" w:hAnsi="Calibri"/>
               </w:rPr>
-              <w:t xml:space="preserve">B4-4.1-01 s.d 03</w:t>
+              <w:t xml:space="preserve">B4 Keseluruhan (Non-Mapel)</w:t>
             </w:r>
           </w:p>
         </w:tc>
@@ -8417,7 +8103,7 @@
                 <w:szCs w:val="19"/>
                 <w:rFonts w:ascii="Calibri" w:cs="Calibri" w:eastAsia="Calibri" w:hAnsi="Calibri"/>
               </w:rPr>
-              <w:t xml:space="preserve">Jadwal Agama, RPP Iman, Jurnal Akhlak</w:t>
+              <w:t xml:space="preserve">Pengembangan Visi, P5</w:t>
             </w:r>
           </w:p>
         </w:tc>
@@ -8459,318 +8145,7 @@
                 <w:szCs w:val="19"/>
                 <w:rFonts w:ascii="Calibri" w:cs="Calibri" w:eastAsia="Calibri" w:hAnsi="Calibri"/>
               </w:rPr>
-              <w:t xml:space="preserve">Data pembiasaan agama/shalat Dhuha di PKBM</w:t>
-            </w:r>
-          </w:p>
-        </w:tc>
-      </w:tr>
-      <w:tr>
-        <w:tc>
-          <w:tcPr>
-            <w:tcW w:type="pct" w:w="5%"/>
-            <w:vAlign w:val="center"/>
-          </w:tcPr>
-          <w:p>
-            <w:pPr>
-              <w:spacing w:before="30" w:after="30"/>
-            </w:pPr>
-            <w:r>
-              <w:rPr>
-                <w:color w:val="2C3E50"/>
-                <w:sz w:val="19"/>
-                <w:szCs w:val="19"/>
-                <w:rFonts w:ascii="Calibri" w:cs="Calibri" w:eastAsia="Calibri" w:hAnsi="Calibri"/>
-              </w:rPr>
-              <w:t xml:space="preserve">2</w:t>
-            </w:r>
-          </w:p>
-        </w:tc>
-        <w:tc>
-          <w:tcPr>
-            <w:tcW w:type="pct" w:w="20%"/>
-            <w:vAlign w:val="center"/>
-          </w:tcPr>
-          <w:p>
-            <w:pPr>
-              <w:spacing w:before="30" w:after="30"/>
-            </w:pPr>
-            <w:r>
-              <w:rPr>
-                <w:color w:val="2C3E50"/>
-                <w:sz w:val="19"/>
-                <w:szCs w:val="19"/>
-                <w:rFonts w:ascii="Calibri" w:cs="Calibri" w:eastAsia="Calibri" w:hAnsi="Calibri"/>
-              </w:rPr>
-              <w:t xml:space="preserve">B4-4.2-01 s.d 03</w:t>
-            </w:r>
-          </w:p>
-        </w:tc>
-        <w:tc>
-          <w:tcPr>
-            <w:tcW w:type="pct" w:w="25%"/>
-            <w:vAlign w:val="center"/>
-          </w:tcPr>
-          <w:p>
-            <w:pPr>
-              <w:spacing w:before="30" w:after="30"/>
-            </w:pPr>
-            <w:r>
-              <w:rPr>
-                <w:color w:val="2C3E50"/>
-                <w:sz w:val="19"/>
-                <w:szCs w:val="19"/>
-                <w:rFonts w:ascii="Calibri" w:cs="Calibri" w:eastAsia="Calibri" w:hAnsi="Calibri"/>
-              </w:rPr>
-              <w:t xml:space="preserve">RPP Budaya, Peringatan Hari Besar, Karya Budaya</w:t>
-            </w:r>
-          </w:p>
-        </w:tc>
-        <w:tc>
-          <w:tcPr>
-            <w:tcW w:type="pct" w:w="10%"/>
-            <w:vAlign w:val="center"/>
-          </w:tcPr>
-          <w:p>
-            <w:pPr>
-              <w:spacing w:before="30" w:after="30"/>
-            </w:pPr>
-            <w:r>
-              <w:rPr>
-                <w:color w:val="2C3E50"/>
-                <w:sz w:val="19"/>
-                <w:szCs w:val="19"/>
-                <w:rFonts w:ascii="Calibri" w:cs="Calibri" w:eastAsia="Calibri" w:hAnsi="Calibri"/>
-              </w:rPr>
-              <w:t xml:space="preserve">TINGGI</w:t>
-            </w:r>
-          </w:p>
-        </w:tc>
-        <w:tc>
-          <w:tcPr>
-            <w:tcW w:type="pct" w:w="40%"/>
-            <w:vAlign w:val="center"/>
-          </w:tcPr>
-          <w:p>
-            <w:pPr>
-              <w:spacing w:before="30" w:after="30"/>
-            </w:pPr>
-            <w:r>
-              <w:rPr>
-                <w:color w:val="2C3E50"/>
-                <w:sz w:val="19"/>
-                <w:szCs w:val="19"/>
-                <w:rFonts w:ascii="Calibri" w:cs="Calibri" w:eastAsia="Calibri" w:hAnsi="Calibri"/>
-              </w:rPr>
-              <w:t xml:space="preserve">Data lomba 17 Agustus atau Maulid Nabi</w:t>
-            </w:r>
-          </w:p>
-        </w:tc>
-      </w:tr>
-      <w:tr>
-        <w:tc>
-          <w:tcPr>
-            <w:tcW w:type="pct" w:w="5%"/>
-            <w:shd w:fill="EBF5FB" w:val="clear"/>
-            <w:vAlign w:val="center"/>
-          </w:tcPr>
-          <w:p>
-            <w:pPr>
-              <w:spacing w:before="30" w:after="30"/>
-            </w:pPr>
-            <w:r>
-              <w:rPr>
-                <w:color w:val="2C3E50"/>
-                <w:sz w:val="19"/>
-                <w:szCs w:val="19"/>
-                <w:rFonts w:ascii="Calibri" w:cs="Calibri" w:eastAsia="Calibri" w:hAnsi="Calibri"/>
-              </w:rPr>
-              <w:t xml:space="preserve">3</w:t>
-            </w:r>
-          </w:p>
-        </w:tc>
-        <w:tc>
-          <w:tcPr>
-            <w:tcW w:type="pct" w:w="20%"/>
-            <w:shd w:fill="EBF5FB" w:val="clear"/>
-            <w:vAlign w:val="center"/>
-          </w:tcPr>
-          <w:p>
-            <w:pPr>
-              <w:spacing w:before="30" w:after="30"/>
-            </w:pPr>
-            <w:r>
-              <w:rPr>
-                <w:color w:val="2C3E50"/>
-                <w:sz w:val="19"/>
-                <w:szCs w:val="19"/>
-                <w:rFonts w:ascii="Calibri" w:cs="Calibri" w:eastAsia="Calibri" w:hAnsi="Calibri"/>
-              </w:rPr>
-              <w:t xml:space="preserve">B4-4.3-01 s.d 03</w:t>
-            </w:r>
-          </w:p>
-        </w:tc>
-        <w:tc>
-          <w:tcPr>
-            <w:tcW w:type="pct" w:w="25%"/>
-            <w:shd w:fill="EBF5FB" w:val="clear"/>
-            <w:vAlign w:val="center"/>
-          </w:tcPr>
-          <w:p>
-            <w:pPr>
-              <w:spacing w:before="30" w:after="30"/>
-            </w:pPr>
-            <w:r>
-              <w:rPr>
-                <w:color w:val="2C3E50"/>
-                <w:sz w:val="19"/>
-                <w:szCs w:val="19"/>
-                <w:rFonts w:ascii="Calibri" w:cs="Calibri" w:eastAsia="Calibri" w:hAnsi="Calibri"/>
-              </w:rPr>
-              <w:t xml:space="preserve">LKPD HOTS, Penilaian Kritis, Template Proyek</w:t>
-            </w:r>
-          </w:p>
-        </w:tc>
-        <w:tc>
-          <w:tcPr>
-            <w:tcW w:type="pct" w:w="10%"/>
-            <w:shd w:fill="EBF5FB" w:val="clear"/>
-            <w:vAlign w:val="center"/>
-          </w:tcPr>
-          <w:p>
-            <w:pPr>
-              <w:spacing w:before="30" w:after="30"/>
-            </w:pPr>
-            <w:r>
-              <w:rPr>
-                <w:color w:val="2C3E50"/>
-                <w:sz w:val="19"/>
-                <w:szCs w:val="19"/>
-                <w:rFonts w:ascii="Calibri" w:cs="Calibri" w:eastAsia="Calibri" w:hAnsi="Calibri"/>
-              </w:rPr>
-              <w:t xml:space="preserve">TINGGI</w:t>
-            </w:r>
-          </w:p>
-        </w:tc>
-        <w:tc>
-          <w:tcPr>
-            <w:tcW w:type="pct" w:w="40%"/>
-            <w:shd w:fill="EBF5FB" w:val="clear"/>
-            <w:vAlign w:val="center"/>
-          </w:tcPr>
-          <w:p>
-            <w:pPr>
-              <w:spacing w:before="30" w:after="30"/>
-            </w:pPr>
-            <w:r>
-              <w:rPr>
-                <w:color w:val="2C3E50"/>
-                <w:sz w:val="19"/>
-                <w:szCs w:val="19"/>
-                <w:rFonts w:ascii="Calibri" w:cs="Calibri" w:eastAsia="Calibri" w:hAnsi="Calibri"/>
-              </w:rPr>
-              <w:t xml:space="preserve">LKPD spesifik berbasis penalaran SD</w:t>
-            </w:r>
-          </w:p>
-        </w:tc>
-      </w:tr>
-      <w:tr>
-        <w:tc>
-          <w:tcPr>
-            <w:tcW w:type="pct" w:w="5%"/>
-            <w:vAlign w:val="center"/>
-          </w:tcPr>
-          <w:p>
-            <w:pPr>
-              <w:spacing w:before="30" w:after="30"/>
-            </w:pPr>
-            <w:r>
-              <w:rPr>
-                <w:color w:val="2C3E50"/>
-                <w:sz w:val="19"/>
-                <w:szCs w:val="19"/>
-                <w:rFonts w:ascii="Calibri" w:cs="Calibri" w:eastAsia="Calibri" w:hAnsi="Calibri"/>
-              </w:rPr>
-              <w:t xml:space="preserve">4</w:t>
-            </w:r>
-          </w:p>
-        </w:tc>
-        <w:tc>
-          <w:tcPr>
-            <w:tcW w:type="pct" w:w="20%"/>
-            <w:vAlign w:val="center"/>
-          </w:tcPr>
-          <w:p>
-            <w:pPr>
-              <w:spacing w:before="30" w:after="30"/>
-            </w:pPr>
-            <w:r>
-              <w:rPr>
-                <w:color w:val="2C3E50"/>
-                <w:sz w:val="19"/>
-                <w:szCs w:val="19"/>
-                <w:rFonts w:ascii="Calibri" w:cs="Calibri" w:eastAsia="Calibri" w:hAnsi="Calibri"/>
-              </w:rPr>
-              <w:t xml:space="preserve">B4-4.4-01 s.d 04</w:t>
-            </w:r>
-          </w:p>
-        </w:tc>
-        <w:tc>
-          <w:tcPr>
-            <w:tcW w:type="pct" w:w="25%"/>
-            <w:vAlign w:val="center"/>
-          </w:tcPr>
-          <w:p>
-            <w:pPr>
-              <w:spacing w:before="30" w:after="30"/>
-            </w:pPr>
-            <w:r>
-              <w:rPr>
-                <w:color w:val="2C3E50"/>
-                <w:sz w:val="19"/>
-                <w:szCs w:val="19"/>
-                <w:rFonts w:ascii="Calibri" w:cs="Calibri" w:eastAsia="Calibri" w:hAnsi="Calibri"/>
-              </w:rPr>
-              <w:t xml:space="preserve">Visi Misi, Ekskul, Projek Karakter, Portofolio</w:t>
-            </w:r>
-          </w:p>
-        </w:tc>
-        <w:tc>
-          <w:tcPr>
-            <w:tcW w:type="pct" w:w="10%"/>
-            <w:vAlign w:val="center"/>
-          </w:tcPr>
-          <w:p>
-            <w:pPr>
-              <w:spacing w:before="30" w:after="30"/>
-            </w:pPr>
-            <w:r>
-              <w:rPr>
-                <w:color w:val="2C3E50"/>
-                <w:sz w:val="19"/>
-                <w:szCs w:val="19"/>
-                <w:rFonts w:ascii="Calibri" w:cs="Calibri" w:eastAsia="Calibri" w:hAnsi="Calibri"/>
-              </w:rPr>
-              <w:t xml:space="preserve">TINGGI</w:t>
-            </w:r>
-          </w:p>
-        </w:tc>
-        <w:tc>
-          <w:tcPr>
-            <w:tcW w:type="pct" w:w="40%"/>
-            <w:vAlign w:val="center"/>
-          </w:tcPr>
-          <w:p>
-            <w:pPr>
-              <w:spacing w:before="30" w:after="30"/>
-            </w:pPr>
-            <w:r>
-              <w:rPr>
-                <w:color w:val="2C3E50"/>
-                <w:sz w:val="19"/>
-                <w:szCs w:val="19"/>
-                <w:rFonts w:ascii="Calibri" w:cs="Calibri" w:eastAsia="Calibri" w:hAnsi="Calibri"/>
-              </w:rPr>
-              <w:t xml:space="preserve">Deskripsikan cita-cita karakter SD Miftahul Khoir</w:t>
+              <w:t xml:space="preserve">Data pembiasaan shalat/kegiatan ekskul PKBM</w:t>
             </w:r>
           </w:p>
         </w:tc>
@@ -8835,7 +8210,7 @@
           <w:szCs w:val="22"/>
           <w:rFonts w:ascii="Calibri" w:cs="Calibri" w:eastAsia="Calibri" w:hAnsi="Calibri"/>
         </w:rPr>
-        <w:t xml:space="preserve">Daftar Dokumen (2 Indikator/Fokus)</w:t>
+        <w:t xml:space="preserve">Daftar Tugas</w:t>
       </w:r>
     </w:p>
     <w:tbl>
@@ -8906,7 +8281,7 @@
                 <w:szCs w:val="19"/>
                 <w:rFonts w:ascii="Calibri" w:cs="Calibri" w:eastAsia="Calibri" w:hAnsi="Calibri"/>
               </w:rPr>
-              <w:t xml:space="preserve">Target Generasi</w:t>
+              <w:t xml:space="preserve">Tanggung Jawab</w:t>
             </w:r>
           </w:p>
         </w:tc>
@@ -8930,7 +8305,7 @@
                 <w:szCs w:val="19"/>
                 <w:rFonts w:ascii="Calibri" w:cs="Calibri" w:eastAsia="Calibri" w:hAnsi="Calibri"/>
               </w:rPr>
-              <w:t xml:space="preserve">Berisi Dokumen</w:t>
+              <w:t xml:space="preserve">Konteks Laporan</w:t>
             </w:r>
           </w:p>
         </w:tc>
@@ -9022,7 +8397,7 @@
                 <w:szCs w:val="19"/>
                 <w:rFonts w:ascii="Calibri" w:cs="Calibri" w:eastAsia="Calibri" w:hAnsi="Calibri"/>
               </w:rPr>
-              <w:t xml:space="preserve">B3-3.1-01 s.d 06</w:t>
+              <w:t xml:space="preserve">Mapel Target</w:t>
             </w:r>
           </w:p>
         </w:tc>
@@ -9043,7 +8418,7 @@
                 <w:szCs w:val="19"/>
                 <w:rFonts w:ascii="Calibri" w:cs="Calibri" w:eastAsia="Calibri" w:hAnsi="Calibri"/>
               </w:rPr>
-              <w:t xml:space="preserve">RPP, Prota, Prosem, ATP, Kalender, LKPD</w:t>
+              <w:t xml:space="preserve">Matematika</w:t>
             </w:r>
           </w:p>
         </w:tc>
@@ -9085,109 +8460,7 @@
                 <w:szCs w:val="19"/>
                 <w:rFonts w:ascii="Calibri" w:cs="Calibri" w:eastAsia="Calibri" w:hAnsi="Calibri"/>
               </w:rPr>
-              <w:t xml:space="preserve">Cetak RPP level SMP/Sederajat per mata pelajaran</w:t>
-            </w:r>
-          </w:p>
-        </w:tc>
-      </w:tr>
-      <w:tr>
-        <w:tc>
-          <w:tcPr>
-            <w:tcW w:type="pct" w:w="5%"/>
-            <w:vAlign w:val="center"/>
-          </w:tcPr>
-          <w:p>
-            <w:pPr>
-              <w:spacing w:before="30" w:after="30"/>
-            </w:pPr>
-            <w:r>
-              <w:rPr>
-                <w:color w:val="2C3E50"/>
-                <w:sz w:val="19"/>
-                <w:szCs w:val="19"/>
-                <w:rFonts w:ascii="Calibri" w:cs="Calibri" w:eastAsia="Calibri" w:hAnsi="Calibri"/>
-              </w:rPr>
-              <w:t xml:space="preserve">2</w:t>
-            </w:r>
-          </w:p>
-        </w:tc>
-        <w:tc>
-          <w:tcPr>
-            <w:tcW w:type="pct" w:w="20%"/>
-            <w:vAlign w:val="center"/>
-          </w:tcPr>
-          <w:p>
-            <w:pPr>
-              <w:spacing w:before="30" w:after="30"/>
-            </w:pPr>
-            <w:r>
-              <w:rPr>
-                <w:color w:val="2C3E50"/>
-                <w:sz w:val="19"/>
-                <w:szCs w:val="19"/>
-                <w:rFonts w:ascii="Calibri" w:cs="Calibri" w:eastAsia="Calibri" w:hAnsi="Calibri"/>
-              </w:rPr>
-              <w:t xml:space="preserve">B3-3.5-01 s.d 03</w:t>
-            </w:r>
-          </w:p>
-        </w:tc>
-        <w:tc>
-          <w:tcPr>
-            <w:tcW w:type="pct" w:w="25%"/>
-            <w:vAlign w:val="center"/>
-          </w:tcPr>
-          <w:p>
-            <w:pPr>
-              <w:spacing w:before="30" w:after="30"/>
-            </w:pPr>
-            <w:r>
-              <w:rPr>
-                <w:color w:val="2C3E50"/>
-                <w:sz w:val="19"/>
-                <w:szCs w:val="19"/>
-                <w:rFonts w:ascii="Calibri" w:cs="Calibri" w:eastAsia="Calibri" w:hAnsi="Calibri"/>
-              </w:rPr>
-              <w:t xml:space="preserve">RPP HOTS, LKPD Kritis, Template Proyek</w:t>
-            </w:r>
-          </w:p>
-        </w:tc>
-        <w:tc>
-          <w:tcPr>
-            <w:tcW w:type="pct" w:w="10%"/>
-            <w:vAlign w:val="center"/>
-          </w:tcPr>
-          <w:p>
-            <w:pPr>
-              <w:spacing w:before="30" w:after="30"/>
-            </w:pPr>
-            <w:r>
-              <w:rPr>
-                <w:color w:val="2C3E50"/>
-                <w:sz w:val="19"/>
-                <w:szCs w:val="19"/>
-                <w:rFonts w:ascii="Calibri" w:cs="Calibri" w:eastAsia="Calibri" w:hAnsi="Calibri"/>
-              </w:rPr>
-              <w:t xml:space="preserve">TINGGI</w:t>
-            </w:r>
-          </w:p>
-        </w:tc>
-        <w:tc>
-          <w:tcPr>
-            <w:tcW w:type="pct" w:w="40%"/>
-            <w:vAlign w:val="center"/>
-          </w:tcPr>
-          <w:p>
-            <w:pPr>
-              <w:spacing w:before="30" w:after="30"/>
-            </w:pPr>
-            <w:r>
-              <w:rPr>
-                <w:color w:val="2C3E50"/>
-                <w:sz w:val="19"/>
-                <w:szCs w:val="19"/>
-                <w:rFonts w:ascii="Calibri" w:cs="Calibri" w:eastAsia="Calibri" w:hAnsi="Calibri"/>
-              </w:rPr>
-              <w:t xml:space="preserve">Rancang Modul Ajar level C5 (Mengevaluasi)</w:t>
+              <w:t xml:space="preserve">Cetak RPP, LKPD, Soal dan Rubrik MURNI Matematika SMP</w:t>
             </w:r>
           </w:p>
         </w:tc>
@@ -9252,7 +8525,7 @@
           <w:szCs w:val="22"/>
           <w:rFonts w:ascii="Calibri" w:cs="Calibri" w:eastAsia="Calibri" w:hAnsi="Calibri"/>
         </w:rPr>
-        <w:t xml:space="preserve">Daftar Dokumen (2 Indikator/Fokus)</w:t>
+        <w:t xml:space="preserve">Daftar Tugas</w:t>
       </w:r>
     </w:p>
     <w:tbl>
@@ -9323,7 +8596,7 @@
                 <w:szCs w:val="19"/>
                 <w:rFonts w:ascii="Calibri" w:cs="Calibri" w:eastAsia="Calibri" w:hAnsi="Calibri"/>
               </w:rPr>
-              <w:t xml:space="preserve">Target Generasi</w:t>
+              <w:t xml:space="preserve">Tanggung Jawab</w:t>
             </w:r>
           </w:p>
         </w:tc>
@@ -9347,7 +8620,7 @@
                 <w:szCs w:val="19"/>
                 <w:rFonts w:ascii="Calibri" w:cs="Calibri" w:eastAsia="Calibri" w:hAnsi="Calibri"/>
               </w:rPr>
-              <w:t xml:space="preserve">Berisi Dokumen</w:t>
+              <w:t xml:space="preserve">Konteks Laporan</w:t>
             </w:r>
           </w:p>
         </w:tc>
@@ -9439,7 +8712,7 @@
                 <w:szCs w:val="19"/>
                 <w:rFonts w:ascii="Calibri" w:cs="Calibri" w:eastAsia="Calibri" w:hAnsi="Calibri"/>
               </w:rPr>
-              <w:t xml:space="preserve">B3-3.2-01 s.d 04</w:t>
+              <w:t xml:space="preserve">Mapel Target</w:t>
             </w:r>
           </w:p>
         </w:tc>
@@ -9460,7 +8733,7 @@
                 <w:szCs w:val="19"/>
                 <w:rFonts w:ascii="Calibri" w:cs="Calibri" w:eastAsia="Calibri" w:hAnsi="Calibri"/>
               </w:rPr>
-              <w:t xml:space="preserve">Soal Formatif, Jurnal, Umpan Balik</w:t>
+              <w:t xml:space="preserve">Bahasa Indonesia</w:t>
             </w:r>
           </w:p>
         </w:tc>
@@ -9502,109 +8775,7 @@
                 <w:szCs w:val="19"/>
                 <w:rFonts w:ascii="Calibri" w:cs="Calibri" w:eastAsia="Calibri" w:hAnsi="Calibri"/>
               </w:rPr>
-              <w:t xml:space="preserve">Rumuskan formatif C5 yg ditembak AI</w:t>
-            </w:r>
-          </w:p>
-        </w:tc>
-      </w:tr>
-      <w:tr>
-        <w:tc>
-          <w:tcPr>
-            <w:tcW w:type="pct" w:w="5%"/>
-            <w:vAlign w:val="center"/>
-          </w:tcPr>
-          <w:p>
-            <w:pPr>
-              <w:spacing w:before="30" w:after="30"/>
-            </w:pPr>
-            <w:r>
-              <w:rPr>
-                <w:color w:val="2C3E50"/>
-                <w:sz w:val="19"/>
-                <w:szCs w:val="19"/>
-                <w:rFonts w:ascii="Calibri" w:cs="Calibri" w:eastAsia="Calibri" w:hAnsi="Calibri"/>
-              </w:rPr>
-              <w:t xml:space="preserve">2</w:t>
-            </w:r>
-          </w:p>
-        </w:tc>
-        <w:tc>
-          <w:tcPr>
-            <w:tcW w:type="pct" w:w="20%"/>
-            <w:vAlign w:val="center"/>
-          </w:tcPr>
-          <w:p>
-            <w:pPr>
-              <w:spacing w:before="30" w:after="30"/>
-            </w:pPr>
-            <w:r>
-              <w:rPr>
-                <w:color w:val="2C3E50"/>
-                <w:sz w:val="19"/>
-                <w:szCs w:val="19"/>
-                <w:rFonts w:ascii="Calibri" w:cs="Calibri" w:eastAsia="Calibri" w:hAnsi="Calibri"/>
-              </w:rPr>
-              <w:t xml:space="preserve">B3-3.3-01 &amp; 02</w:t>
-            </w:r>
-          </w:p>
-        </w:tc>
-        <w:tc>
-          <w:tcPr>
-            <w:tcW w:type="pct" w:w="25%"/>
-            <w:vAlign w:val="center"/>
-          </w:tcPr>
-          <w:p>
-            <w:pPr>
-              <w:spacing w:before="30" w:after="30"/>
-            </w:pPr>
-            <w:r>
-              <w:rPr>
-                <w:color w:val="2C3E50"/>
-                <w:sz w:val="19"/>
-                <w:szCs w:val="19"/>
-                <w:rFonts w:ascii="Calibri" w:cs="Calibri" w:eastAsia="Calibri" w:hAnsi="Calibri"/>
-              </w:rPr>
-              <w:t xml:space="preserve">Soal Sumatif, Kisi-kisi</w:t>
-            </w:r>
-          </w:p>
-        </w:tc>
-        <w:tc>
-          <w:tcPr>
-            <w:tcW w:type="pct" w:w="10%"/>
-            <w:vAlign w:val="center"/>
-          </w:tcPr>
-          <w:p>
-            <w:pPr>
-              <w:spacing w:before="30" w:after="30"/>
-            </w:pPr>
-            <w:r>
-              <w:rPr>
-                <w:color w:val="2C3E50"/>
-                <w:sz w:val="19"/>
-                <w:szCs w:val="19"/>
-                <w:rFonts w:ascii="Calibri" w:cs="Calibri" w:eastAsia="Calibri" w:hAnsi="Calibri"/>
-              </w:rPr>
-              <w:t xml:space="preserve">TINGGI</w:t>
-            </w:r>
-          </w:p>
-        </w:tc>
-        <w:tc>
-          <w:tcPr>
-            <w:tcW w:type="pct" w:w="40%"/>
-            <w:vAlign w:val="center"/>
-          </w:tcPr>
-          <w:p>
-            <w:pPr>
-              <w:spacing w:before="30" w:after="30"/>
-            </w:pPr>
-            <w:r>
-              <w:rPr>
-                <w:color w:val="2C3E50"/>
-                <w:sz w:val="19"/>
-                <w:szCs w:val="19"/>
-                <w:rFonts w:ascii="Calibri" w:cs="Calibri" w:eastAsia="Calibri" w:hAnsi="Calibri"/>
-              </w:rPr>
-              <w:t xml:space="preserve">Uji kualitas Kisi-kisi dan Butir Soal</w:t>
+              <w:t xml:space="preserve">Cetak RPP, LKPD, Soal dan Rubrik MURNI B.Indonesia</w:t>
             </w:r>
           </w:p>
         </w:tc>
@@ -9669,7 +8840,7 @@
           <w:szCs w:val="22"/>
           <w:rFonts w:ascii="Calibri" w:cs="Calibri" w:eastAsia="Calibri" w:hAnsi="Calibri"/>
         </w:rPr>
-        <w:t xml:space="preserve">Daftar Dokumen (2 Indikator/Fokus)</w:t>
+        <w:t xml:space="preserve">Daftar Tugas</w:t>
       </w:r>
     </w:p>
     <w:tbl>
@@ -9740,7 +8911,7 @@
                 <w:szCs w:val="19"/>
                 <w:rFonts w:ascii="Calibri" w:cs="Calibri" w:eastAsia="Calibri" w:hAnsi="Calibri"/>
               </w:rPr>
-              <w:t xml:space="preserve">Target Generasi</w:t>
+              <w:t xml:space="preserve">Tanggung Jawab</w:t>
             </w:r>
           </w:p>
         </w:tc>
@@ -9764,7 +8935,7 @@
                 <w:szCs w:val="19"/>
                 <w:rFonts w:ascii="Calibri" w:cs="Calibri" w:eastAsia="Calibri" w:hAnsi="Calibri"/>
               </w:rPr>
-              <w:t xml:space="preserve">Berisi Dokumen</w:t>
+              <w:t xml:space="preserve">Konteks Laporan</w:t>
             </w:r>
           </w:p>
         </w:tc>
@@ -9856,7 +9027,7 @@
                 <w:szCs w:val="19"/>
                 <w:rFonts w:ascii="Calibri" w:cs="Calibri" w:eastAsia="Calibri" w:hAnsi="Calibri"/>
               </w:rPr>
-              <w:t xml:space="preserve">B3-3.3-03 &amp; 04</w:t>
+              <w:t xml:space="preserve">Mapel Target</w:t>
             </w:r>
           </w:p>
         </w:tc>
@@ -9877,7 +9048,7 @@
                 <w:szCs w:val="19"/>
                 <w:rFonts w:ascii="Calibri" w:cs="Calibri" w:eastAsia="Calibri" w:hAnsi="Calibri"/>
               </w:rPr>
-              <w:t xml:space="preserve">Rubrik Penilaian, Daftar Nilai</w:t>
+              <w:t xml:space="preserve">PAI &amp; Budi Pekerti</w:t>
             </w:r>
           </w:p>
         </w:tc>
@@ -9898,7 +9069,7 @@
                 <w:szCs w:val="19"/>
                 <w:rFonts w:ascii="Calibri" w:cs="Calibri" w:eastAsia="Calibri" w:hAnsi="Calibri"/>
               </w:rPr>
-              <w:t xml:space="preserve">SEDANG</w:t>
+              <w:t xml:space="preserve">TINGGI</w:t>
             </w:r>
           </w:p>
         </w:tc>
@@ -9919,109 +9090,7 @@
                 <w:szCs w:val="19"/>
                 <w:rFonts w:ascii="Calibri" w:cs="Calibri" w:eastAsia="Calibri" w:hAnsi="Calibri"/>
               </w:rPr>
-              <w:t xml:space="preserve">Susun perhitungan Kriteria Ketercapaian Tujuan Pembelajaran</w:t>
-            </w:r>
-          </w:p>
-        </w:tc>
-      </w:tr>
-      <w:tr>
-        <w:tc>
-          <w:tcPr>
-            <w:tcW w:type="pct" w:w="5%"/>
-            <w:vAlign w:val="center"/>
-          </w:tcPr>
-          <w:p>
-            <w:pPr>
-              <w:spacing w:before="30" w:after="30"/>
-            </w:pPr>
-            <w:r>
-              <w:rPr>
-                <w:color w:val="2C3E50"/>
-                <w:sz w:val="19"/>
-                <w:szCs w:val="19"/>
-                <w:rFonts w:ascii="Calibri" w:cs="Calibri" w:eastAsia="Calibri" w:hAnsi="Calibri"/>
-              </w:rPr>
-              <w:t xml:space="preserve">2</w:t>
-            </w:r>
-          </w:p>
-        </w:tc>
-        <w:tc>
-          <w:tcPr>
-            <w:tcW w:type="pct" w:w="20%"/>
-            <w:vAlign w:val="center"/>
-          </w:tcPr>
-          <w:p>
-            <w:pPr>
-              <w:spacing w:before="30" w:after="30"/>
-            </w:pPr>
-            <w:r>
-              <w:rPr>
-                <w:color w:val="2C3E50"/>
-                <w:sz w:val="19"/>
-                <w:szCs w:val="19"/>
-                <w:rFonts w:ascii="Calibri" w:cs="Calibri" w:eastAsia="Calibri" w:hAnsi="Calibri"/>
-              </w:rPr>
-              <w:t xml:space="preserve">B3-3.4-01 s.d 04</w:t>
-            </w:r>
-          </w:p>
-        </w:tc>
-        <w:tc>
-          <w:tcPr>
-            <w:tcW w:type="pct" w:w="25%"/>
-            <w:vAlign w:val="center"/>
-          </w:tcPr>
-          <w:p>
-            <w:pPr>
-              <w:spacing w:before="30" w:after="30"/>
-            </w:pPr>
-            <w:r>
-              <w:rPr>
-                <w:color w:val="2C3E50"/>
-                <w:sz w:val="19"/>
-                <w:szCs w:val="19"/>
-                <w:rFonts w:ascii="Calibri" w:cs="Calibri" w:eastAsia="Calibri" w:hAnsi="Calibri"/>
-              </w:rPr>
-              <w:t xml:space="preserve">Rapor, Rekapitulasi, Program Remedial, Ortu</w:t>
-            </w:r>
-          </w:p>
-        </w:tc>
-        <w:tc>
-          <w:tcPr>
-            <w:tcW w:type="pct" w:w="10%"/>
-            <w:vAlign w:val="center"/>
-          </w:tcPr>
-          <w:p>
-            <w:pPr>
-              <w:spacing w:before="30" w:after="30"/>
-            </w:pPr>
-            <w:r>
-              <w:rPr>
-                <w:color w:val="2C3E50"/>
-                <w:sz w:val="19"/>
-                <w:szCs w:val="19"/>
-                <w:rFonts w:ascii="Calibri" w:cs="Calibri" w:eastAsia="Calibri" w:hAnsi="Calibri"/>
-              </w:rPr>
-              <w:t xml:space="preserve">TINGGI</w:t>
-            </w:r>
-          </w:p>
-        </w:tc>
-        <w:tc>
-          <w:tcPr>
-            <w:tcW w:type="pct" w:w="40%"/>
-            <w:vAlign w:val="center"/>
-          </w:tcPr>
-          <w:p>
-            <w:pPr>
-              <w:spacing w:before="30" w:after="30"/>
-            </w:pPr>
-            <w:r>
-              <w:rPr>
-                <w:color w:val="2C3E50"/>
-                <w:sz w:val="19"/>
-                <w:szCs w:val="19"/>
-                <w:rFonts w:ascii="Calibri" w:cs="Calibri" w:eastAsia="Calibri" w:hAnsi="Calibri"/>
-              </w:rPr>
-              <w:t xml:space="preserve">Rekap daftar nilai dan cetak Rapor</w:t>
+              <w:t xml:space="preserve">Susun Prota, Silabus, Rapor untuk PAI</w:t>
             </w:r>
           </w:p>
         </w:tc>
@@ -10046,7 +9115,7 @@
           <w:szCs w:val="26"/>
           <w:rFonts w:ascii="Calibri" w:cs="Calibri" w:eastAsia="Calibri" w:hAnsi="Calibri"/>
         </w:rPr>
-        <w:t xml:space="preserve">  📦 PAKET B — SALIM</w:t>
+        <w:t xml:space="preserve">  📦 PAKET B — ROMADI</w:t>
       </w:r>
     </w:p>
     <w:p>
@@ -10086,7 +9155,7 @@
           <w:szCs w:val="22"/>
           <w:rFonts w:ascii="Calibri" w:cs="Calibri" w:eastAsia="Calibri" w:hAnsi="Calibri"/>
         </w:rPr>
-        <w:t xml:space="preserve">Daftar Dokumen (1 Indikator/Fokus)</w:t>
+        <w:t xml:space="preserve">Daftar Tugas</w:t>
       </w:r>
     </w:p>
     <w:tbl>
@@ -10157,7 +9226,7 @@
                 <w:szCs w:val="19"/>
                 <w:rFonts w:ascii="Calibri" w:cs="Calibri" w:eastAsia="Calibri" w:hAnsi="Calibri"/>
               </w:rPr>
-              <w:t xml:space="preserve">Target Generasi</w:t>
+              <w:t xml:space="preserve">Tanggung Jawab</w:t>
             </w:r>
           </w:p>
         </w:tc>
@@ -10181,7 +9250,7 @@
                 <w:szCs w:val="19"/>
                 <w:rFonts w:ascii="Calibri" w:cs="Calibri" w:eastAsia="Calibri" w:hAnsi="Calibri"/>
               </w:rPr>
-              <w:t xml:space="preserve">Berisi Dokumen</w:t>
+              <w:t xml:space="preserve">Konteks Laporan</w:t>
             </w:r>
           </w:p>
         </w:tc>
@@ -10273,7 +9342,7 @@
                 <w:szCs w:val="19"/>
                 <w:rFonts w:ascii="Calibri" w:cs="Calibri" w:eastAsia="Calibri" w:hAnsi="Calibri"/>
               </w:rPr>
-              <w:t xml:space="preserve">B1-1.1-01 s.d 03</w:t>
+              <w:t xml:space="preserve">Mapel Target</w:t>
             </w:r>
           </w:p>
         </w:tc>
@@ -10294,7 +9363,7 @@
                 <w:szCs w:val="19"/>
                 <w:rFonts w:ascii="Calibri" w:cs="Calibri" w:eastAsia="Calibri" w:hAnsi="Calibri"/>
               </w:rPr>
-              <w:t xml:space="preserve">Dok diskusi, Angket Kepuasan, Catatan Supervisi</w:t>
+              <w:t xml:space="preserve">Ilmu Pengetahuan Alam</w:t>
             </w:r>
           </w:p>
         </w:tc>
@@ -10336,7 +9405,7 @@
                 <w:szCs w:val="19"/>
                 <w:rFonts w:ascii="Calibri" w:cs="Calibri" w:eastAsia="Calibri" w:hAnsi="Calibri"/>
               </w:rPr>
-              <w:t xml:space="preserve">Print angket kepuasan siswa SMP, minta mereka isi</w:t>
+              <w:t xml:space="preserve">Susun RPP dan Dokumen Penilaian IPA Terpadu</w:t>
             </w:r>
           </w:p>
         </w:tc>
@@ -10361,7 +9430,7 @@
           <w:szCs w:val="26"/>
           <w:rFonts w:ascii="Calibri" w:cs="Calibri" w:eastAsia="Calibri" w:hAnsi="Calibri"/>
         </w:rPr>
-        <w:t xml:space="preserve">  📦 PAKET B — ROMADI</w:t>
+        <w:t xml:space="preserve">  📦 PAKET B — SALIM</w:t>
       </w:r>
     </w:p>
     <w:p>
@@ -10401,7 +9470,7 @@
           <w:szCs w:val="22"/>
           <w:rFonts w:ascii="Calibri" w:cs="Calibri" w:eastAsia="Calibri" w:hAnsi="Calibri"/>
         </w:rPr>
-        <w:t xml:space="preserve">Daftar Dokumen (1 Indikator/Fokus)</w:t>
+        <w:t xml:space="preserve">Daftar Tugas</w:t>
       </w:r>
     </w:p>
     <w:tbl>
@@ -10472,7 +9541,7 @@
                 <w:szCs w:val="19"/>
                 <w:rFonts w:ascii="Calibri" w:cs="Calibri" w:eastAsia="Calibri" w:hAnsi="Calibri"/>
               </w:rPr>
-              <w:t xml:space="preserve">Target Generasi</w:t>
+              <w:t xml:space="preserve">Tanggung Jawab</w:t>
             </w:r>
           </w:p>
         </w:tc>
@@ -10496,7 +9565,7 @@
                 <w:szCs w:val="19"/>
                 <w:rFonts w:ascii="Calibri" w:cs="Calibri" w:eastAsia="Calibri" w:hAnsi="Calibri"/>
               </w:rPr>
-              <w:t xml:space="preserve">Berisi Dokumen</w:t>
+              <w:t xml:space="preserve">Konteks Laporan</w:t>
             </w:r>
           </w:p>
         </w:tc>
@@ -10588,7 +9657,7 @@
                 <w:szCs w:val="19"/>
                 <w:rFonts w:ascii="Calibri" w:cs="Calibri" w:eastAsia="Calibri" w:hAnsi="Calibri"/>
               </w:rPr>
-              <w:t xml:space="preserve">B1-1.2-01 s.d 03</w:t>
+              <w:t xml:space="preserve">Mapel Target</w:t>
             </w:r>
           </w:p>
         </w:tc>
@@ -10609,7 +9678,7 @@
                 <w:szCs w:val="19"/>
                 <w:rFonts w:ascii="Calibri" w:cs="Calibri" w:eastAsia="Calibri" w:hAnsi="Calibri"/>
               </w:rPr>
-              <w:t xml:space="preserve">RPP Growth Mindset, Portofolio, Umpan Balik Tutor</w:t>
+              <w:t xml:space="preserve">Pendidikan Pancasila</w:t>
             </w:r>
           </w:p>
         </w:tc>
@@ -10651,7 +9720,7 @@
                 <w:szCs w:val="19"/>
                 <w:rFonts w:ascii="Calibri" w:cs="Calibri" w:eastAsia="Calibri" w:hAnsi="Calibri"/>
               </w:rPr>
-              <w:t xml:space="preserve">Buat portofolio jurnal pendirian mental diri siswa SMP</w:t>
+              <w:t xml:space="preserve">Cetak modul PKN level SMP</w:t>
             </w:r>
           </w:p>
         </w:tc>
@@ -10676,7 +9745,7 @@
           <w:szCs w:val="26"/>
           <w:rFonts w:ascii="Calibri" w:cs="Calibri" w:eastAsia="Calibri" w:hAnsi="Calibri"/>
         </w:rPr>
-        <w:t xml:space="preserve">  📦 PAKET B — EVA</w:t>
+        <w:t xml:space="preserve">  📦 PAKET B — LILIK</w:t>
       </w:r>
     </w:p>
     <w:p>
@@ -10716,7 +9785,7 @@
           <w:szCs w:val="22"/>
           <w:rFonts w:ascii="Calibri" w:cs="Calibri" w:eastAsia="Calibri" w:hAnsi="Calibri"/>
         </w:rPr>
-        <w:t xml:space="preserve">Daftar Dokumen (2 Indikator/Fokus)</w:t>
+        <w:t xml:space="preserve">Daftar Tugas</w:t>
       </w:r>
     </w:p>
     <w:tbl>
@@ -10787,7 +9856,7 @@
                 <w:szCs w:val="19"/>
                 <w:rFonts w:ascii="Calibri" w:cs="Calibri" w:eastAsia="Calibri" w:hAnsi="Calibri"/>
               </w:rPr>
-              <w:t xml:space="preserve">Target Generasi</w:t>
+              <w:t xml:space="preserve">Tanggung Jawab</w:t>
             </w:r>
           </w:p>
         </w:tc>
@@ -10811,7 +9880,7 @@
                 <w:szCs w:val="19"/>
                 <w:rFonts w:ascii="Calibri" w:cs="Calibri" w:eastAsia="Calibri" w:hAnsi="Calibri"/>
               </w:rPr>
-              <w:t xml:space="preserve">Berisi Dokumen</w:t>
+              <w:t xml:space="preserve">Konteks Laporan</w:t>
             </w:r>
           </w:p>
         </w:tc>
@@ -10903,7 +9972,7 @@
                 <w:szCs w:val="19"/>
                 <w:rFonts w:ascii="Calibri" w:cs="Calibri" w:eastAsia="Calibri" w:hAnsi="Calibri"/>
               </w:rPr>
-              <w:t xml:space="preserve">B1-1.3-01 s.d 04</w:t>
+              <w:t xml:space="preserve">Institusi</w:t>
             </w:r>
           </w:p>
         </w:tc>
@@ -10924,7 +9993,7 @@
                 <w:szCs w:val="19"/>
                 <w:rFonts w:ascii="Calibri" w:cs="Calibri" w:eastAsia="Calibri" w:hAnsi="Calibri"/>
               </w:rPr>
-              <w:t xml:space="preserve">Proker Remedial, Jurnal Pendampingan, Asesmen Diagnostik, Buku Ortu</w:t>
+              <w:t xml:space="preserve">Hub. Ortu &amp; Psikologi Siswa</w:t>
             </w:r>
           </w:p>
         </w:tc>
@@ -10966,109 +10035,7 @@
                 <w:szCs w:val="19"/>
                 <w:rFonts w:ascii="Calibri" w:cs="Calibri" w:eastAsia="Calibri" w:hAnsi="Calibri"/>
               </w:rPr>
-              <w:t xml:space="preserve">Deteksi siswa yg tak lulus CP dan tulis di jurnal pendampingan</w:t>
-            </w:r>
-          </w:p>
-        </w:tc>
-      </w:tr>
-      <w:tr>
-        <w:tc>
-          <w:tcPr>
-            <w:tcW w:type="pct" w:w="5%"/>
-            <w:vAlign w:val="center"/>
-          </w:tcPr>
-          <w:p>
-            <w:pPr>
-              <w:spacing w:before="30" w:after="30"/>
-            </w:pPr>
-            <w:r>
-              <w:rPr>
-                <w:color w:val="2C3E50"/>
-                <w:sz w:val="19"/>
-                <w:szCs w:val="19"/>
-                <w:rFonts w:ascii="Calibri" w:cs="Calibri" w:eastAsia="Calibri" w:hAnsi="Calibri"/>
-              </w:rPr>
-              <w:t xml:space="preserve">2</w:t>
-            </w:r>
-          </w:p>
-        </w:tc>
-        <w:tc>
-          <w:tcPr>
-            <w:tcW w:type="pct" w:w="20%"/>
-            <w:vAlign w:val="center"/>
-          </w:tcPr>
-          <w:p>
-            <w:pPr>
-              <w:spacing w:before="30" w:after="30"/>
-            </w:pPr>
-            <w:r>
-              <w:rPr>
-                <w:color w:val="2C3E50"/>
-                <w:sz w:val="19"/>
-                <w:szCs w:val="19"/>
-                <w:rFonts w:ascii="Calibri" w:cs="Calibri" w:eastAsia="Calibri" w:hAnsi="Calibri"/>
-              </w:rPr>
-              <w:t xml:space="preserve">B1-1.4-01 s.d 03</w:t>
-            </w:r>
-          </w:p>
-        </w:tc>
-        <w:tc>
-          <w:tcPr>
-            <w:tcW w:type="pct" w:w="25%"/>
-            <w:vAlign w:val="center"/>
-          </w:tcPr>
-          <w:p>
-            <w:pPr>
-              <w:spacing w:before="30" w:after="30"/>
-            </w:pPr>
-            <w:r>
-              <w:rPr>
-                <w:color w:val="2C3E50"/>
-                <w:sz w:val="19"/>
-                <w:szCs w:val="19"/>
-                <w:rFonts w:ascii="Calibri" w:cs="Calibri" w:eastAsia="Calibri" w:hAnsi="Calibri"/>
-              </w:rPr>
-              <w:t xml:space="preserve">RPP PBL, LKPD Empati, Angket</w:t>
-            </w:r>
-          </w:p>
-        </w:tc>
-        <w:tc>
-          <w:tcPr>
-            <w:tcW w:type="pct" w:w="10%"/>
-            <w:vAlign w:val="center"/>
-          </w:tcPr>
-          <w:p>
-            <w:pPr>
-              <w:spacing w:before="30" w:after="30"/>
-            </w:pPr>
-            <w:r>
-              <w:rPr>
-                <w:color w:val="2C3E50"/>
-                <w:sz w:val="19"/>
-                <w:szCs w:val="19"/>
-                <w:rFonts w:ascii="Calibri" w:cs="Calibri" w:eastAsia="Calibri" w:hAnsi="Calibri"/>
-              </w:rPr>
-              <w:t xml:space="preserve">TINGGI</w:t>
-            </w:r>
-          </w:p>
-        </w:tc>
-        <w:tc>
-          <w:tcPr>
-            <w:tcW w:type="pct" w:w="40%"/>
-            <w:vAlign w:val="center"/>
-          </w:tcPr>
-          <w:p>
-            <w:pPr>
-              <w:spacing w:before="30" w:after="30"/>
-            </w:pPr>
-            <w:r>
-              <w:rPr>
-                <w:color w:val="2C3E50"/>
-                <w:sz w:val="19"/>
-                <w:szCs w:val="19"/>
-                <w:rFonts w:ascii="Calibri" w:cs="Calibri" w:eastAsia="Calibri" w:hAnsi="Calibri"/>
-              </w:rPr>
-              <w:t xml:space="preserve">Cetak angket keterampilan sosial SMP</w:t>
+              <w:t xml:space="preserve">Tangani dokumen laporan orang tua</w:t>
             </w:r>
           </w:p>
         </w:tc>
@@ -11133,7 +10100,7 @@
           <w:szCs w:val="22"/>
           <w:rFonts w:ascii="Calibri" w:cs="Calibri" w:eastAsia="Calibri" w:hAnsi="Calibri"/>
         </w:rPr>
-        <w:t xml:space="preserve">Daftar Dokumen (1 Indikator/Fokus)</w:t>
+        <w:t xml:space="preserve">Daftar Tugas</w:t>
       </w:r>
     </w:p>
     <w:tbl>
@@ -11204,7 +10171,7 @@
                 <w:szCs w:val="19"/>
                 <w:rFonts w:ascii="Calibri" w:cs="Calibri" w:eastAsia="Calibri" w:hAnsi="Calibri"/>
               </w:rPr>
-              <w:t xml:space="preserve">Target Generasi</w:t>
+              <w:t xml:space="preserve">Tanggung Jawab</w:t>
             </w:r>
           </w:p>
         </w:tc>
@@ -11228,7 +10195,7 @@
                 <w:szCs w:val="19"/>
                 <w:rFonts w:ascii="Calibri" w:cs="Calibri" w:eastAsia="Calibri" w:hAnsi="Calibri"/>
               </w:rPr>
-              <w:t xml:space="preserve">Berisi Dokumen</w:t>
+              <w:t xml:space="preserve">Konteks Laporan</w:t>
             </w:r>
           </w:p>
         </w:tc>
@@ -11320,7 +10287,7 @@
                 <w:szCs w:val="19"/>
                 <w:rFonts w:ascii="Calibri" w:cs="Calibri" w:eastAsia="Calibri" w:hAnsi="Calibri"/>
               </w:rPr>
-              <w:t xml:space="preserve">B2-2.1-01 s.d 03</w:t>
+              <w:t xml:space="preserve">Institusi</w:t>
             </w:r>
           </w:p>
         </w:tc>
@@ -11341,7 +10308,7 @@
                 <w:szCs w:val="19"/>
                 <w:rFonts w:ascii="Calibri" w:cs="Calibri" w:eastAsia="Calibri" w:hAnsi="Calibri"/>
               </w:rPr>
-              <w:t xml:space="preserve">Kesepakatan, Poster Aturan, Jurnal Kelas</w:t>
+              <w:t xml:space="preserve">Remedial &amp; Bimbingan Konseling</w:t>
             </w:r>
           </w:p>
         </w:tc>
@@ -11383,7 +10350,7 @@
                 <w:szCs w:val="19"/>
                 <w:rFonts w:ascii="Calibri" w:cs="Calibri" w:eastAsia="Calibri" w:hAnsi="Calibri"/>
               </w:rPr>
-              <w:t xml:space="preserve">Susun draf kesepakatan tertulis bagi ABG SMP</w:t>
+              <w:t xml:space="preserve">Tangani pendataan siswa tertinggal</w:t>
             </w:r>
           </w:p>
         </w:tc>
@@ -11448,7 +10415,7 @@
           <w:szCs w:val="22"/>
           <w:rFonts w:ascii="Calibri" w:cs="Calibri" w:eastAsia="Calibri" w:hAnsi="Calibri"/>
         </w:rPr>
-        <w:t xml:space="preserve">Daftar Dokumen (2 Indikator/Fokus)</w:t>
+        <w:t xml:space="preserve">Daftar Tugas</w:t>
       </w:r>
     </w:p>
     <w:tbl>
@@ -11519,7 +10486,7 @@
                 <w:szCs w:val="19"/>
                 <w:rFonts w:ascii="Calibri" w:cs="Calibri" w:eastAsia="Calibri" w:hAnsi="Calibri"/>
               </w:rPr>
-              <w:t xml:space="preserve">Target Generasi</w:t>
+              <w:t xml:space="preserve">Tanggung Jawab</w:t>
             </w:r>
           </w:p>
         </w:tc>
@@ -11543,7 +10510,7 @@
                 <w:szCs w:val="19"/>
                 <w:rFonts w:ascii="Calibri" w:cs="Calibri" w:eastAsia="Calibri" w:hAnsi="Calibri"/>
               </w:rPr>
-              <w:t xml:space="preserve">Berisi Dokumen</w:t>
+              <w:t xml:space="preserve">Konteks Laporan</w:t>
             </w:r>
           </w:p>
         </w:tc>
@@ -11635,7 +10602,7 @@
                 <w:szCs w:val="19"/>
                 <w:rFonts w:ascii="Calibri" w:cs="Calibri" w:eastAsia="Calibri" w:hAnsi="Calibri"/>
               </w:rPr>
-              <w:t xml:space="preserve">B2-2.2-01 s.d 03</w:t>
+              <w:t xml:space="preserve">Institusi</w:t>
             </w:r>
           </w:p>
         </w:tc>
@@ -11656,7 +10623,7 @@
                 <w:szCs w:val="19"/>
                 <w:rFonts w:ascii="Calibri" w:cs="Calibri" w:eastAsia="Calibri" w:hAnsi="Calibri"/>
               </w:rPr>
-              <w:t xml:space="preserve">Tata Tertib, Supervisi Kelas, Angket Aman</w:t>
+              <w:t xml:space="preserve">Kontrak Belajar &amp; Tata Tertib</w:t>
             </w:r>
           </w:p>
         </w:tc>
@@ -11698,109 +10665,7 @@
                 <w:szCs w:val="19"/>
                 <w:rFonts w:ascii="Calibri" w:cs="Calibri" w:eastAsia="Calibri" w:hAnsi="Calibri"/>
               </w:rPr>
-              <w:t xml:space="preserve">Fokus aturan pencegahan perundungan (Anti-Bullying)</w:t>
-            </w:r>
-          </w:p>
-        </w:tc>
-      </w:tr>
-      <w:tr>
-        <w:tc>
-          <w:tcPr>
-            <w:tcW w:type="pct" w:w="5%"/>
-            <w:vAlign w:val="center"/>
-          </w:tcPr>
-          <w:p>
-            <w:pPr>
-              <w:spacing w:before="30" w:after="30"/>
-            </w:pPr>
-            <w:r>
-              <w:rPr>
-                <w:color w:val="2C3E50"/>
-                <w:sz w:val="19"/>
-                <w:szCs w:val="19"/>
-                <w:rFonts w:ascii="Calibri" w:cs="Calibri" w:eastAsia="Calibri" w:hAnsi="Calibri"/>
-              </w:rPr>
-              <w:t xml:space="preserve">2</w:t>
-            </w:r>
-          </w:p>
-        </w:tc>
-        <w:tc>
-          <w:tcPr>
-            <w:tcW w:type="pct" w:w="20%"/>
-            <w:vAlign w:val="center"/>
-          </w:tcPr>
-          <w:p>
-            <w:pPr>
-              <w:spacing w:before="30" w:after="30"/>
-            </w:pPr>
-            <w:r>
-              <w:rPr>
-                <w:color w:val="2C3E50"/>
-                <w:sz w:val="19"/>
-                <w:szCs w:val="19"/>
-                <w:rFonts w:ascii="Calibri" w:cs="Calibri" w:eastAsia="Calibri" w:hAnsi="Calibri"/>
-              </w:rPr>
-              <w:t xml:space="preserve">B2-2.3-01 s.d 03</w:t>
-            </w:r>
-          </w:p>
-        </w:tc>
-        <w:tc>
-          <w:tcPr>
-            <w:tcW w:type="pct" w:w="25%"/>
-            <w:vAlign w:val="center"/>
-          </w:tcPr>
-          <w:p>
-            <w:pPr>
-              <w:spacing w:before="30" w:after="30"/>
-            </w:pPr>
-            <w:r>
-              <w:rPr>
-                <w:color w:val="2C3E50"/>
-                <w:sz w:val="19"/>
-                <w:szCs w:val="19"/>
-                <w:rFonts w:ascii="Calibri" w:cs="Calibri" w:eastAsia="Calibri" w:hAnsi="Calibri"/>
-              </w:rPr>
-              <w:t xml:space="preserve">RPP Belajar Aktif, LKPD, Dok Belajar</w:t>
-            </w:r>
-          </w:p>
-        </w:tc>
-        <w:tc>
-          <w:tcPr>
-            <w:tcW w:type="pct" w:w="10%"/>
-            <w:vAlign w:val="center"/>
-          </w:tcPr>
-          <w:p>
-            <w:pPr>
-              <w:spacing w:before="30" w:after="30"/>
-            </w:pPr>
-            <w:r>
-              <w:rPr>
-                <w:color w:val="2C3E50"/>
-                <w:sz w:val="19"/>
-                <w:szCs w:val="19"/>
-                <w:rFonts w:ascii="Calibri" w:cs="Calibri" w:eastAsia="Calibri" w:hAnsi="Calibri"/>
-              </w:rPr>
-              <w:t xml:space="preserve">TINGGI</w:t>
-            </w:r>
-          </w:p>
-        </w:tc>
-        <w:tc>
-          <w:tcPr>
-            <w:tcW w:type="pct" w:w="40%"/>
-            <w:vAlign w:val="center"/>
-          </w:tcPr>
-          <w:p>
-            <w:pPr>
-              <w:spacing w:before="30" w:after="30"/>
-            </w:pPr>
-            <w:r>
-              <w:rPr>
-                <w:color w:val="2C3E50"/>
-                <w:sz w:val="19"/>
-                <w:szCs w:val="19"/>
-                <w:rFonts w:ascii="Calibri" w:cs="Calibri" w:eastAsia="Calibri" w:hAnsi="Calibri"/>
-              </w:rPr>
-              <w:t xml:space="preserve">Kegiatan Diskusi Kelompok dan presentasi ABG</w:t>
+              <w:t xml:space="preserve">Aturan Anti-Bullying bagi Siswa SMP</w:t>
             </w:r>
           </w:p>
         </w:tc>
@@ -11865,7 +10730,7 @@
           <w:szCs w:val="22"/>
           <w:rFonts w:ascii="Calibri" w:cs="Calibri" w:eastAsia="Calibri" w:hAnsi="Calibri"/>
         </w:rPr>
-        <w:t xml:space="preserve">Daftar Dokumen (1 Indikator/Fokus)</w:t>
+        <w:t xml:space="preserve">Daftar Tugas</w:t>
       </w:r>
     </w:p>
     <w:tbl>
@@ -11936,7 +10801,7 @@
                 <w:szCs w:val="19"/>
                 <w:rFonts w:ascii="Calibri" w:cs="Calibri" w:eastAsia="Calibri" w:hAnsi="Calibri"/>
               </w:rPr>
-              <w:t xml:space="preserve">Target Generasi</w:t>
+              <w:t xml:space="preserve">Tanggung Jawab</w:t>
             </w:r>
           </w:p>
         </w:tc>
@@ -11960,7 +10825,7 @@
                 <w:szCs w:val="19"/>
                 <w:rFonts w:ascii="Calibri" w:cs="Calibri" w:eastAsia="Calibri" w:hAnsi="Calibri"/>
               </w:rPr>
-              <w:t xml:space="preserve">Berisi Dokumen</w:t>
+              <w:t xml:space="preserve">Konteks Laporan</w:t>
             </w:r>
           </w:p>
         </w:tc>
@@ -12052,7 +10917,7 @@
                 <w:szCs w:val="19"/>
                 <w:rFonts w:ascii="Calibri" w:cs="Calibri" w:eastAsia="Calibri" w:hAnsi="Calibri"/>
               </w:rPr>
-              <w:t xml:space="preserve">B4-4.1-01 s.d 03</w:t>
+              <w:t xml:space="preserve">Institusi</w:t>
             </w:r>
           </w:p>
         </w:tc>
@@ -12073,7 +10938,7 @@
                 <w:szCs w:val="19"/>
                 <w:rFonts w:ascii="Calibri" w:cs="Calibri" w:eastAsia="Calibri" w:hAnsi="Calibri"/>
               </w:rPr>
-              <w:t xml:space="preserve">Jadwal Agama, RPP Iman, Jurnal Akhlak</w:t>
+              <w:t xml:space="preserve">Supervisi Akademik</w:t>
             </w:r>
           </w:p>
         </w:tc>
@@ -12115,7 +10980,7 @@
                 <w:szCs w:val="19"/>
                 <w:rFonts w:ascii="Calibri" w:cs="Calibri" w:eastAsia="Calibri" w:hAnsi="Calibri"/>
               </w:rPr>
-              <w:t xml:space="preserve">Cetak jadwal dan tata tertib tadarus/sholat berjamaah</w:t>
+              <w:t xml:space="preserve">Form pengawasan kepsek &amp; logistik visitasi</w:t>
             </w:r>
           </w:p>
         </w:tc>
@@ -12180,7 +11045,7 @@
           <w:szCs w:val="22"/>
           <w:rFonts w:ascii="Calibri" w:cs="Calibri" w:eastAsia="Calibri" w:hAnsi="Calibri"/>
         </w:rPr>
-        <w:t xml:space="preserve">Daftar Dokumen (1 Indikator/Fokus)</w:t>
+        <w:t xml:space="preserve">Daftar Tugas</w:t>
       </w:r>
     </w:p>
     <w:tbl>
@@ -12251,7 +11116,7 @@
                 <w:szCs w:val="19"/>
                 <w:rFonts w:ascii="Calibri" w:cs="Calibri" w:eastAsia="Calibri" w:hAnsi="Calibri"/>
               </w:rPr>
-              <w:t xml:space="preserve">Target Generasi</w:t>
+              <w:t xml:space="preserve">Tanggung Jawab</w:t>
             </w:r>
           </w:p>
         </w:tc>
@@ -12275,7 +11140,7 @@
                 <w:szCs w:val="19"/>
                 <w:rFonts w:ascii="Calibri" w:cs="Calibri" w:eastAsia="Calibri" w:hAnsi="Calibri"/>
               </w:rPr>
-              <w:t xml:space="preserve">Berisi Dokumen</w:t>
+              <w:t xml:space="preserve">Konteks Laporan</w:t>
             </w:r>
           </w:p>
         </w:tc>
@@ -12367,7 +11232,7 @@
                 <w:szCs w:val="19"/>
                 <w:rFonts w:ascii="Calibri" w:cs="Calibri" w:eastAsia="Calibri" w:hAnsi="Calibri"/>
               </w:rPr>
-              <w:t xml:space="preserve">B4-4.2-01 s.d 03</w:t>
+              <w:t xml:space="preserve">Institusi</w:t>
             </w:r>
           </w:p>
         </w:tc>
@@ -12388,7 +11253,7 @@
                 <w:szCs w:val="19"/>
                 <w:rFonts w:ascii="Calibri" w:cs="Calibri" w:eastAsia="Calibri" w:hAnsi="Calibri"/>
               </w:rPr>
-              <w:t xml:space="preserve">RPP Budaya, Peringatan Hari Besar, Karya Budaya</w:t>
+              <w:t xml:space="preserve">Regulasi Visi Misi &amp; Agama</w:t>
             </w:r>
           </w:p>
         </w:tc>
@@ -12430,7 +11295,7 @@
                 <w:szCs w:val="19"/>
                 <w:rFonts w:ascii="Calibri" w:cs="Calibri" w:eastAsia="Calibri" w:hAnsi="Calibri"/>
               </w:rPr>
-              <w:t xml:space="preserve">Catat partisipasi siswa PKBM dalam Pentas Seni</w:t>
+              <w:t xml:space="preserve">Penyesuaian tujuan PKBM di SISPENA</w:t>
             </w:r>
           </w:p>
         </w:tc>
@@ -12455,7 +11320,7 @@
           <w:szCs w:val="26"/>
           <w:rFonts w:ascii="Calibri" w:cs="Calibri" w:eastAsia="Calibri" w:hAnsi="Calibri"/>
         </w:rPr>
-        <w:t xml:space="preserve">  📦 PAKET B — NADIA</w:t>
+        <w:t xml:space="preserve">  📦 PAKET B — EVA</w:t>
       </w:r>
     </w:p>
     <w:p>
@@ -12495,7 +11360,7 @@
           <w:szCs w:val="22"/>
           <w:rFonts w:ascii="Calibri" w:cs="Calibri" w:eastAsia="Calibri" w:hAnsi="Calibri"/>
         </w:rPr>
-        <w:t xml:space="preserve">Daftar Dokumen (2 Indikator/Fokus)</w:t>
+        <w:t xml:space="preserve">Daftar Tugas</w:t>
       </w:r>
     </w:p>
     <w:tbl>
@@ -12566,7 +11431,7 @@
                 <w:szCs w:val="19"/>
                 <w:rFonts w:ascii="Calibri" w:cs="Calibri" w:eastAsia="Calibri" w:hAnsi="Calibri"/>
               </w:rPr>
-              <w:t xml:space="preserve">Target Generasi</w:t>
+              <w:t xml:space="preserve">Tanggung Jawab</w:t>
             </w:r>
           </w:p>
         </w:tc>
@@ -12590,7 +11455,7 @@
                 <w:szCs w:val="19"/>
                 <w:rFonts w:ascii="Calibri" w:cs="Calibri" w:eastAsia="Calibri" w:hAnsi="Calibri"/>
               </w:rPr>
-              <w:t xml:space="preserve">Berisi Dokumen</w:t>
+              <w:t xml:space="preserve">Konteks Laporan</w:t>
             </w:r>
           </w:p>
         </w:tc>
@@ -12682,7 +11547,7 @@
                 <w:szCs w:val="19"/>
                 <w:rFonts w:ascii="Calibri" w:cs="Calibri" w:eastAsia="Calibri" w:hAnsi="Calibri"/>
               </w:rPr>
-              <w:t xml:space="preserve">B4-4.3-01 s.d 03</w:t>
+              <w:t xml:space="preserve">Institusi</w:t>
             </w:r>
           </w:p>
         </w:tc>
@@ -12703,7 +11568,7 @@
                 <w:szCs w:val="19"/>
                 <w:rFonts w:ascii="Calibri" w:cs="Calibri" w:eastAsia="Calibri" w:hAnsi="Calibri"/>
               </w:rPr>
-              <w:t xml:space="preserve">LKPD HOTS, Penilaian Kritis, Template Proyek</w:t>
+              <w:t xml:space="preserve">Logistik P5 &amp; Ekskul</w:t>
             </w:r>
           </w:p>
         </w:tc>
@@ -12745,109 +11610,7 @@
                 <w:szCs w:val="19"/>
                 <w:rFonts w:ascii="Calibri" w:cs="Calibri" w:eastAsia="Calibri" w:hAnsi="Calibri"/>
               </w:rPr>
-              <w:t xml:space="preserve">Rubrik P5 tahap 1</w:t>
-            </w:r>
-          </w:p>
-        </w:tc>
-      </w:tr>
-      <w:tr>
-        <w:tc>
-          <w:tcPr>
-            <w:tcW w:type="pct" w:w="5%"/>
-            <w:vAlign w:val="center"/>
-          </w:tcPr>
-          <w:p>
-            <w:pPr>
-              <w:spacing w:before="30" w:after="30"/>
-            </w:pPr>
-            <w:r>
-              <w:rPr>
-                <w:color w:val="2C3E50"/>
-                <w:sz w:val="19"/>
-                <w:szCs w:val="19"/>
-                <w:rFonts w:ascii="Calibri" w:cs="Calibri" w:eastAsia="Calibri" w:hAnsi="Calibri"/>
-              </w:rPr>
-              <w:t xml:space="preserve">2</w:t>
-            </w:r>
-          </w:p>
-        </w:tc>
-        <w:tc>
-          <w:tcPr>
-            <w:tcW w:type="pct" w:w="20%"/>
-            <w:vAlign w:val="center"/>
-          </w:tcPr>
-          <w:p>
-            <w:pPr>
-              <w:spacing w:before="30" w:after="30"/>
-            </w:pPr>
-            <w:r>
-              <w:rPr>
-                <w:color w:val="2C3E50"/>
-                <w:sz w:val="19"/>
-                <w:szCs w:val="19"/>
-                <w:rFonts w:ascii="Calibri" w:cs="Calibri" w:eastAsia="Calibri" w:hAnsi="Calibri"/>
-              </w:rPr>
-              <w:t xml:space="preserve">B4-4.4-01 s.d 04</w:t>
-            </w:r>
-          </w:p>
-        </w:tc>
-        <w:tc>
-          <w:tcPr>
-            <w:tcW w:type="pct" w:w="25%"/>
-            <w:vAlign w:val="center"/>
-          </w:tcPr>
-          <w:p>
-            <w:pPr>
-              <w:spacing w:before="30" w:after="30"/>
-            </w:pPr>
-            <w:r>
-              <w:rPr>
-                <w:color w:val="2C3E50"/>
-                <w:sz w:val="19"/>
-                <w:szCs w:val="19"/>
-                <w:rFonts w:ascii="Calibri" w:cs="Calibri" w:eastAsia="Calibri" w:hAnsi="Calibri"/>
-              </w:rPr>
-              <w:t xml:space="preserve">Visi Misi, Ekskul, Projek Karakter, Portofolio</w:t>
-            </w:r>
-          </w:p>
-        </w:tc>
-        <w:tc>
-          <w:tcPr>
-            <w:tcW w:type="pct" w:w="10%"/>
-            <w:vAlign w:val="center"/>
-          </w:tcPr>
-          <w:p>
-            <w:pPr>
-              <w:spacing w:before="30" w:after="30"/>
-            </w:pPr>
-            <w:r>
-              <w:rPr>
-                <w:color w:val="2C3E50"/>
-                <w:sz w:val="19"/>
-                <w:szCs w:val="19"/>
-                <w:rFonts w:ascii="Calibri" w:cs="Calibri" w:eastAsia="Calibri" w:hAnsi="Calibri"/>
-              </w:rPr>
-              <w:t xml:space="preserve">TINGGI</w:t>
-            </w:r>
-          </w:p>
-        </w:tc>
-        <w:tc>
-          <w:tcPr>
-            <w:tcW w:type="pct" w:w="40%"/>
-            <w:vAlign w:val="center"/>
-          </w:tcPr>
-          <w:p>
-            <w:pPr>
-              <w:spacing w:before="30" w:after="30"/>
-            </w:pPr>
-            <w:r>
-              <w:rPr>
-                <w:color w:val="2C3E50"/>
-                <w:sz w:val="19"/>
-                <w:szCs w:val="19"/>
-                <w:rFonts w:ascii="Calibri" w:cs="Calibri" w:eastAsia="Calibri" w:hAnsi="Calibri"/>
-              </w:rPr>
-              <w:t xml:space="preserve">Tema pengenalan Wirausaha di usia SMP</w:t>
+              <w:t xml:space="preserve">Rubrik P5 Kewirausahaan</w:t>
             </w:r>
           </w:p>
         </w:tc>
@@ -12912,7 +11675,7 @@
           <w:szCs w:val="22"/>
           <w:rFonts w:ascii="Calibri" w:cs="Calibri" w:eastAsia="Calibri" w:hAnsi="Calibri"/>
         </w:rPr>
-        <w:t xml:space="preserve">Daftar Dokumen (2 Indikator/Fokus)</w:t>
+        <w:t xml:space="preserve">Daftar Tugas</w:t>
       </w:r>
     </w:p>
     <w:tbl>
@@ -12983,7 +11746,7 @@
                 <w:szCs w:val="19"/>
                 <w:rFonts w:ascii="Calibri" w:cs="Calibri" w:eastAsia="Calibri" w:hAnsi="Calibri"/>
               </w:rPr>
-              <w:t xml:space="preserve">Target Generasi</w:t>
+              <w:t xml:space="preserve">Tanggung Jawab</w:t>
             </w:r>
           </w:p>
         </w:tc>
@@ -13007,7 +11770,7 @@
                 <w:szCs w:val="19"/>
                 <w:rFonts w:ascii="Calibri" w:cs="Calibri" w:eastAsia="Calibri" w:hAnsi="Calibri"/>
               </w:rPr>
-              <w:t xml:space="preserve">Berisi Dokumen</w:t>
+              <w:t xml:space="preserve">Konteks Laporan</w:t>
             </w:r>
           </w:p>
         </w:tc>
@@ -13099,7 +11862,7 @@
                 <w:szCs w:val="19"/>
                 <w:rFonts w:ascii="Calibri" w:cs="Calibri" w:eastAsia="Calibri" w:hAnsi="Calibri"/>
               </w:rPr>
-              <w:t xml:space="preserve">B3-3.1-01 s.d 06</w:t>
+              <w:t xml:space="preserve">Mapel Target</w:t>
             </w:r>
           </w:p>
         </w:tc>
@@ -13120,7 +11883,7 @@
                 <w:szCs w:val="19"/>
                 <w:rFonts w:ascii="Calibri" w:cs="Calibri" w:eastAsia="Calibri" w:hAnsi="Calibri"/>
               </w:rPr>
-              <w:t xml:space="preserve">RPP, Prota, Prosem, ATP, Kalender, LKPD</w:t>
+              <w:t xml:space="preserve">Geografi</w:t>
             </w:r>
           </w:p>
         </w:tc>
@@ -13163,108 +11926,6 @@
                 <w:rFonts w:ascii="Calibri" w:cs="Calibri" w:eastAsia="Calibri" w:hAnsi="Calibri"/>
               </w:rPr>
               <w:t xml:space="preserve">Pengayaan RPP level Tinggi (SMA/Sederajat) arah Vokasi/Karier</w:t>
-            </w:r>
-          </w:p>
-        </w:tc>
-      </w:tr>
-      <w:tr>
-        <w:tc>
-          <w:tcPr>
-            <w:tcW w:type="pct" w:w="5%"/>
-            <w:vAlign w:val="center"/>
-          </w:tcPr>
-          <w:p>
-            <w:pPr>
-              <w:spacing w:before="30" w:after="30"/>
-            </w:pPr>
-            <w:r>
-              <w:rPr>
-                <w:color w:val="2C3E50"/>
-                <w:sz w:val="19"/>
-                <w:szCs w:val="19"/>
-                <w:rFonts w:ascii="Calibri" w:cs="Calibri" w:eastAsia="Calibri" w:hAnsi="Calibri"/>
-              </w:rPr>
-              <w:t xml:space="preserve">2</w:t>
-            </w:r>
-          </w:p>
-        </w:tc>
-        <w:tc>
-          <w:tcPr>
-            <w:tcW w:type="pct" w:w="20%"/>
-            <w:vAlign w:val="center"/>
-          </w:tcPr>
-          <w:p>
-            <w:pPr>
-              <w:spacing w:before="30" w:after="30"/>
-            </w:pPr>
-            <w:r>
-              <w:rPr>
-                <w:color w:val="2C3E50"/>
-                <w:sz w:val="19"/>
-                <w:szCs w:val="19"/>
-                <w:rFonts w:ascii="Calibri" w:cs="Calibri" w:eastAsia="Calibri" w:hAnsi="Calibri"/>
-              </w:rPr>
-              <w:t xml:space="preserve">B3-3.5-01 s.d 03</w:t>
-            </w:r>
-          </w:p>
-        </w:tc>
-        <w:tc>
-          <w:tcPr>
-            <w:tcW w:type="pct" w:w="25%"/>
-            <w:vAlign w:val="center"/>
-          </w:tcPr>
-          <w:p>
-            <w:pPr>
-              <w:spacing w:before="30" w:after="30"/>
-            </w:pPr>
-            <w:r>
-              <w:rPr>
-                <w:color w:val="2C3E50"/>
-                <w:sz w:val="19"/>
-                <w:szCs w:val="19"/>
-                <w:rFonts w:ascii="Calibri" w:cs="Calibri" w:eastAsia="Calibri" w:hAnsi="Calibri"/>
-              </w:rPr>
-              <w:t xml:space="preserve">RPP HOTS, LKPD Kritis, Template Proyek</w:t>
-            </w:r>
-          </w:p>
-        </w:tc>
-        <w:tc>
-          <w:tcPr>
-            <w:tcW w:type="pct" w:w="10%"/>
-            <w:vAlign w:val="center"/>
-          </w:tcPr>
-          <w:p>
-            <w:pPr>
-              <w:spacing w:before="30" w:after="30"/>
-            </w:pPr>
-            <w:r>
-              <w:rPr>
-                <w:color w:val="2C3E50"/>
-                <w:sz w:val="19"/>
-                <w:szCs w:val="19"/>
-                <w:rFonts w:ascii="Calibri" w:cs="Calibri" w:eastAsia="Calibri" w:hAnsi="Calibri"/>
-              </w:rPr>
-              <w:t xml:space="preserve">TINGGI</w:t>
-            </w:r>
-          </w:p>
-        </w:tc>
-        <w:tc>
-          <w:tcPr>
-            <w:tcW w:type="pct" w:w="40%"/>
-            <w:vAlign w:val="center"/>
-          </w:tcPr>
-          <w:p>
-            <w:pPr>
-              <w:spacing w:before="30" w:after="30"/>
-            </w:pPr>
-            <w:r>
-              <w:rPr>
-                <w:color w:val="2C3E50"/>
-                <w:sz w:val="19"/>
-                <w:szCs w:val="19"/>
-                <w:rFonts w:ascii="Calibri" w:cs="Calibri" w:eastAsia="Calibri" w:hAnsi="Calibri"/>
-              </w:rPr>
-              <w:t xml:space="preserve">Modul C6 (Mencipta/Mendesain/Merancang) via AI</w:t>
             </w:r>
           </w:p>
         </w:tc>
@@ -13289,7 +11950,7 @@
           <w:szCs w:val="26"/>
           <w:rFonts w:ascii="Calibri" w:cs="Calibri" w:eastAsia="Calibri" w:hAnsi="Calibri"/>
         </w:rPr>
-        <w:t xml:space="preserve">  📦 PAKET C — JUFRI</w:t>
+        <w:t xml:space="preserve">  📦 PAKET C — ULFA</w:t>
       </w:r>
     </w:p>
     <w:p>
@@ -13329,7 +11990,7 @@
           <w:szCs w:val="22"/>
           <w:rFonts w:ascii="Calibri" w:cs="Calibri" w:eastAsia="Calibri" w:hAnsi="Calibri"/>
         </w:rPr>
-        <w:t xml:space="preserve">Daftar Dokumen (2 Indikator/Fokus)</w:t>
+        <w:t xml:space="preserve">Daftar Tugas</w:t>
       </w:r>
     </w:p>
     <w:tbl>
@@ -13400,7 +12061,7 @@
                 <w:szCs w:val="19"/>
                 <w:rFonts w:ascii="Calibri" w:cs="Calibri" w:eastAsia="Calibri" w:hAnsi="Calibri"/>
               </w:rPr>
-              <w:t xml:space="preserve">Target Generasi</w:t>
+              <w:t xml:space="preserve">Tanggung Jawab</w:t>
             </w:r>
           </w:p>
         </w:tc>
@@ -13424,7 +12085,7 @@
                 <w:szCs w:val="19"/>
                 <w:rFonts w:ascii="Calibri" w:cs="Calibri" w:eastAsia="Calibri" w:hAnsi="Calibri"/>
               </w:rPr>
-              <w:t xml:space="preserve">Berisi Dokumen</w:t>
+              <w:t xml:space="preserve">Konteks Laporan</w:t>
             </w:r>
           </w:p>
         </w:tc>
@@ -13516,7 +12177,7 @@
                 <w:szCs w:val="19"/>
                 <w:rFonts w:ascii="Calibri" w:cs="Calibri" w:eastAsia="Calibri" w:hAnsi="Calibri"/>
               </w:rPr>
-              <w:t xml:space="preserve">B3-3.2-01 s.d 04</w:t>
+              <w:t xml:space="preserve">Mapel Target</w:t>
             </w:r>
           </w:p>
         </w:tc>
@@ -13537,7 +12198,7 @@
                 <w:szCs w:val="19"/>
                 <w:rFonts w:ascii="Calibri" w:cs="Calibri" w:eastAsia="Calibri" w:hAnsi="Calibri"/>
               </w:rPr>
-              <w:t xml:space="preserve">Soal Formatif, Jurnal, Umpan Balik</w:t>
+              <w:t xml:space="preserve">Matematika</w:t>
             </w:r>
           </w:p>
         </w:tc>
@@ -13579,109 +12240,7 @@
                 <w:szCs w:val="19"/>
                 <w:rFonts w:ascii="Calibri" w:cs="Calibri" w:eastAsia="Calibri" w:hAnsi="Calibri"/>
               </w:rPr>
-              <w:t xml:space="preserve">Review kualitas soal evaluasi yang diciptakan Gemini AI</w:t>
-            </w:r>
-          </w:p>
-        </w:tc>
-      </w:tr>
-      <w:tr>
-        <w:tc>
-          <w:tcPr>
-            <w:tcW w:type="pct" w:w="5%"/>
-            <w:vAlign w:val="center"/>
-          </w:tcPr>
-          <w:p>
-            <w:pPr>
-              <w:spacing w:before="30" w:after="30"/>
-            </w:pPr>
-            <w:r>
-              <w:rPr>
-                <w:color w:val="2C3E50"/>
-                <w:sz w:val="19"/>
-                <w:szCs w:val="19"/>
-                <w:rFonts w:ascii="Calibri" w:cs="Calibri" w:eastAsia="Calibri" w:hAnsi="Calibri"/>
-              </w:rPr>
-              <w:t xml:space="preserve">2</w:t>
-            </w:r>
-          </w:p>
-        </w:tc>
-        <w:tc>
-          <w:tcPr>
-            <w:tcW w:type="pct" w:w="20%"/>
-            <w:vAlign w:val="center"/>
-          </w:tcPr>
-          <w:p>
-            <w:pPr>
-              <w:spacing w:before="30" w:after="30"/>
-            </w:pPr>
-            <w:r>
-              <w:rPr>
-                <w:color w:val="2C3E50"/>
-                <w:sz w:val="19"/>
-                <w:szCs w:val="19"/>
-                <w:rFonts w:ascii="Calibri" w:cs="Calibri" w:eastAsia="Calibri" w:hAnsi="Calibri"/>
-              </w:rPr>
-              <w:t xml:space="preserve">B3-3.3-01 &amp; 02</w:t>
-            </w:r>
-          </w:p>
-        </w:tc>
-        <w:tc>
-          <w:tcPr>
-            <w:tcW w:type="pct" w:w="25%"/>
-            <w:vAlign w:val="center"/>
-          </w:tcPr>
-          <w:p>
-            <w:pPr>
-              <w:spacing w:before="30" w:after="30"/>
-            </w:pPr>
-            <w:r>
-              <w:rPr>
-                <w:color w:val="2C3E50"/>
-                <w:sz w:val="19"/>
-                <w:szCs w:val="19"/>
-                <w:rFonts w:ascii="Calibri" w:cs="Calibri" w:eastAsia="Calibri" w:hAnsi="Calibri"/>
-              </w:rPr>
-              <w:t xml:space="preserve">Soal Sumatif, Kisi-kisi</w:t>
-            </w:r>
-          </w:p>
-        </w:tc>
-        <w:tc>
-          <w:tcPr>
-            <w:tcW w:type="pct" w:w="10%"/>
-            <w:vAlign w:val="center"/>
-          </w:tcPr>
-          <w:p>
-            <w:pPr>
-              <w:spacing w:before="30" w:after="30"/>
-            </w:pPr>
-            <w:r>
-              <w:rPr>
-                <w:color w:val="2C3E50"/>
-                <w:sz w:val="19"/>
-                <w:szCs w:val="19"/>
-                <w:rFonts w:ascii="Calibri" w:cs="Calibri" w:eastAsia="Calibri" w:hAnsi="Calibri"/>
-              </w:rPr>
-              <w:t xml:space="preserve">TINGGI</w:t>
-            </w:r>
-          </w:p>
-        </w:tc>
-        <w:tc>
-          <w:tcPr>
-            <w:tcW w:type="pct" w:w="40%"/>
-            <w:vAlign w:val="center"/>
-          </w:tcPr>
-          <w:p>
-            <w:pPr>
-              <w:spacing w:before="30" w:after="30"/>
-            </w:pPr>
-            <w:r>
-              <w:rPr>
-                <w:color w:val="2C3E50"/>
-                <w:sz w:val="19"/>
-                <w:szCs w:val="19"/>
-                <w:rFonts w:ascii="Calibri" w:cs="Calibri" w:eastAsia="Calibri" w:hAnsi="Calibri"/>
-              </w:rPr>
-              <w:t xml:space="preserve">Soal harus ada Analisis SWOT atau Problem Solving</w:t>
+              <w:t xml:space="preserve">RPP dan LKPD Hitungan Aplikasi</w:t>
             </w:r>
           </w:p>
         </w:tc>
@@ -13706,7 +12265,7 @@
           <w:szCs w:val="26"/>
           <w:rFonts w:ascii="Calibri" w:cs="Calibri" w:eastAsia="Calibri" w:hAnsi="Calibri"/>
         </w:rPr>
-        <w:t xml:space="preserve">  📦 PAKET C — LILIK</w:t>
+        <w:t xml:space="preserve">  📦 PAKET C — RIKI</w:t>
       </w:r>
     </w:p>
     <w:p>
@@ -13746,7 +12305,7 @@
           <w:szCs w:val="22"/>
           <w:rFonts w:ascii="Calibri" w:cs="Calibri" w:eastAsia="Calibri" w:hAnsi="Calibri"/>
         </w:rPr>
-        <w:t xml:space="preserve">Daftar Dokumen (2 Indikator/Fokus)</w:t>
+        <w:t xml:space="preserve">Daftar Tugas</w:t>
       </w:r>
     </w:p>
     <w:tbl>
@@ -13817,7 +12376,7 @@
                 <w:szCs w:val="19"/>
                 <w:rFonts w:ascii="Calibri" w:cs="Calibri" w:eastAsia="Calibri" w:hAnsi="Calibri"/>
               </w:rPr>
-              <w:t xml:space="preserve">Target Generasi</w:t>
+              <w:t xml:space="preserve">Tanggung Jawab</w:t>
             </w:r>
           </w:p>
         </w:tc>
@@ -13841,7 +12400,7 @@
                 <w:szCs w:val="19"/>
                 <w:rFonts w:ascii="Calibri" w:cs="Calibri" w:eastAsia="Calibri" w:hAnsi="Calibri"/>
               </w:rPr>
-              <w:t xml:space="preserve">Berisi Dokumen</w:t>
+              <w:t xml:space="preserve">Konteks Laporan</w:t>
             </w:r>
           </w:p>
         </w:tc>
@@ -13933,7 +12492,7 @@
                 <w:szCs w:val="19"/>
                 <w:rFonts w:ascii="Calibri" w:cs="Calibri" w:eastAsia="Calibri" w:hAnsi="Calibri"/>
               </w:rPr>
-              <w:t xml:space="preserve">B3-3.3-03 &amp; 04</w:t>
+              <w:t xml:space="preserve">Mapel Target</w:t>
             </w:r>
           </w:p>
         </w:tc>
@@ -13954,7 +12513,7 @@
                 <w:szCs w:val="19"/>
                 <w:rFonts w:ascii="Calibri" w:cs="Calibri" w:eastAsia="Calibri" w:hAnsi="Calibri"/>
               </w:rPr>
-              <w:t xml:space="preserve">Rubrik Penilaian, Daftar Nilai</w:t>
+              <w:t xml:space="preserve">Bahasa Indonesia</w:t>
             </w:r>
           </w:p>
         </w:tc>
@@ -13975,7 +12534,7 @@
                 <w:szCs w:val="19"/>
                 <w:rFonts w:ascii="Calibri" w:cs="Calibri" w:eastAsia="Calibri" w:hAnsi="Calibri"/>
               </w:rPr>
-              <w:t xml:space="preserve">SEDANG</w:t>
+              <w:t xml:space="preserve">TINGGI</w:t>
             </w:r>
           </w:p>
         </w:tc>
@@ -13996,109 +12555,7 @@
                 <w:szCs w:val="19"/>
                 <w:rFonts w:ascii="Calibri" w:cs="Calibri" w:eastAsia="Calibri" w:hAnsi="Calibri"/>
               </w:rPr>
-              <w:t xml:space="preserve">Rubrik Penilaian Presentasi / Praktek Bisnis</w:t>
-            </w:r>
-          </w:p>
-        </w:tc>
-      </w:tr>
-      <w:tr>
-        <w:tc>
-          <w:tcPr>
-            <w:tcW w:type="pct" w:w="5%"/>
-            <w:vAlign w:val="center"/>
-          </w:tcPr>
-          <w:p>
-            <w:pPr>
-              <w:spacing w:before="30" w:after="30"/>
-            </w:pPr>
-            <w:r>
-              <w:rPr>
-                <w:color w:val="2C3E50"/>
-                <w:sz w:val="19"/>
-                <w:szCs w:val="19"/>
-                <w:rFonts w:ascii="Calibri" w:cs="Calibri" w:eastAsia="Calibri" w:hAnsi="Calibri"/>
-              </w:rPr>
-              <w:t xml:space="preserve">2</w:t>
-            </w:r>
-          </w:p>
-        </w:tc>
-        <w:tc>
-          <w:tcPr>
-            <w:tcW w:type="pct" w:w="20%"/>
-            <w:vAlign w:val="center"/>
-          </w:tcPr>
-          <w:p>
-            <w:pPr>
-              <w:spacing w:before="30" w:after="30"/>
-            </w:pPr>
-            <w:r>
-              <w:rPr>
-                <w:color w:val="2C3E50"/>
-                <w:sz w:val="19"/>
-                <w:szCs w:val="19"/>
-                <w:rFonts w:ascii="Calibri" w:cs="Calibri" w:eastAsia="Calibri" w:hAnsi="Calibri"/>
-              </w:rPr>
-              <w:t xml:space="preserve">B3-3.4-01 s.d 04</w:t>
-            </w:r>
-          </w:p>
-        </w:tc>
-        <w:tc>
-          <w:tcPr>
-            <w:tcW w:type="pct" w:w="25%"/>
-            <w:vAlign w:val="center"/>
-          </w:tcPr>
-          <w:p>
-            <w:pPr>
-              <w:spacing w:before="30" w:after="30"/>
-            </w:pPr>
-            <w:r>
-              <w:rPr>
-                <w:color w:val="2C3E50"/>
-                <w:sz w:val="19"/>
-                <w:szCs w:val="19"/>
-                <w:rFonts w:ascii="Calibri" w:cs="Calibri" w:eastAsia="Calibri" w:hAnsi="Calibri"/>
-              </w:rPr>
-              <w:t xml:space="preserve">Rapor, Rekapitulasi, Program Remedial, Ortu</w:t>
-            </w:r>
-          </w:p>
-        </w:tc>
-        <w:tc>
-          <w:tcPr>
-            <w:tcW w:type="pct" w:w="10%"/>
-            <w:vAlign w:val="center"/>
-          </w:tcPr>
-          <w:p>
-            <w:pPr>
-              <w:spacing w:before="30" w:after="30"/>
-            </w:pPr>
-            <w:r>
-              <w:rPr>
-                <w:color w:val="2C3E50"/>
-                <w:sz w:val="19"/>
-                <w:szCs w:val="19"/>
-                <w:rFonts w:ascii="Calibri" w:cs="Calibri" w:eastAsia="Calibri" w:hAnsi="Calibri"/>
-              </w:rPr>
-              <w:t xml:space="preserve">TINGGI</w:t>
-            </w:r>
-          </w:p>
-        </w:tc>
-        <w:tc>
-          <w:tcPr>
-            <w:tcW w:type="pct" w:w="40%"/>
-            <w:vAlign w:val="center"/>
-          </w:tcPr>
-          <w:p>
-            <w:pPr>
-              <w:spacing w:before="30" w:after="30"/>
-            </w:pPr>
-            <w:r>
-              <w:rPr>
-                <w:color w:val="2C3E50"/>
-                <w:sz w:val="19"/>
-                <w:szCs w:val="19"/>
-                <w:rFonts w:ascii="Calibri" w:cs="Calibri" w:eastAsia="Calibri" w:hAnsi="Calibri"/>
-              </w:rPr>
-              <w:t xml:space="preserve">Cetak transkrip evaluasi Rapor SMA/Sederajat</w:t>
+              <w:t xml:space="preserve">Modul C6 (Mencipta/Mendesain/Merancang) via AI B.Indo</w:t>
             </w:r>
           </w:p>
         </w:tc>
@@ -14123,7 +12580,7 @@
           <w:szCs w:val="26"/>
           <w:rFonts w:ascii="Calibri" w:cs="Calibri" w:eastAsia="Calibri" w:hAnsi="Calibri"/>
         </w:rPr>
-        <w:t xml:space="preserve">  📦 PAKET C — RIKI</w:t>
+        <w:t xml:space="preserve">  📦 PAKET C — NADIA</w:t>
       </w:r>
     </w:p>
     <w:p>
@@ -14163,7 +12620,7 @@
           <w:szCs w:val="22"/>
           <w:rFonts w:ascii="Calibri" w:cs="Calibri" w:eastAsia="Calibri" w:hAnsi="Calibri"/>
         </w:rPr>
-        <w:t xml:space="preserve">Daftar Dokumen (2 Indikator/Fokus)</w:t>
+        <w:t xml:space="preserve">Daftar Tugas</w:t>
       </w:r>
     </w:p>
     <w:tbl>
@@ -14234,7 +12691,7 @@
                 <w:szCs w:val="19"/>
                 <w:rFonts w:ascii="Calibri" w:cs="Calibri" w:eastAsia="Calibri" w:hAnsi="Calibri"/>
               </w:rPr>
-              <w:t xml:space="preserve">Target Generasi</w:t>
+              <w:t xml:space="preserve">Tanggung Jawab</w:t>
             </w:r>
           </w:p>
         </w:tc>
@@ -14258,7 +12715,7 @@
                 <w:szCs w:val="19"/>
                 <w:rFonts w:ascii="Calibri" w:cs="Calibri" w:eastAsia="Calibri" w:hAnsi="Calibri"/>
               </w:rPr>
-              <w:t xml:space="preserve">Berisi Dokumen</w:t>
+              <w:t xml:space="preserve">Konteks Laporan</w:t>
             </w:r>
           </w:p>
         </w:tc>
@@ -14350,7 +12807,7 @@
                 <w:szCs w:val="19"/>
                 <w:rFonts w:ascii="Calibri" w:cs="Calibri" w:eastAsia="Calibri" w:hAnsi="Calibri"/>
               </w:rPr>
-              <w:t xml:space="preserve">B1-1.1-01 s.d 03</w:t>
+              <w:t xml:space="preserve">Mapel Target</w:t>
             </w:r>
           </w:p>
         </w:tc>
@@ -14371,7 +12828,7 @@
                 <w:szCs w:val="19"/>
                 <w:rFonts w:ascii="Calibri" w:cs="Calibri" w:eastAsia="Calibri" w:hAnsi="Calibri"/>
               </w:rPr>
-              <w:t xml:space="preserve">Dok diskusi, Angket Kepuasan, Catatan Supervisi</w:t>
+              <w:t xml:space="preserve">Bahasa Inggris</w:t>
             </w:r>
           </w:p>
         </w:tc>
@@ -14413,109 +12870,7 @@
                 <w:szCs w:val="19"/>
                 <w:rFonts w:ascii="Calibri" w:cs="Calibri" w:eastAsia="Calibri" w:hAnsi="Calibri"/>
               </w:rPr>
-              <w:t xml:space="preserve">Lampirkan bukti foto siswa pekerja dan fleksibilitas jadwal</w:t>
-            </w:r>
-          </w:p>
-        </w:tc>
-      </w:tr>
-      <w:tr>
-        <w:tc>
-          <w:tcPr>
-            <w:tcW w:type="pct" w:w="5%"/>
-            <w:vAlign w:val="center"/>
-          </w:tcPr>
-          <w:p>
-            <w:pPr>
-              <w:spacing w:before="30" w:after="30"/>
-            </w:pPr>
-            <w:r>
-              <w:rPr>
-                <w:color w:val="2C3E50"/>
-                <w:sz w:val="19"/>
-                <w:szCs w:val="19"/>
-                <w:rFonts w:ascii="Calibri" w:cs="Calibri" w:eastAsia="Calibri" w:hAnsi="Calibri"/>
-              </w:rPr>
-              <w:t xml:space="preserve">2</w:t>
-            </w:r>
-          </w:p>
-        </w:tc>
-        <w:tc>
-          <w:tcPr>
-            <w:tcW w:type="pct" w:w="20%"/>
-            <w:vAlign w:val="center"/>
-          </w:tcPr>
-          <w:p>
-            <w:pPr>
-              <w:spacing w:before="30" w:after="30"/>
-            </w:pPr>
-            <w:r>
-              <w:rPr>
-                <w:color w:val="2C3E50"/>
-                <w:sz w:val="19"/>
-                <w:szCs w:val="19"/>
-                <w:rFonts w:ascii="Calibri" w:cs="Calibri" w:eastAsia="Calibri" w:hAnsi="Calibri"/>
-              </w:rPr>
-              <w:t xml:space="preserve">B1-1.2-01 s.d 03</w:t>
-            </w:r>
-          </w:p>
-        </w:tc>
-        <w:tc>
-          <w:tcPr>
-            <w:tcW w:type="pct" w:w="25%"/>
-            <w:vAlign w:val="center"/>
-          </w:tcPr>
-          <w:p>
-            <w:pPr>
-              <w:spacing w:before="30" w:after="30"/>
-            </w:pPr>
-            <w:r>
-              <w:rPr>
-                <w:color w:val="2C3E50"/>
-                <w:sz w:val="19"/>
-                <w:szCs w:val="19"/>
-                <w:rFonts w:ascii="Calibri" w:cs="Calibri" w:eastAsia="Calibri" w:hAnsi="Calibri"/>
-              </w:rPr>
-              <w:t xml:space="preserve">RPP Growth Mindset, Portofolio, Umpan Balik Tutor</w:t>
-            </w:r>
-          </w:p>
-        </w:tc>
-        <w:tc>
-          <w:tcPr>
-            <w:tcW w:type="pct" w:w="10%"/>
-            <w:vAlign w:val="center"/>
-          </w:tcPr>
-          <w:p>
-            <w:pPr>
-              <w:spacing w:before="30" w:after="30"/>
-            </w:pPr>
-            <w:r>
-              <w:rPr>
-                <w:color w:val="2C3E50"/>
-                <w:sz w:val="19"/>
-                <w:szCs w:val="19"/>
-                <w:rFonts w:ascii="Calibri" w:cs="Calibri" w:eastAsia="Calibri" w:hAnsi="Calibri"/>
-              </w:rPr>
-              <w:t xml:space="preserve">TINGGI</w:t>
-            </w:r>
-          </w:p>
-        </w:tc>
-        <w:tc>
-          <w:tcPr>
-            <w:tcW w:type="pct" w:w="40%"/>
-            <w:vAlign w:val="center"/>
-          </w:tcPr>
-          <w:p>
-            <w:pPr>
-              <w:spacing w:before="30" w:after="30"/>
-            </w:pPr>
-            <w:r>
-              <w:rPr>
-                <w:color w:val="2C3E50"/>
-                <w:sz w:val="19"/>
-                <w:szCs w:val="19"/>
-                <w:rFonts w:ascii="Calibri" w:cs="Calibri" w:eastAsia="Calibri" w:hAnsi="Calibri"/>
-              </w:rPr>
-              <w:t xml:space="preserve">Catat portfolio mental kedewasaan belajar Paket C</w:t>
+              <w:t xml:space="preserve">RPP Grammar Dasar dan Komunikasi</w:t>
             </w:r>
           </w:p>
         </w:tc>
@@ -14580,7 +12935,7 @@
           <w:szCs w:val="22"/>
           <w:rFonts w:ascii="Calibri" w:cs="Calibri" w:eastAsia="Calibri" w:hAnsi="Calibri"/>
         </w:rPr>
-        <w:t xml:space="preserve">Daftar Dokumen (2 Indikator/Fokus)</w:t>
+        <w:t xml:space="preserve">Daftar Tugas</w:t>
       </w:r>
     </w:p>
     <w:tbl>
@@ -14651,7 +13006,7 @@
                 <w:szCs w:val="19"/>
                 <w:rFonts w:ascii="Calibri" w:cs="Calibri" w:eastAsia="Calibri" w:hAnsi="Calibri"/>
               </w:rPr>
-              <w:t xml:space="preserve">Target Generasi</w:t>
+              <w:t xml:space="preserve">Tanggung Jawab</w:t>
             </w:r>
           </w:p>
         </w:tc>
@@ -14675,7 +13030,7 @@
                 <w:szCs w:val="19"/>
                 <w:rFonts w:ascii="Calibri" w:cs="Calibri" w:eastAsia="Calibri" w:hAnsi="Calibri"/>
               </w:rPr>
-              <w:t xml:space="preserve">Berisi Dokumen</w:t>
+              <w:t xml:space="preserve">Konteks Laporan</w:t>
             </w:r>
           </w:p>
         </w:tc>
@@ -14767,7 +13122,7 @@
                 <w:szCs w:val="19"/>
                 <w:rFonts w:ascii="Calibri" w:cs="Calibri" w:eastAsia="Calibri" w:hAnsi="Calibri"/>
               </w:rPr>
-              <w:t xml:space="preserve">B1-1.3-01 s.d 04</w:t>
+              <w:t xml:space="preserve">Mapel Target</w:t>
             </w:r>
           </w:p>
         </w:tc>
@@ -14788,7 +13143,7 @@
                 <w:szCs w:val="19"/>
                 <w:rFonts w:ascii="Calibri" w:cs="Calibri" w:eastAsia="Calibri" w:hAnsi="Calibri"/>
               </w:rPr>
-              <w:t xml:space="preserve">Proker Remedial, Jurnal Pendampingan, Asesmen Diagnostik, Buku Ortu</w:t>
+              <w:t xml:space="preserve">Pendidikan Pancasila</w:t>
             </w:r>
           </w:p>
         </w:tc>
@@ -14830,109 +13185,7 @@
                 <w:szCs w:val="19"/>
                 <w:rFonts w:ascii="Calibri" w:cs="Calibri" w:eastAsia="Calibri" w:hAnsi="Calibri"/>
               </w:rPr>
-              <w:t xml:space="preserve">Evaluasi bagi pemuda putus sekolah lama</w:t>
-            </w:r>
-          </w:p>
-        </w:tc>
-      </w:tr>
-      <w:tr>
-        <w:tc>
-          <w:tcPr>
-            <w:tcW w:type="pct" w:w="5%"/>
-            <w:vAlign w:val="center"/>
-          </w:tcPr>
-          <w:p>
-            <w:pPr>
-              <w:spacing w:before="30" w:after="30"/>
-            </w:pPr>
-            <w:r>
-              <w:rPr>
-                <w:color w:val="2C3E50"/>
-                <w:sz w:val="19"/>
-                <w:szCs w:val="19"/>
-                <w:rFonts w:ascii="Calibri" w:cs="Calibri" w:eastAsia="Calibri" w:hAnsi="Calibri"/>
-              </w:rPr>
-              <w:t xml:space="preserve">2</w:t>
-            </w:r>
-          </w:p>
-        </w:tc>
-        <w:tc>
-          <w:tcPr>
-            <w:tcW w:type="pct" w:w="20%"/>
-            <w:vAlign w:val="center"/>
-          </w:tcPr>
-          <w:p>
-            <w:pPr>
-              <w:spacing w:before="30" w:after="30"/>
-            </w:pPr>
-            <w:r>
-              <w:rPr>
-                <w:color w:val="2C3E50"/>
-                <w:sz w:val="19"/>
-                <w:szCs w:val="19"/>
-                <w:rFonts w:ascii="Calibri" w:cs="Calibri" w:eastAsia="Calibri" w:hAnsi="Calibri"/>
-              </w:rPr>
-              <w:t xml:space="preserve">B1-1.4-01 s.d 03</w:t>
-            </w:r>
-          </w:p>
-        </w:tc>
-        <w:tc>
-          <w:tcPr>
-            <w:tcW w:type="pct" w:w="25%"/>
-            <w:vAlign w:val="center"/>
-          </w:tcPr>
-          <w:p>
-            <w:pPr>
-              <w:spacing w:before="30" w:after="30"/>
-            </w:pPr>
-            <w:r>
-              <w:rPr>
-                <w:color w:val="2C3E50"/>
-                <w:sz w:val="19"/>
-                <w:szCs w:val="19"/>
-                <w:rFonts w:ascii="Calibri" w:cs="Calibri" w:eastAsia="Calibri" w:hAnsi="Calibri"/>
-              </w:rPr>
-              <w:t xml:space="preserve">RPP PBL, LKPD Empati, Angket</w:t>
-            </w:r>
-          </w:p>
-        </w:tc>
-        <w:tc>
-          <w:tcPr>
-            <w:tcW w:type="pct" w:w="10%"/>
-            <w:vAlign w:val="center"/>
-          </w:tcPr>
-          <w:p>
-            <w:pPr>
-              <w:spacing w:before="30" w:after="30"/>
-            </w:pPr>
-            <w:r>
-              <w:rPr>
-                <w:color w:val="2C3E50"/>
-                <w:sz w:val="19"/>
-                <w:szCs w:val="19"/>
-                <w:rFonts w:ascii="Calibri" w:cs="Calibri" w:eastAsia="Calibri" w:hAnsi="Calibri"/>
-              </w:rPr>
-              <w:t xml:space="preserve">TINGGI</w:t>
-            </w:r>
-          </w:p>
-        </w:tc>
-        <w:tc>
-          <w:tcPr>
-            <w:tcW w:type="pct" w:w="40%"/>
-            <w:vAlign w:val="center"/>
-          </w:tcPr>
-          <w:p>
-            <w:pPr>
-              <w:spacing w:before="30" w:after="30"/>
-            </w:pPr>
-            <w:r>
-              <w:rPr>
-                <w:color w:val="2C3E50"/>
-                <w:sz w:val="19"/>
-                <w:szCs w:val="19"/>
-                <w:rFonts w:ascii="Calibri" w:cs="Calibri" w:eastAsia="Calibri" w:hAnsi="Calibri"/>
-              </w:rPr>
-              <w:t xml:space="preserve">Membantu motivasi anak didik usia dewasa</w:t>
+              <w:t xml:space="preserve">Kesusastraan NKRI Dewasa</w:t>
             </w:r>
           </w:p>
         </w:tc>
@@ -14997,7 +13250,7 @@
           <w:szCs w:val="22"/>
           <w:rFonts w:ascii="Calibri" w:cs="Calibri" w:eastAsia="Calibri" w:hAnsi="Calibri"/>
         </w:rPr>
-        <w:t xml:space="preserve">Daftar Dokumen (2 Indikator/Fokus)</w:t>
+        <w:t xml:space="preserve">Daftar Tugas</w:t>
       </w:r>
     </w:p>
     <w:tbl>
@@ -15068,7 +13321,7 @@
                 <w:szCs w:val="19"/>
                 <w:rFonts w:ascii="Calibri" w:cs="Calibri" w:eastAsia="Calibri" w:hAnsi="Calibri"/>
               </w:rPr>
-              <w:t xml:space="preserve">Target Generasi</w:t>
+              <w:t xml:space="preserve">Tanggung Jawab</w:t>
             </w:r>
           </w:p>
         </w:tc>
@@ -15092,7 +13345,7 @@
                 <w:szCs w:val="19"/>
                 <w:rFonts w:ascii="Calibri" w:cs="Calibri" w:eastAsia="Calibri" w:hAnsi="Calibri"/>
               </w:rPr>
-              <w:t xml:space="preserve">Berisi Dokumen</w:t>
+              <w:t xml:space="preserve">Konteks Laporan</w:t>
             </w:r>
           </w:p>
         </w:tc>
@@ -15184,7 +13437,7 @@
                 <w:szCs w:val="19"/>
                 <w:rFonts w:ascii="Calibri" w:cs="Calibri" w:eastAsia="Calibri" w:hAnsi="Calibri"/>
               </w:rPr>
-              <w:t xml:space="preserve">B2-2.1-01 s.d 03</w:t>
+              <w:t xml:space="preserve">Mapel Target</w:t>
             </w:r>
           </w:p>
         </w:tc>
@@ -15205,7 +13458,7 @@
                 <w:szCs w:val="19"/>
                 <w:rFonts w:ascii="Calibri" w:cs="Calibri" w:eastAsia="Calibri" w:hAnsi="Calibri"/>
               </w:rPr>
-              <w:t xml:space="preserve">Kesepakatan, Poster Aturan, Jurnal Kelas</w:t>
+              <w:t xml:space="preserve">PAI</w:t>
             </w:r>
           </w:p>
         </w:tc>
@@ -15247,109 +13500,7 @@
                 <w:szCs w:val="19"/>
                 <w:rFonts w:ascii="Calibri" w:cs="Calibri" w:eastAsia="Calibri" w:hAnsi="Calibri"/>
               </w:rPr>
-              <w:t xml:space="preserve">Disiplin Andragogi (Orang Dewasa) lewat Kontrak Belajar</w:t>
-            </w:r>
-          </w:p>
-        </w:tc>
-      </w:tr>
-      <w:tr>
-        <w:tc>
-          <w:tcPr>
-            <w:tcW w:type="pct" w:w="5%"/>
-            <w:vAlign w:val="center"/>
-          </w:tcPr>
-          <w:p>
-            <w:pPr>
-              <w:spacing w:before="30" w:after="30"/>
-            </w:pPr>
-            <w:r>
-              <w:rPr>
-                <w:color w:val="2C3E50"/>
-                <w:sz w:val="19"/>
-                <w:szCs w:val="19"/>
-                <w:rFonts w:ascii="Calibri" w:cs="Calibri" w:eastAsia="Calibri" w:hAnsi="Calibri"/>
-              </w:rPr>
-              <w:t xml:space="preserve">2</w:t>
-            </w:r>
-          </w:p>
-        </w:tc>
-        <w:tc>
-          <w:tcPr>
-            <w:tcW w:type="pct" w:w="20%"/>
-            <w:vAlign w:val="center"/>
-          </w:tcPr>
-          <w:p>
-            <w:pPr>
-              <w:spacing w:before="30" w:after="30"/>
-            </w:pPr>
-            <w:r>
-              <w:rPr>
-                <w:color w:val="2C3E50"/>
-                <w:sz w:val="19"/>
-                <w:szCs w:val="19"/>
-                <w:rFonts w:ascii="Calibri" w:cs="Calibri" w:eastAsia="Calibri" w:hAnsi="Calibri"/>
-              </w:rPr>
-              <w:t xml:space="preserve">B2-2.2-01 s.d 03</w:t>
-            </w:r>
-          </w:p>
-        </w:tc>
-        <w:tc>
-          <w:tcPr>
-            <w:tcW w:type="pct" w:w="25%"/>
-            <w:vAlign w:val="center"/>
-          </w:tcPr>
-          <w:p>
-            <w:pPr>
-              <w:spacing w:before="30" w:after="30"/>
-            </w:pPr>
-            <w:r>
-              <w:rPr>
-                <w:color w:val="2C3E50"/>
-                <w:sz w:val="19"/>
-                <w:szCs w:val="19"/>
-                <w:rFonts w:ascii="Calibri" w:cs="Calibri" w:eastAsia="Calibri" w:hAnsi="Calibri"/>
-              </w:rPr>
-              <w:t xml:space="preserve">Tata Tertib, Supervisi Kelas, Angket Aman</w:t>
-            </w:r>
-          </w:p>
-        </w:tc>
-        <w:tc>
-          <w:tcPr>
-            <w:tcW w:type="pct" w:w="10%"/>
-            <w:vAlign w:val="center"/>
-          </w:tcPr>
-          <w:p>
-            <w:pPr>
-              <w:spacing w:before="30" w:after="30"/>
-            </w:pPr>
-            <w:r>
-              <w:rPr>
-                <w:color w:val="2C3E50"/>
-                <w:sz w:val="19"/>
-                <w:szCs w:val="19"/>
-                <w:rFonts w:ascii="Calibri" w:cs="Calibri" w:eastAsia="Calibri" w:hAnsi="Calibri"/>
-              </w:rPr>
-              <w:t xml:space="preserve">TINGGI</w:t>
-            </w:r>
-          </w:p>
-        </w:tc>
-        <w:tc>
-          <w:tcPr>
-            <w:tcW w:type="pct" w:w="40%"/>
-            <w:vAlign w:val="center"/>
-          </w:tcPr>
-          <w:p>
-            <w:pPr>
-              <w:spacing w:before="30" w:after="30"/>
-            </w:pPr>
-            <w:r>
-              <w:rPr>
-                <w:color w:val="2C3E50"/>
-                <w:sz w:val="19"/>
-                <w:szCs w:val="19"/>
-                <w:rFonts w:ascii="Calibri" w:cs="Calibri" w:eastAsia="Calibri" w:hAnsi="Calibri"/>
-              </w:rPr>
-              <w:t xml:space="preserve">Regulasi profesional PKBM tingkat atas</w:t>
+              <w:t xml:space="preserve">Toleransi tingkat tinggi (RPP Agama Keimanan)</w:t>
             </w:r>
           </w:p>
         </w:tc>
@@ -15374,7 +13525,7 @@
           <w:szCs w:val="26"/>
           <w:rFonts w:ascii="Calibri" w:cs="Calibri" w:eastAsia="Calibri" w:hAnsi="Calibri"/>
         </w:rPr>
-        <w:t xml:space="preserve">  📦 PAKET C — ULFA</w:t>
+        <w:t xml:space="preserve">  📦 PAKET C — JUFRI</w:t>
       </w:r>
     </w:p>
     <w:p>
@@ -15414,7 +13565,7 @@
           <w:szCs w:val="22"/>
           <w:rFonts w:ascii="Calibri" w:cs="Calibri" w:eastAsia="Calibri" w:hAnsi="Calibri"/>
         </w:rPr>
-        <w:t xml:space="preserve">Daftar Dokumen (1 Indikator/Fokus)</w:t>
+        <w:t xml:space="preserve">Daftar Tugas</w:t>
       </w:r>
     </w:p>
     <w:tbl>
@@ -15485,7 +13636,7 @@
                 <w:szCs w:val="19"/>
                 <w:rFonts w:ascii="Calibri" w:cs="Calibri" w:eastAsia="Calibri" w:hAnsi="Calibri"/>
               </w:rPr>
-              <w:t xml:space="preserve">Target Generasi</w:t>
+              <w:t xml:space="preserve">Tanggung Jawab</w:t>
             </w:r>
           </w:p>
         </w:tc>
@@ -15509,7 +13660,7 @@
                 <w:szCs w:val="19"/>
                 <w:rFonts w:ascii="Calibri" w:cs="Calibri" w:eastAsia="Calibri" w:hAnsi="Calibri"/>
               </w:rPr>
-              <w:t xml:space="preserve">Berisi Dokumen</w:t>
+              <w:t xml:space="preserve">Konteks Laporan</w:t>
             </w:r>
           </w:p>
         </w:tc>
@@ -15601,7 +13752,7 @@
                 <w:szCs w:val="19"/>
                 <w:rFonts w:ascii="Calibri" w:cs="Calibri" w:eastAsia="Calibri" w:hAnsi="Calibri"/>
               </w:rPr>
-              <w:t xml:space="preserve">B2-2.3-01 s.d 03</w:t>
+              <w:t xml:space="preserve">Institusi</w:t>
             </w:r>
           </w:p>
         </w:tc>
@@ -15622,7 +13773,7 @@
                 <w:szCs w:val="19"/>
                 <w:rFonts w:ascii="Calibri" w:cs="Calibri" w:eastAsia="Calibri" w:hAnsi="Calibri"/>
               </w:rPr>
-              <w:t xml:space="preserve">RPP Belajar Aktif, LKPD, Dok Belajar</w:t>
+              <w:t xml:space="preserve">Dinamika Dewasa</w:t>
             </w:r>
           </w:p>
         </w:tc>
@@ -15664,7 +13815,7 @@
                 <w:szCs w:val="19"/>
                 <w:rFonts w:ascii="Calibri" w:cs="Calibri" w:eastAsia="Calibri" w:hAnsi="Calibri"/>
               </w:rPr>
-              <w:t xml:space="preserve">Cetak bukti belajar proyek nyata Paket C</w:t>
+              <w:t xml:space="preserve">Survei Kesiswaan &amp; Portofolio Mental Paket C</w:t>
             </w:r>
           </w:p>
         </w:tc>
@@ -15729,7 +13880,7 @@
           <w:szCs w:val="22"/>
           <w:rFonts w:ascii="Calibri" w:cs="Calibri" w:eastAsia="Calibri" w:hAnsi="Calibri"/>
         </w:rPr>
-        <w:t xml:space="preserve">Daftar Dokumen (1 Indikator/Fokus)</w:t>
+        <w:t xml:space="preserve">Daftar Tugas</w:t>
       </w:r>
     </w:p>
     <w:tbl>
@@ -15800,7 +13951,7 @@
                 <w:szCs w:val="19"/>
                 <w:rFonts w:ascii="Calibri" w:cs="Calibri" w:eastAsia="Calibri" w:hAnsi="Calibri"/>
               </w:rPr>
-              <w:t xml:space="preserve">Target Generasi</w:t>
+              <w:t xml:space="preserve">Tanggung Jawab</w:t>
             </w:r>
           </w:p>
         </w:tc>
@@ -15824,7 +13975,7 @@
                 <w:szCs w:val="19"/>
                 <w:rFonts w:ascii="Calibri" w:cs="Calibri" w:eastAsia="Calibri" w:hAnsi="Calibri"/>
               </w:rPr>
-              <w:t xml:space="preserve">Berisi Dokumen</w:t>
+              <w:t xml:space="preserve">Konteks Laporan</w:t>
             </w:r>
           </w:p>
         </w:tc>
@@ -15916,7 +14067,7 @@
                 <w:szCs w:val="19"/>
                 <w:rFonts w:ascii="Calibri" w:cs="Calibri" w:eastAsia="Calibri" w:hAnsi="Calibri"/>
               </w:rPr>
-              <w:t xml:space="preserve">B4-4.1-01 s.d 03</w:t>
+              <w:t xml:space="preserve">Institusi</w:t>
             </w:r>
           </w:p>
         </w:tc>
@@ -15937,7 +14088,7 @@
                 <w:szCs w:val="19"/>
                 <w:rFonts w:ascii="Calibri" w:cs="Calibri" w:eastAsia="Calibri" w:hAnsi="Calibri"/>
               </w:rPr>
-              <w:t xml:space="preserve">Jadwal Agama, RPP Iman, Jurnal Akhlak</w:t>
+              <w:t xml:space="preserve">Tata Tertib Tingkat Atas</w:t>
             </w:r>
           </w:p>
         </w:tc>
@@ -15979,7 +14130,7 @@
                 <w:szCs w:val="19"/>
                 <w:rFonts w:ascii="Calibri" w:cs="Calibri" w:eastAsia="Calibri" w:hAnsi="Calibri"/>
               </w:rPr>
-              <w:t xml:space="preserve">Integrasi kajian Islam dan Toleransi Dewasa</w:t>
+              <w:t xml:space="preserve">Disiplin Andragogi (Orang Dewasa) lewat Kontrak Belajar</w:t>
             </w:r>
           </w:p>
         </w:tc>
@@ -16044,7 +14195,7 @@
           <w:szCs w:val="22"/>
           <w:rFonts w:ascii="Calibri" w:cs="Calibri" w:eastAsia="Calibri" w:hAnsi="Calibri"/>
         </w:rPr>
-        <w:t xml:space="preserve">Daftar Dokumen (2 Indikator/Fokus)</w:t>
+        <w:t xml:space="preserve">Daftar Tugas</w:t>
       </w:r>
     </w:p>
     <w:tbl>
@@ -16115,7 +14266,7 @@
                 <w:szCs w:val="19"/>
                 <w:rFonts w:ascii="Calibri" w:cs="Calibri" w:eastAsia="Calibri" w:hAnsi="Calibri"/>
               </w:rPr>
-              <w:t xml:space="preserve">Target Generasi</w:t>
+              <w:t xml:space="preserve">Tanggung Jawab</w:t>
             </w:r>
           </w:p>
         </w:tc>
@@ -16139,7 +14290,7 @@
                 <w:szCs w:val="19"/>
                 <w:rFonts w:ascii="Calibri" w:cs="Calibri" w:eastAsia="Calibri" w:hAnsi="Calibri"/>
               </w:rPr>
-              <w:t xml:space="preserve">Berisi Dokumen</w:t>
+              <w:t xml:space="preserve">Konteks Laporan</w:t>
             </w:r>
           </w:p>
         </w:tc>
@@ -16231,7 +14382,7 @@
                 <w:szCs w:val="19"/>
                 <w:rFonts w:ascii="Calibri" w:cs="Calibri" w:eastAsia="Calibri" w:hAnsi="Calibri"/>
               </w:rPr>
-              <w:t xml:space="preserve">B4-4.2-01 s.d 03</w:t>
+              <w:t xml:space="preserve">Institusi</w:t>
             </w:r>
           </w:p>
         </w:tc>
@@ -16252,7 +14403,7 @@
                 <w:szCs w:val="19"/>
                 <w:rFonts w:ascii="Calibri" w:cs="Calibri" w:eastAsia="Calibri" w:hAnsi="Calibri"/>
               </w:rPr>
-              <w:t xml:space="preserve">RPP Budaya, Peringatan Hari Besar, Karya Budaya</w:t>
+              <w:t xml:space="preserve">Visi Misi &amp; Keagamaan</w:t>
             </w:r>
           </w:p>
         </w:tc>
@@ -16294,109 +14445,7 @@
                 <w:szCs w:val="19"/>
                 <w:rFonts w:ascii="Calibri" w:cs="Calibri" w:eastAsia="Calibri" w:hAnsi="Calibri"/>
               </w:rPr>
-              <w:t xml:space="preserve">Partisipasi Panggung Seni Pemuda PKBM</w:t>
-            </w:r>
-          </w:p>
-        </w:tc>
-      </w:tr>
-      <w:tr>
-        <w:tc>
-          <w:tcPr>
-            <w:tcW w:type="pct" w:w="5%"/>
-            <w:vAlign w:val="center"/>
-          </w:tcPr>
-          <w:p>
-            <w:pPr>
-              <w:spacing w:before="30" w:after="30"/>
-            </w:pPr>
-            <w:r>
-              <w:rPr>
-                <w:color w:val="2C3E50"/>
-                <w:sz w:val="19"/>
-                <w:szCs w:val="19"/>
-                <w:rFonts w:ascii="Calibri" w:cs="Calibri" w:eastAsia="Calibri" w:hAnsi="Calibri"/>
-              </w:rPr>
-              <w:t xml:space="preserve">2</w:t>
-            </w:r>
-          </w:p>
-        </w:tc>
-        <w:tc>
-          <w:tcPr>
-            <w:tcW w:type="pct" w:w="20%"/>
-            <w:vAlign w:val="center"/>
-          </w:tcPr>
-          <w:p>
-            <w:pPr>
-              <w:spacing w:before="30" w:after="30"/>
-            </w:pPr>
-            <w:r>
-              <w:rPr>
-                <w:color w:val="2C3E50"/>
-                <w:sz w:val="19"/>
-                <w:szCs w:val="19"/>
-                <w:rFonts w:ascii="Calibri" w:cs="Calibri" w:eastAsia="Calibri" w:hAnsi="Calibri"/>
-              </w:rPr>
-              <w:t xml:space="preserve">B4-4.3-01 s.d 03</w:t>
-            </w:r>
-          </w:p>
-        </w:tc>
-        <w:tc>
-          <w:tcPr>
-            <w:tcW w:type="pct" w:w="25%"/>
-            <w:vAlign w:val="center"/>
-          </w:tcPr>
-          <w:p>
-            <w:pPr>
-              <w:spacing w:before="30" w:after="30"/>
-            </w:pPr>
-            <w:r>
-              <w:rPr>
-                <w:color w:val="2C3E50"/>
-                <w:sz w:val="19"/>
-                <w:szCs w:val="19"/>
-                <w:rFonts w:ascii="Calibri" w:cs="Calibri" w:eastAsia="Calibri" w:hAnsi="Calibri"/>
-              </w:rPr>
-              <w:t xml:space="preserve">LKPD HOTS, Penilaian Kritis, Template Proyek</w:t>
-            </w:r>
-          </w:p>
-        </w:tc>
-        <w:tc>
-          <w:tcPr>
-            <w:tcW w:type="pct" w:w="10%"/>
-            <w:vAlign w:val="center"/>
-          </w:tcPr>
-          <w:p>
-            <w:pPr>
-              <w:spacing w:before="30" w:after="30"/>
-            </w:pPr>
-            <w:r>
-              <w:rPr>
-                <w:color w:val="2C3E50"/>
-                <w:sz w:val="19"/>
-                <w:szCs w:val="19"/>
-                <w:rFonts w:ascii="Calibri" w:cs="Calibri" w:eastAsia="Calibri" w:hAnsi="Calibri"/>
-              </w:rPr>
-              <w:t xml:space="preserve">TINGGI</w:t>
-            </w:r>
-          </w:p>
-        </w:tc>
-        <w:tc>
-          <w:tcPr>
-            <w:tcW w:type="pct" w:w="40%"/>
-            <w:vAlign w:val="center"/>
-          </w:tcPr>
-          <w:p>
-            <w:pPr>
-              <w:spacing w:before="30" w:after="30"/>
-            </w:pPr>
-            <w:r>
-              <w:rPr>
-                <w:color w:val="2C3E50"/>
-                <w:sz w:val="19"/>
-                <w:szCs w:val="19"/>
-                <w:rFonts w:ascii="Calibri" w:cs="Calibri" w:eastAsia="Calibri" w:hAnsi="Calibri"/>
-              </w:rPr>
-              <w:t xml:space="preserve">Rubrik Proposal Karya Siswa Paket C</w:t>
+              <w:t xml:space="preserve">Integrasi kajian Islam dan Visi resmi PKBM</w:t>
             </w:r>
           </w:p>
         </w:tc>
@@ -16461,7 +14510,7 @@
           <w:szCs w:val="22"/>
           <w:rFonts w:ascii="Calibri" w:cs="Calibri" w:eastAsia="Calibri" w:hAnsi="Calibri"/>
         </w:rPr>
-        <w:t xml:space="preserve">Daftar Dokumen (1 Indikator/Fokus)</w:t>
+        <w:t xml:space="preserve">Daftar Tugas</w:t>
       </w:r>
     </w:p>
     <w:tbl>
@@ -16532,7 +14581,7 @@
                 <w:szCs w:val="19"/>
                 <w:rFonts w:ascii="Calibri" w:cs="Calibri" w:eastAsia="Calibri" w:hAnsi="Calibri"/>
               </w:rPr>
-              <w:t xml:space="preserve">Target Generasi</w:t>
+              <w:t xml:space="preserve">Tanggung Jawab</w:t>
             </w:r>
           </w:p>
         </w:tc>
@@ -16556,7 +14605,7 @@
                 <w:szCs w:val="19"/>
                 <w:rFonts w:ascii="Calibri" w:cs="Calibri" w:eastAsia="Calibri" w:hAnsi="Calibri"/>
               </w:rPr>
-              <w:t xml:space="preserve">Berisi Dokumen</w:t>
+              <w:t xml:space="preserve">Konteks Laporan</w:t>
             </w:r>
           </w:p>
         </w:tc>
@@ -16648,7 +14697,7 @@
                 <w:szCs w:val="19"/>
                 <w:rFonts w:ascii="Calibri" w:cs="Calibri" w:eastAsia="Calibri" w:hAnsi="Calibri"/>
               </w:rPr>
-              <w:t xml:space="preserve">B4-4.4-01 s.d 04</w:t>
+              <w:t xml:space="preserve">Institusi</w:t>
             </w:r>
           </w:p>
         </w:tc>
@@ -16669,7 +14718,7 @@
                 <w:szCs w:val="19"/>
                 <w:rFonts w:ascii="Calibri" w:cs="Calibri" w:eastAsia="Calibri" w:hAnsi="Calibri"/>
               </w:rPr>
-              <w:t xml:space="preserve">Visi Misi, Ekskul, Projek Karakter, Portofolio</w:t>
+              <w:t xml:space="preserve">Prakarya, Vokasional &amp; P5</w:t>
             </w:r>
           </w:p>
         </w:tc>
@@ -16711,7 +14760,7 @@
                 <w:szCs w:val="19"/>
                 <w:rFonts w:ascii="Calibri" w:cs="Calibri" w:eastAsia="Calibri" w:hAnsi="Calibri"/>
               </w:rPr>
-              <w:t xml:space="preserve">Fokus Dokumentasi Produk Wirausaha Nyata Siap Kurikulum P5</w:t>
+              <w:t xml:space="preserve">Fokus Dokumentasi Produk Wirausaha Nyata Siap Kerja</w:t>
             </w:r>
           </w:p>
         </w:tc>

</xml_diff>

<commit_message>
docs: Tambahkan SOP dan Panduan Presentasi ke dalam master pembagian tugas
</commit_message>
<xml_diff>
--- a/Pembagian_Tugas_Tim1_Akreditasi_PKBM.docx
+++ b/Pembagian_Tugas_Tim1_Akreditasi_PKBM.docx
@@ -5045,6 +5045,485 @@
         </w:tc>
       </w:tr>
     </w:tbl>
+    <w:p>
+      <w:r>
+        <w:br w:type="page"/>
+      </w:r>
+    </w:p>
+    <w:p>
+      <w:pPr>
+        <w:shd w:fill="1B4F72" w:val="clear"/>
+        <w:spacing w:before="300" w:after="100"/>
+      </w:pPr>
+      <w:r>
+        <w:rPr>
+          <w:b/>
+          <w:bCs/>
+          <w:color w:val="FFFFFF"/>
+          <w:sz w:val="26"/>
+          <w:szCs w:val="26"/>
+          <w:rFonts w:ascii="Calibri" w:cs="Calibri" w:eastAsia="Calibri" w:hAnsi="Calibri"/>
+        </w:rPr>
+        <w:t xml:space="preserve">  🚀 SOP PENGGUNAAN SISTEM GENERATOR AKREDITASI</w:t>
+      </w:r>
+    </w:p>
+    <w:p>
+      <w:pPr>
+        <w:spacing w:after="80"/>
+        <w:jc w:val="both"/>
+      </w:pPr>
+      <w:r>
+        <w:rPr>
+          <w:b w:val="false"/>
+          <w:bCs w:val="false"/>
+          <w:i/>
+          <w:iCs/>
+          <w:color w:val="7F8C8D"/>
+          <w:sz w:val="21"/>
+          <w:szCs w:val="21"/>
+          <w:rFonts w:ascii="Calibri" w:cs="Calibri" w:eastAsia="Calibri" w:hAnsi="Calibri"/>
+        </w:rPr>
+        <w:t xml:space="preserve">Panduan ini wajib dibaca oleh seluruh anggota tim sebelum mengoperasikan sistem Vercel PKBM Miftahul Khoir. Sistem ini dirancang untuk memangkas waktu kerja dari berminggu-minggu menjadi hanya beberapa jam melalui bantuan Gemini AI.</w:t>
+      </w:r>
+    </w:p>
+    <w:p>
+      <w:pPr>
+        <w:spacing w:after="80"/>
+      </w:pPr>
+    </w:p>
+    <w:p>
+      <w:pPr>
+        <w:pBdr>
+          <w:bottom w:val="single" w:color="2E86C1" w:sz="2"/>
+        </w:pBdr>
+        <w:spacing w:before="200" w:after="80"/>
+      </w:pPr>
+      <w:r>
+        <w:rPr>
+          <w:b/>
+          <w:bCs/>
+          <w:color w:val="1B4F72"/>
+          <w:sz w:val="24"/>
+          <w:szCs w:val="24"/>
+          <w:rFonts w:ascii="Calibri" w:cs="Calibri" w:eastAsia="Calibri" w:hAnsi="Calibri"/>
+        </w:rPr>
+        <w:t xml:space="preserve">A. Alur Kerja Utama (Workflow)</w:t>
+      </w:r>
+    </w:p>
+    <w:p>
+      <w:pPr>
+        <w:spacing w:after="40"/>
+        <w:ind w:left="480" w:hanging="300"/>
+      </w:pPr>
+      <w:r>
+        <w:rPr>
+          <w:b/>
+          <w:bCs/>
+          <w:color w:val="2E86C1"/>
+          <w:sz w:val="21"/>
+          <w:szCs w:val="21"/>
+          <w:rFonts w:ascii="Calibri" w:cs="Calibri" w:eastAsia="Calibri" w:hAnsi="Calibri"/>
+        </w:rPr>
+        <w:t xml:space="preserve">1. </w:t>
+      </w:r>
+      <w:r>
+        <w:rPr>
+          <w:color w:val="2C3E50"/>
+          <w:sz w:val="21"/>
+          <w:szCs w:val="21"/>
+          <w:rFonts w:ascii="Calibri" w:cs="Calibri" w:eastAsia="Calibri" w:hAnsi="Calibri"/>
+        </w:rPr>
+        <w:t xml:space="preserve">BUKA APLIKASI: Akses tautan Vercel yang telah dibagikan oleh Ketua Tim di browser komputer Anda.</w:t>
+      </w:r>
+    </w:p>
+    <w:p>
+      <w:pPr>
+        <w:spacing w:after="40"/>
+        <w:ind w:left="480" w:hanging="300"/>
+      </w:pPr>
+      <w:r>
+        <w:rPr>
+          <w:b/>
+          <w:bCs/>
+          <w:color w:val="2E86C1"/>
+          <w:sz w:val="21"/>
+          <w:szCs w:val="21"/>
+          <w:rFonts w:ascii="Calibri" w:cs="Calibri" w:eastAsia="Calibri" w:hAnsi="Calibri"/>
+        </w:rPr>
+        <w:t xml:space="preserve">2. </w:t>
+      </w:r>
+      <w:r>
+        <w:rPr>
+          <w:color w:val="2C3E50"/>
+          <w:sz w:val="21"/>
+          <w:szCs w:val="21"/>
+          <w:rFonts w:ascii="Calibri" w:cs="Calibri" w:eastAsia="Calibri" w:hAnsi="Calibri"/>
+        </w:rPr>
+        <w:t xml:space="preserve">CEK PROFIL: Pastikan nama Kepala PKBM, NPSN, dan Alamat sudah terisi di tab 'Profil PKBM'. Modul Generator secara otomatis akan mengambil data dari sini.</w:t>
+      </w:r>
+    </w:p>
+    <w:p>
+      <w:pPr>
+        <w:spacing w:after="40"/>
+        <w:ind w:left="480" w:hanging="300"/>
+      </w:pPr>
+      <w:r>
+        <w:rPr>
+          <w:b/>
+          <w:bCs/>
+          <w:color w:val="2E86C1"/>
+          <w:sz w:val="21"/>
+          <w:szCs w:val="21"/>
+          <w:rFonts w:ascii="Calibri" w:cs="Calibri" w:eastAsia="Calibri" w:hAnsi="Calibri"/>
+        </w:rPr>
+        <w:t xml:space="preserve">3. </w:t>
+      </w:r>
+      <w:r>
+        <w:rPr>
+          <w:color w:val="2C3E50"/>
+          <w:sz w:val="21"/>
+          <w:szCs w:val="21"/>
+          <w:rFonts w:ascii="Calibri" w:cs="Calibri" w:eastAsia="Calibri" w:hAnsi="Calibri"/>
+        </w:rPr>
+        <w:t xml:space="preserve">PILIH PAKET: Di bagian navigasi atas, pastikan Anda berada di Paket yang sesuai dengan tugas Anda (Paket A, B, atau C).</w:t>
+      </w:r>
+    </w:p>
+    <w:p>
+      <w:pPr>
+        <w:spacing w:after="40"/>
+        <w:ind w:left="480" w:hanging="300"/>
+      </w:pPr>
+      <w:r>
+        <w:rPr>
+          <w:b/>
+          <w:bCs/>
+          <w:color w:val="2E86C1"/>
+          <w:sz w:val="21"/>
+          <w:szCs w:val="21"/>
+          <w:rFonts w:ascii="Calibri" w:cs="Calibri" w:eastAsia="Calibri" w:hAnsi="Calibri"/>
+        </w:rPr>
+        <w:t xml:space="preserve">4. </w:t>
+      </w:r>
+      <w:r>
+        <w:rPr>
+          <w:color w:val="2C3E50"/>
+          <w:sz w:val="21"/>
+          <w:szCs w:val="21"/>
+          <w:rFonts w:ascii="Calibri" w:cs="Calibri" w:eastAsia="Calibri" w:hAnsi="Calibri"/>
+        </w:rPr>
+        <w:t xml:space="preserve">TAB GENERATE MATA PELAJARAN (KHUSUS POKJA MAPEL): Jika Anda tergabung di Divisi Pokja Mapel (pembuat RPP, Soal, Rubrik), buka tab 'Generate Dokumen'. Pada bagian 'Target Generasi', CENTANG HANYA NAMA MAPEL ANDA (misal: Bahasa Indonesia). Nama Anda akan langsung terlihat di sana.</w:t>
+      </w:r>
+    </w:p>
+    <w:p>
+      <w:pPr>
+        <w:spacing w:after="40"/>
+        <w:ind w:left="480" w:hanging="300"/>
+      </w:pPr>
+      <w:r>
+        <w:rPr>
+          <w:b/>
+          <w:bCs/>
+          <w:color w:val="2E86C1"/>
+          <w:sz w:val="21"/>
+          <w:szCs w:val="21"/>
+          <w:rFonts w:ascii="Calibri" w:cs="Calibri" w:eastAsia="Calibri" w:hAnsi="Calibri"/>
+        </w:rPr>
+        <w:t xml:space="preserve">5. </w:t>
+      </w:r>
+      <w:r>
+        <w:rPr>
+          <w:color w:val="2C3E50"/>
+          <w:sz w:val="21"/>
+          <w:szCs w:val="21"/>
+          <w:rFonts w:ascii="Calibri" w:cs="Calibri" w:eastAsia="Calibri" w:hAnsi="Calibri"/>
+        </w:rPr>
+        <w:t xml:space="preserve">TAB GENERATE INSTITUSIONAL (KHUSUS POKJA MANAJEMEN): Jika Anda tergabung di Divisi Institusi, pastikan Anda mencentang Butir 1/2/4 yang menjadi tanggung jawab Anda, sesuai nama yang tertera di layar.</w:t>
+      </w:r>
+    </w:p>
+    <w:p>
+      <w:pPr>
+        <w:spacing w:after="40"/>
+        <w:ind w:left="480" w:hanging="300"/>
+      </w:pPr>
+      <w:r>
+        <w:rPr>
+          <w:b/>
+          <w:bCs/>
+          <w:color w:val="2E86C1"/>
+          <w:sz w:val="21"/>
+          <w:szCs w:val="21"/>
+          <w:rFonts w:ascii="Calibri" w:cs="Calibri" w:eastAsia="Calibri" w:hAnsi="Calibri"/>
+        </w:rPr>
+        <w:t xml:space="preserve">6. </w:t>
+      </w:r>
+      <w:r>
+        <w:rPr>
+          <w:color w:val="2C3E50"/>
+          <w:sz w:val="21"/>
+          <w:szCs w:val="21"/>
+          <w:rFonts w:ascii="Calibri" w:cs="Calibri" w:eastAsia="Calibri" w:hAnsi="Calibri"/>
+        </w:rPr>
+        <w:t xml:space="preserve">TUNGGU PROSES AI: Klik tombol 'Generate &amp; Download ZIP'. Biarkan tab tetap terbuka. AI Gemini sedang menyusun dokumen Anda sesuai model pembelajaran dan karakteristik siswa. ZIP akan terunduh otomatis.</w:t>
+      </w:r>
+    </w:p>
+    <w:p>
+      <w:pPr>
+        <w:spacing w:after="80"/>
+      </w:pPr>
+    </w:p>
+    <w:p>
+      <w:pPr>
+        <w:pBdr>
+          <w:bottom w:val="single" w:color="2E86C1" w:sz="2"/>
+        </w:pBdr>
+        <w:spacing w:before="200" w:after="80"/>
+      </w:pPr>
+      <w:r>
+        <w:rPr>
+          <w:b/>
+          <w:bCs/>
+          <w:color w:val="1B4F72"/>
+          <w:sz w:val="24"/>
+          <w:szCs w:val="24"/>
+          <w:rFonts w:ascii="Calibri" w:cs="Calibri" w:eastAsia="Calibri" w:hAnsi="Calibri"/>
+        </w:rPr>
+        <w:t xml:space="preserve">B. Panduan Merapikan Dokumen (Finishing)</w:t>
+      </w:r>
+    </w:p>
+    <w:p>
+      <w:pPr>
+        <w:spacing w:after="80"/>
+        <w:jc w:val="both"/>
+      </w:pPr>
+      <w:r>
+        <w:rPr>
+          <w:b/>
+          <w:bCs/>
+          <w:i w:val="false"/>
+          <w:iCs w:val="false"/>
+          <w:color w:val="2C3E50"/>
+          <w:sz w:val="21"/>
+          <w:szCs w:val="21"/>
+          <w:rFonts w:ascii="Calibri" w:cs="Calibri" w:eastAsia="Calibri" w:hAnsi="Calibri"/>
+        </w:rPr>
+        <w:t xml:space="preserve">Dokumen yang dihasilkan oleh sistem (format .docx) sudah memiliki Kop Surat yang rapi, tabel yang terformat, dan konten pedagogi standar BAN-PDM. Namun, Anda WAJIB melakukan finishing berikut:</w:t>
+      </w:r>
+    </w:p>
+    <w:p>
+      <w:pPr>
+        <w:spacing w:after="40"/>
+        <w:ind w:left="480" w:hanging="240"/>
+      </w:pPr>
+      <w:r>
+        <w:rPr>
+          <w:color w:val="2E86C1"/>
+          <w:sz w:val="21"/>
+          <w:szCs w:val="21"/>
+          <w:rFonts w:ascii="Calibri" w:cs="Calibri" w:eastAsia="Calibri" w:hAnsi="Calibri"/>
+        </w:rPr>
+        <w:t xml:space="preserve">•  </w:t>
+      </w:r>
+      <w:r>
+        <w:rPr>
+          <w:b w:val="false"/>
+          <w:bCs w:val="false"/>
+          <w:color w:val="2C3E50"/>
+          <w:sz w:val="21"/>
+          <w:szCs w:val="21"/>
+          <w:rFonts w:ascii="Calibri" w:cs="Calibri" w:eastAsia="Calibri" w:hAnsi="Calibri"/>
+        </w:rPr>
+        <w:t xml:space="preserve">Cek Format Kop Surat: Pastikan kop surat tercetak dengan rapi dan logo (jika ada) berada di tempat yang benar.</w:t>
+      </w:r>
+    </w:p>
+    <w:p>
+      <w:pPr>
+        <w:spacing w:after="40"/>
+        <w:ind w:left="480" w:hanging="240"/>
+      </w:pPr>
+      <w:r>
+        <w:rPr>
+          <w:color w:val="2E86C1"/>
+          <w:sz w:val="21"/>
+          <w:szCs w:val="21"/>
+          <w:rFonts w:ascii="Calibri" w:cs="Calibri" w:eastAsia="Calibri" w:hAnsi="Calibri"/>
+        </w:rPr>
+        <w:t xml:space="preserve">•  </w:t>
+      </w:r>
+      <w:r>
+        <w:rPr>
+          <w:b w:val="false"/>
+          <w:bCs w:val="false"/>
+          <w:color w:val="2C3E50"/>
+          <w:sz w:val="21"/>
+          <w:szCs w:val="21"/>
+          <w:rFonts w:ascii="Calibri" w:cs="Calibri" w:eastAsia="Calibri" w:hAnsi="Calibri"/>
+        </w:rPr>
+        <w:t xml:space="preserve">Baca Ulang (Proof-reading) Hasil AI: Sistem AI merancang RPP dan Soal evaluasi dengan teknik penalaran tinggi (HOTS). Anda wajib membaca ulang untuk memastikan gaya bahasanya sesuai dengan kenyataan di lapangan.</w:t>
+      </w:r>
+    </w:p>
+    <w:p>
+      <w:pPr>
+        <w:spacing w:after="40"/>
+        <w:ind w:left="480" w:hanging="240"/>
+      </w:pPr>
+      <w:r>
+        <w:rPr>
+          <w:color w:val="2E86C1"/>
+          <w:sz w:val="21"/>
+          <w:szCs w:val="21"/>
+          <w:rFonts w:ascii="Calibri" w:cs="Calibri" w:eastAsia="Calibri" w:hAnsi="Calibri"/>
+        </w:rPr>
+        <w:t xml:space="preserve">•  </w:t>
+      </w:r>
+      <w:r>
+        <w:rPr>
+          <w:b w:val="false"/>
+          <w:bCs w:val="false"/>
+          <w:color w:val="2C3E50"/>
+          <w:sz w:val="21"/>
+          <w:szCs w:val="21"/>
+          <w:rFonts w:ascii="Calibri" w:cs="Calibri" w:eastAsia="Calibri" w:hAnsi="Calibri"/>
+        </w:rPr>
+        <w:t xml:space="preserve">Hapus Teks Prediksi: Hilangkan tanda kurung [ ... ] atau garis bawah ___ yang mungkin sengaja ditinggalkan sistem untuk Anda isi secara spesifik (misalnya, nama industri lokal untuk kunjungan lapangan).</w:t>
+      </w:r>
+    </w:p>
+    <w:p>
+      <w:pPr>
+        <w:spacing w:after="40"/>
+        <w:ind w:left="480" w:hanging="240"/>
+      </w:pPr>
+      <w:r>
+        <w:rPr>
+          <w:color w:val="2E86C1"/>
+          <w:sz w:val="21"/>
+          <w:szCs w:val="21"/>
+          <w:rFonts w:ascii="Calibri" w:cs="Calibri" w:eastAsia="Calibri" w:hAnsi="Calibri"/>
+        </w:rPr>
+        <w:t xml:space="preserve">•  </w:t>
+      </w:r>
+      <w:r>
+        <w:rPr>
+          <w:b w:val="false"/>
+          <w:bCs w:val="false"/>
+          <w:color w:val="2C3E50"/>
+          <w:sz w:val="21"/>
+          <w:szCs w:val="21"/>
+          <w:rFonts w:ascii="Calibri" w:cs="Calibri" w:eastAsia="Calibri" w:hAnsi="Calibri"/>
+        </w:rPr>
+        <w:t xml:space="preserve">Pastikan Tanda Tangan: Scroll ke halaman paling akhir setiap dokumen. Pastikan nama lengkap Anda (sebagai Tutor Mapel / PIC) sudah tercetak di atas garis tanda tangan (Otomatis ditambahkan sistem).</w:t>
+      </w:r>
+    </w:p>
+    <w:p>
+      <w:pPr>
+        <w:spacing w:after="80"/>
+      </w:pPr>
+    </w:p>
+    <w:p>
+      <w:pPr>
+        <w:pBdr>
+          <w:bottom w:val="single" w:color="2E86C1" w:sz="2"/>
+        </w:pBdr>
+        <w:spacing w:before="200" w:after="80"/>
+      </w:pPr>
+      <w:r>
+        <w:rPr>
+          <w:b/>
+          <w:bCs/>
+          <w:color w:val="1B4F72"/>
+          <w:sz w:val="24"/>
+          <w:szCs w:val="24"/>
+          <w:rFonts w:ascii="Calibri" w:cs="Calibri" w:eastAsia="Calibri" w:hAnsi="Calibri"/>
+        </w:rPr>
+        <w:t xml:space="preserve">C. Ketercapaian Kerja (Target &amp; Checklist)</w:t>
+      </w:r>
+    </w:p>
+    <w:p>
+      <w:pPr>
+        <w:spacing w:after="40"/>
+        <w:ind w:left="480" w:hanging="240"/>
+      </w:pPr>
+      <w:r>
+        <w:rPr>
+          <w:color w:val="2E86C1"/>
+          <w:sz w:val="21"/>
+          <w:szCs w:val="21"/>
+          <w:rFonts w:ascii="Calibri" w:cs="Calibri" w:eastAsia="Calibri" w:hAnsi="Calibri"/>
+        </w:rPr>
+        <w:t xml:space="preserve">•  </w:t>
+      </w:r>
+      <w:r>
+        <w:rPr>
+          <w:b w:val="false"/>
+          <w:bCs w:val="false"/>
+          <w:color w:val="2C3E50"/>
+          <w:sz w:val="21"/>
+          <w:szCs w:val="21"/>
+          <w:rFonts w:ascii="Calibri" w:cs="Calibri" w:eastAsia="Calibri" w:hAnsi="Calibri"/>
+        </w:rPr>
+        <w:t xml:space="preserve">SINKRONISASI MATERI: Ingat, karena Anda mengeksekusi 1 Mapel secara utuh (Dari RPP hingga Rubrik Penilaian), maka seluruh indikator Soal yang Anda hasilkan harus 100% selaras dengan RPP-nya. File yang berbeda alur akan ditolak oleh sistem audit kami.</w:t>
+      </w:r>
+    </w:p>
+    <w:p>
+      <w:pPr>
+        <w:spacing w:after="40"/>
+        <w:ind w:left="480" w:hanging="240"/>
+      </w:pPr>
+      <w:r>
+        <w:rPr>
+          <w:color w:val="2E86C1"/>
+          <w:sz w:val="21"/>
+          <w:szCs w:val="21"/>
+          <w:rFonts w:ascii="Calibri" w:cs="Calibri" w:eastAsia="Calibri" w:hAnsi="Calibri"/>
+        </w:rPr>
+        <w:t xml:space="preserve">•  </w:t>
+      </w:r>
+      <w:r>
+        <w:rPr>
+          <w:b w:val="false"/>
+          <w:bCs w:val="false"/>
+          <w:color w:val="2C3E50"/>
+          <w:sz w:val="21"/>
+          <w:szCs w:val="21"/>
+          <w:rFonts w:ascii="Calibri" w:cs="Calibri" w:eastAsia="Calibri" w:hAnsi="Calibri"/>
+        </w:rPr>
+        <w:t xml:space="preserve">PENYERAHAN FINAL: Setelah dokumen dirapikan (di-bold jika perlukan, margin disesuaikan jika halamannya terpotong patah), satukan kembali ke dalam Folder Google Drive komunal pada tenggat waktu 29 April.</w:t>
+      </w:r>
+    </w:p>
+    <w:p>
+      <w:pPr>
+        <w:spacing w:after="120"/>
+      </w:pPr>
+    </w:p>
+    <w:p>
+      <w:pPr>
+        <w:pBdr>
+          <w:left w:val="single" w:color="F39C12" w:sz="12"/>
+        </w:pBdr>
+        <w:shd w:fill="FEF9E7" w:val="clear"/>
+        <w:spacing w:before="60" w:after="60"/>
+        <w:ind w:left="120"/>
+      </w:pPr>
+      <w:r>
+        <w:rPr>
+          <w:b/>
+          <w:bCs/>
+          <w:color w:val="F39C12"/>
+          <w:sz w:val="20"/>
+          <w:szCs w:val="20"/>
+          <w:rFonts w:ascii="Calibri" w:cs="Calibri" w:eastAsia="Calibri" w:hAnsi="Calibri"/>
+        </w:rPr>
+        <w:t xml:space="preserve">⚠ TIPS JAWABAN SAAT PRESENTASI KE ASESOR: </w:t>
+      </w:r>
+      <w:r>
+        <w:rPr>
+          <w:color w:val="2C3E50"/>
+          <w:sz w:val="20"/>
+          <w:szCs w:val="20"/>
+          <w:rFonts w:ascii="Calibri" w:cs="Calibri" w:eastAsia="Calibri" w:hAnsi="Calibri"/>
+        </w:rPr>
+        <w:t xml:space="preserve">Sistem ini menjamin Traceability (Keterlacakan). Saat Anda ditanya Asesor, 'Dari mana asal instrumen evaluasi ini?', Anda bisa langsung menujukkan Modul Ajar (RPP) Anda, karena seluruh dokomen ini adalah turunan yang berurutan. Hindari jawaban 'Kami buat karena mencari di Google/Guru lain', jawablah: 'Sistem RPP kami terintegrasi'.</w:t>
+      </w:r>
+    </w:p>
     <w:p>
       <w:r>
         <w:br w:type="page"/>

</xml_diff>